<commit_message>
Update final written report
</commit_message>
<xml_diff>
--- a/report/MMA3001_Laboratory_Availability_Report.docx
+++ b/report/MMA3001_Laboratory_Availability_Report.docx
@@ -4,136 +4,558 @@
   <w:body>
     <w:p>
       <w:pPr>
-        <w:pStyle w:val="Title"/>
         <w:jc w:val="center"/>
+        <w:rPr>
+          <w:rFonts w:eastAsiaTheme="majorEastAsia" w:cs="Times New Roman"/>
+          <w:b/>
+          <w:bCs/>
+          <w:spacing w:val="5"/>
+          <w:kern w:val="28"/>
+          <w:sz w:val="36"/>
+          <w:szCs w:val="36"/>
+          <w:lang w:val="en-AU"/>
+        </w:rPr>
+      </w:pPr>
+    </w:p>
+    <w:p>
+      <w:pPr>
+        <w:jc w:val="center"/>
+        <w:rPr>
+          <w:rFonts w:eastAsiaTheme="majorEastAsia" w:cs="Times New Roman"/>
+          <w:b/>
+          <w:bCs/>
+          <w:spacing w:val="5"/>
+          <w:kern w:val="28"/>
+          <w:sz w:val="36"/>
+          <w:szCs w:val="36"/>
+          <w:lang w:val="en-AU"/>
+        </w:rPr>
+      </w:pPr>
+    </w:p>
+    <w:p>
+      <w:pPr>
+        <w:jc w:val="center"/>
+        <w:rPr>
+          <w:rFonts w:eastAsiaTheme="majorEastAsia" w:cs="Times New Roman"/>
+          <w:b/>
+          <w:bCs/>
+          <w:spacing w:val="5"/>
+          <w:kern w:val="28"/>
+          <w:sz w:val="36"/>
+          <w:szCs w:val="36"/>
+          <w:lang w:val="en-AU"/>
+        </w:rPr>
       </w:pPr>
       <w:r>
+        <w:rPr>
+          <w:rFonts w:eastAsiaTheme="majorEastAsia" w:cs="Times New Roman"/>
+          <w:b/>
+          <w:bCs/>
+          <w:spacing w:val="5"/>
+          <w:kern w:val="28"/>
+          <w:sz w:val="36"/>
+          <w:szCs w:val="36"/>
+          <w:lang w:val="en-AU"/>
+        </w:rPr>
         <w:t>Smart Laboratory Availability Forecasting Project</w:t>
       </w:r>
     </w:p>
     <w:p>
       <w:pPr>
         <w:jc w:val="center"/>
+        <w:rPr>
+          <w:rFonts w:cs="Times New Roman"/>
+          <w:b/>
+          <w:bCs/>
+          <w:szCs w:val="24"/>
+        </w:rPr>
       </w:pPr>
       <w:r>
         <w:rPr>
+          <w:rFonts w:cs="Times New Roman"/>
           <w:b/>
-        </w:rPr>
-        <w:t>MMA3001 Numerical Methods and Machine Learning Project</w:t>
+          <w:bCs/>
+          <w:szCs w:val="24"/>
+        </w:rPr>
+        <w:t xml:space="preserve">MMA3001 Numerical Methods and Machine Learning </w:t>
       </w:r>
-    </w:p>
-    <w:p>
-      <w:pPr>
-        <w:jc w:val="center"/>
-      </w:pPr>
       <w:r>
         <w:rPr>
+          <w:rFonts w:cs="Times New Roman"/>
           <w:b/>
-        </w:rPr>
+          <w:bCs/>
+          <w:szCs w:val="24"/>
+        </w:rPr>
+        <w:br/>
         <w:t>Elvis Abraham Mathew (34978674)</w:t>
       </w:r>
     </w:p>
     <w:p>
       <w:pPr>
         <w:pStyle w:val="Heading1"/>
+        <w:rPr>
+          <w:rFonts w:ascii="Times New Roman" w:hAnsi="Times New Roman" w:cs="Times New Roman"/>
+          <w:color w:val="auto"/>
+        </w:rPr>
+      </w:pPr>
+    </w:p>
+    <w:p>
+      <w:pPr>
+        <w:pStyle w:val="Heading1"/>
+        <w:rPr>
+          <w:rFonts w:ascii="Times New Roman" w:hAnsi="Times New Roman" w:cs="Times New Roman"/>
+          <w:color w:val="auto"/>
+        </w:rPr>
+      </w:pPr>
+    </w:p>
+    <w:p>
+      <w:pPr>
+        <w:pStyle w:val="Heading1"/>
+        <w:rPr>
+          <w:rFonts w:ascii="Times New Roman" w:hAnsi="Times New Roman" w:cs="Times New Roman"/>
+          <w:color w:val="auto"/>
+        </w:rPr>
+      </w:pPr>
+    </w:p>
+    <w:p>
+      <w:pPr>
+        <w:pStyle w:val="Heading1"/>
+        <w:rPr>
+          <w:rFonts w:ascii="Times New Roman" w:hAnsi="Times New Roman" w:cs="Times New Roman"/>
+          <w:color w:val="auto"/>
+        </w:rPr>
+      </w:pPr>
+    </w:p>
+    <w:p>
+      <w:pPr>
+        <w:pStyle w:val="Heading1"/>
+        <w:rPr>
+          <w:rFonts w:ascii="Times New Roman" w:hAnsi="Times New Roman" w:cs="Times New Roman"/>
+          <w:color w:val="auto"/>
+        </w:rPr>
+      </w:pPr>
+    </w:p>
+    <w:p>
+      <w:pPr>
+        <w:pStyle w:val="Heading1"/>
+        <w:rPr>
+          <w:rFonts w:ascii="Times New Roman" w:hAnsi="Times New Roman" w:cs="Times New Roman"/>
+          <w:color w:val="auto"/>
+        </w:rPr>
       </w:pPr>
       <w:r>
+        <w:rPr>
+          <w:rFonts w:ascii="Times New Roman" w:hAnsi="Times New Roman" w:cs="Times New Roman"/>
+          <w:color w:val="auto"/>
+        </w:rPr>
+        <w:br/>
+      </w:r>
+      <w:r>
+        <w:rPr>
+          <w:rFonts w:ascii="Times New Roman" w:hAnsi="Times New Roman" w:cs="Times New Roman"/>
+          <w:color w:val="auto"/>
+        </w:rPr>
+        <w:br/>
+      </w:r>
+      <w:r>
+        <w:rPr>
+          <w:rFonts w:ascii="Times New Roman" w:hAnsi="Times New Roman" w:cs="Times New Roman"/>
+          <w:color w:val="auto"/>
+        </w:rPr>
+        <w:br/>
+      </w:r>
+      <w:r>
+        <w:rPr>
+          <w:rFonts w:ascii="Times New Roman" w:hAnsi="Times New Roman" w:cs="Times New Roman"/>
+          <w:color w:val="auto"/>
+        </w:rPr>
+        <w:br/>
+      </w:r>
+      <w:r>
+        <w:rPr>
+          <w:rFonts w:ascii="Times New Roman" w:hAnsi="Times New Roman" w:cs="Times New Roman"/>
+          <w:color w:val="auto"/>
+        </w:rPr>
+        <w:br/>
+      </w:r>
+      <w:r>
+        <w:rPr>
+          <w:rFonts w:ascii="Times New Roman" w:hAnsi="Times New Roman" w:cs="Times New Roman"/>
+          <w:color w:val="auto"/>
+        </w:rPr>
+        <w:br/>
+      </w:r>
+    </w:p>
+    <w:p>
+      <w:pPr>
+        <w:rPr>
+          <w:rFonts w:cs="Times New Roman"/>
+        </w:rPr>
+      </w:pPr>
+    </w:p>
+    <w:p>
+      <w:pPr>
+        <w:rPr>
+          <w:rFonts w:cs="Times New Roman"/>
+        </w:rPr>
+      </w:pPr>
+    </w:p>
+    <w:p>
+      <w:pPr>
+        <w:rPr>
+          <w:rFonts w:cs="Times New Roman"/>
+        </w:rPr>
+      </w:pPr>
+      <w:r>
+        <w:rPr>
+          <w:rFonts w:cs="Times New Roman"/>
+        </w:rPr>
+        <w:t xml:space="preserve">Abstract </w:t>
+      </w:r>
+      <w:r>
+        <w:rPr>
+          <w:rFonts w:cs="Times New Roman"/>
+        </w:rPr>
+        <w:br/>
+        <w:t>Engineering Problem and Scope</w:t>
+      </w:r>
+      <w:r>
+        <w:rPr>
+          <w:rFonts w:cs="Times New Roman"/>
+        </w:rPr>
+        <w:br/>
+        <w:t xml:space="preserve">Data audit and preparation </w:t>
+      </w:r>
+      <w:r>
+        <w:rPr>
+          <w:rFonts w:cs="Times New Roman"/>
+        </w:rPr>
+        <w:br/>
+        <w:t>Computational Method</w:t>
+      </w:r>
+      <w:r>
+        <w:rPr>
+          <w:rFonts w:cs="Times New Roman"/>
+        </w:rPr>
+        <w:br/>
+        <w:t>Validation and model selection</w:t>
+      </w:r>
+      <w:r>
+        <w:rPr>
+          <w:rFonts w:cs="Times New Roman"/>
+        </w:rPr>
+        <w:br/>
+        <w:t>Final results and Sensitivity</w:t>
+      </w:r>
+      <w:r>
+        <w:rPr>
+          <w:rFonts w:cs="Times New Roman"/>
+        </w:rPr>
+        <w:br/>
+        <w:t>Engineering interpretation and Limitations</w:t>
+      </w:r>
+      <w:r>
+        <w:rPr>
+          <w:rFonts w:cs="Times New Roman"/>
+        </w:rPr>
+        <w:br/>
+        <w:t>Reproducibility, ethics and AI usage</w:t>
+      </w:r>
+      <w:r>
+        <w:rPr>
+          <w:rFonts w:cs="Times New Roman"/>
+        </w:rPr>
+        <w:br/>
+      </w:r>
+      <w:r>
+        <w:rPr>
+          <w:rFonts w:cs="Times New Roman"/>
+        </w:rPr>
+        <w:lastRenderedPageBreak/>
+        <w:t>References</w:t>
+      </w:r>
+      <w:r>
+        <w:rPr>
+          <w:rFonts w:cs="Times New Roman"/>
+        </w:rPr>
+        <w:br/>
+        <w:t xml:space="preserve">Appendix </w:t>
+      </w:r>
+    </w:p>
+    <w:p>
+      <w:pPr>
+        <w:pStyle w:val="Heading1"/>
+        <w:rPr>
+          <w:rFonts w:ascii="Times New Roman" w:hAnsi="Times New Roman" w:cs="Times New Roman"/>
+          <w:color w:val="auto"/>
+        </w:rPr>
+      </w:pPr>
+      <w:r>
+        <w:rPr>
+          <w:rFonts w:ascii="Times New Roman" w:hAnsi="Times New Roman" w:cs="Times New Roman"/>
+          <w:color w:val="auto"/>
+        </w:rPr>
         <w:t>Abstract</w:t>
       </w:r>
     </w:p>
     <w:p>
+      <w:pPr>
+        <w:rPr>
+          <w:rFonts w:cs="Times New Roman"/>
+          <w:szCs w:val="21"/>
+        </w:rPr>
+      </w:pPr>
       <w:r>
+        <w:rPr>
+          <w:rFonts w:cs="Times New Roman"/>
+          <w:szCs w:val="21"/>
+        </w:rPr>
         <w:t>This project develops and evaluates a reproducible forecasting workflow for laboratory availability using time-stamped occupancy-sensor data from Building 60, room G.25 (Keenan Lab). The system forecasts sensor-derived headcount 30 minutes ahead and converts the forecast into an advisory availability signal. A laboratory is classified as available when the forecast headcount is less than or equal to 0.5 people.</w:t>
       </w:r>
     </w:p>
     <w:p>
+      <w:pPr>
+        <w:rPr>
+          <w:rFonts w:cs="Times New Roman"/>
+          <w:szCs w:val="21"/>
+        </w:rPr>
+      </w:pPr>
       <w:r>
+        <w:rPr>
+          <w:rFonts w:cs="Times New Roman"/>
+          <w:szCs w:val="21"/>
+        </w:rPr>
         <w:t>The supplied occupancy dataset contained 643,290 sensor observations between May and December 2024. After room selection, auditing, 15-minute aggregation, limited missing-value treatment, lag-feature construction, and chronological splitting, 19,838 eligible 30-minute forecasting observations were available. Persistence, weekday/time baseline, ridge regression, decision-tree regression, and support-vector regression models were compared.</w:t>
       </w:r>
     </w:p>
     <w:p>
+      <w:pPr>
+        <w:rPr>
+          <w:rFonts w:cs="Times New Roman"/>
+          <w:szCs w:val="21"/>
+        </w:rPr>
+      </w:pPr>
       <w:r>
-        <w:t>Ridge regression achieved the strongest validation mean absolute error (MAE) of 1.080 people and was selected before the final test. However, the persistence baseline achieved the best final-test MAE of 0.461 people, indicating that recent occupancy was more reliable than the trained models during the held-out period. The selected ridge model achieved 64.6% availability accuracy, 88.1% precision, 53.8% recall, and 66.8% F1-score. The system should therefore be treated as a cautious advisory tool rather than</w:t>
-      </w:r>
-      <w:r>
-        <w:t xml:space="preserve"> a booking system or confirmation that a laboratory is empty.</w:t>
+        <w:rPr>
+          <w:rFonts w:cs="Times New Roman"/>
+          <w:szCs w:val="21"/>
+        </w:rPr>
+        <w:t>Ridge regression achieved the strongest validation mean absolute error (MAE) of 1.080 people and was selected before the final test. However, the persistence baseline achieved the best final-test MAE of 0.461 people, indicating that recent occupancy was more reliable than the trained models during the held-out period. The selected ridge model achieved 64.6% availability accuracy, 88.1% precision, 53.8% recall, and 66.8% F1-score. The system should therefore be treated as a cautious advisory tool rather than a booking system or confirmation that a laboratory is empty.</w:t>
       </w:r>
     </w:p>
     <w:p>
+      <w:pPr>
+        <w:rPr>
+          <w:rFonts w:cs="Times New Roman"/>
+          <w:szCs w:val="21"/>
+        </w:rPr>
+      </w:pPr>
       <w:r>
+        <w:rPr>
+          <w:rFonts w:cs="Times New Roman"/>
+          <w:szCs w:val="21"/>
+        </w:rPr>
         <w:t>The project demonstrates data auditing, time-series feature engineering, regression modelling, chronological validation, sensitivity analysis, automated testing, version control, and interpretation of results in an engineering context.</w:t>
       </w:r>
     </w:p>
     <w:p>
       <w:pPr>
         <w:pStyle w:val="Heading1"/>
+        <w:rPr>
+          <w:rFonts w:ascii="Times New Roman" w:hAnsi="Times New Roman" w:cs="Times New Roman"/>
+          <w:color w:val="auto"/>
+        </w:rPr>
       </w:pPr>
       <w:r>
+        <w:rPr>
+          <w:rFonts w:ascii="Times New Roman" w:hAnsi="Times New Roman" w:cs="Times New Roman"/>
+          <w:color w:val="auto"/>
+        </w:rPr>
         <w:t>1. Engineering problem and scope</w:t>
       </w:r>
     </w:p>
     <w:p>
+      <w:pPr>
+        <w:rPr>
+          <w:rFonts w:cs="Times New Roman"/>
+          <w:szCs w:val="21"/>
+        </w:rPr>
+      </w:pPr>
       <w:r>
+        <w:rPr>
+          <w:rFonts w:cs="Times New Roman"/>
+          <w:szCs w:val="21"/>
+          <w:lang w:val="en-AU"/>
+        </w:rPr>
+        <w:t xml:space="preserve">Laboratory occupancy information is valuable for improving the utilisation of university facilities and supporting operational decision-making. Students frequently require access to laboratories for project work, </w:t>
+      </w:r>
+      <w:r>
+        <w:rPr>
+          <w:rFonts w:cs="Times New Roman"/>
+          <w:szCs w:val="21"/>
+        </w:rPr>
         <w:t>Laboratories require suitable planning of occupancy, equipment use, ventilation, and access. A practical question is whether recent occupancy-sensor measurements can provide an early indication of whether a laboratory is likely to be available shortly afterwards.</w:t>
       </w:r>
     </w:p>
     <w:p>
+      <w:pPr>
+        <w:rPr>
+          <w:rFonts w:cs="Times New Roman"/>
+          <w:szCs w:val="21"/>
+        </w:rPr>
+      </w:pPr>
       <w:r>
+        <w:rPr>
+          <w:rFonts w:cs="Times New Roman"/>
+          <w:szCs w:val="21"/>
+        </w:rPr>
         <w:t>This project investigates the following question: Can time-stamped occupancy-sensor data forecast the sensor-derived headcount in G.25 (Keenan Lab) 30 minutes ahead accurately enough to provide an advisory laboratory-availability signal?</w:t>
       </w:r>
     </w:p>
     <w:p>
+      <w:pPr>
+        <w:rPr>
+          <w:rFonts w:cs="Times New Roman"/>
+          <w:szCs w:val="21"/>
+        </w:rPr>
+      </w:pPr>
       <w:r>
+        <w:rPr>
+          <w:rFonts w:cs="Times New Roman"/>
+          <w:szCs w:val="21"/>
+        </w:rPr>
         <w:lastRenderedPageBreak/>
         <w:t>The primary output is a continuous forecast of future sensor-derived headcount. A secondary binary availability signal is derived when the predicted headcount is less than or equal to 0.5 people. The threshold was selected because regression models may produce fractional outputs. Operationally, a forecast of 0.5 people or below represents a room that is sensor-derived as effectively empty.</w:t>
       </w:r>
     </w:p>
     <w:p>
+      <w:pPr>
+        <w:rPr>
+          <w:rFonts w:cs="Times New Roman"/>
+          <w:szCs w:val="21"/>
+        </w:rPr>
+      </w:pPr>
       <w:r>
+        <w:rPr>
+          <w:rFonts w:cs="Times New Roman"/>
+          <w:szCs w:val="21"/>
+        </w:rPr>
         <w:t>The project aims to identify and audit occupancy-sensor data for G.25, create a regular time series, forecast future headcount using baseline and machine-learning models, select models using chronological validation, assess an unseen final test period, and test sensitivity to forecast horizon and availability threshold.</w:t>
       </w:r>
     </w:p>
     <w:p>
+      <w:pPr>
+        <w:rPr>
+          <w:rFonts w:cs="Times New Roman"/>
+          <w:szCs w:val="21"/>
+        </w:rPr>
+      </w:pPr>
       <w:r>
+        <w:rPr>
+          <w:rFonts w:cs="Times New Roman"/>
+          <w:szCs w:val="21"/>
+        </w:rPr>
         <w:t>The intended use is a cautious early indication of likely laboratory availability. In a broader engineering context, this forecast could become one input to laboratory readiness or demand-responsive ventilation planning. The project does not model HVAC control, thermal comfort, energy use, room bookings, access permissions, or confirmed human occupancy.</w:t>
       </w:r>
     </w:p>
     <w:p>
       <w:pPr>
         <w:pStyle w:val="Heading1"/>
+        <w:rPr>
+          <w:rFonts w:ascii="Times New Roman" w:hAnsi="Times New Roman" w:cs="Times New Roman"/>
+          <w:color w:val="auto"/>
+        </w:rPr>
       </w:pPr>
       <w:r>
+        <w:rPr>
+          <w:rFonts w:ascii="Times New Roman" w:hAnsi="Times New Roman" w:cs="Times New Roman"/>
+          <w:color w:val="auto"/>
+        </w:rPr>
         <w:t>2. Data audit and preparation</w:t>
       </w:r>
     </w:p>
     <w:p>
       <w:pPr>
         <w:pStyle w:val="Heading2"/>
+        <w:rPr>
+          <w:rFonts w:ascii="Times New Roman" w:hAnsi="Times New Roman" w:cs="Times New Roman"/>
+          <w:color w:val="auto"/>
+          <w:sz w:val="24"/>
+          <w:szCs w:val="24"/>
+        </w:rPr>
       </w:pPr>
       <w:r>
+        <w:rPr>
+          <w:rFonts w:ascii="Times New Roman" w:hAnsi="Times New Roman" w:cs="Times New Roman"/>
+          <w:color w:val="auto"/>
+          <w:sz w:val="24"/>
+          <w:szCs w:val="24"/>
+        </w:rPr>
         <w:t>2.1 Input data</w:t>
       </w:r>
     </w:p>
     <w:p>
+      <w:pPr>
+        <w:rPr>
+          <w:rFonts w:cs="Times New Roman"/>
+          <w:szCs w:val="21"/>
+        </w:rPr>
+      </w:pPr>
       <w:r>
+        <w:rPr>
+          <w:rFonts w:cs="Times New Roman"/>
+          <w:szCs w:val="21"/>
+        </w:rPr>
         <w:t>The supplied project data included time-stamped occupancy-sensor observations, environmental-sensor observations, sensor identifiers, room and building identifiers, measurement metadata, and a spreadsheet describing sensor locations.</w:t>
       </w:r>
     </w:p>
     <w:p>
+      <w:pPr>
+        <w:rPr>
+          <w:rFonts w:cs="Times New Roman"/>
+          <w:szCs w:val="21"/>
+        </w:rPr>
+      </w:pPr>
       <w:r>
+        <w:rPr>
+          <w:rFonts w:cs="Times New Roman"/>
+          <w:szCs w:val="21"/>
+        </w:rPr>
         <w:t>The main input used in the final analysis was the occupancy-sensor dataset. Each observation represented a sensor-derived estimate of occupancy at a particular time. The accompanying metadata were used to identify the sensor associated with G.25, Keenan Lab.</w:t>
       </w:r>
     </w:p>
     <w:p>
+      <w:pPr>
+        <w:rPr>
+          <w:rFonts w:cs="Times New Roman"/>
+          <w:szCs w:val="21"/>
+        </w:rPr>
+      </w:pPr>
       <w:r>
+        <w:rPr>
+          <w:rFonts w:cs="Times New Roman"/>
+          <w:szCs w:val="21"/>
+        </w:rPr>
         <w:t>The raw occupancy dataset contained 643,290 observations between May and December 2024. The reported sensor-derived headcount values ranged from 0 to 35 people. The data required auditing because observations were irregularly timed and included missing periods.</w:t>
       </w:r>
     </w:p>
     <w:p>
       <w:pPr>
         <w:pStyle w:val="Heading2"/>
+        <w:rPr>
+          <w:rFonts w:ascii="Times New Roman" w:hAnsi="Times New Roman" w:cs="Times New Roman"/>
+          <w:color w:val="auto"/>
+          <w:sz w:val="24"/>
+          <w:szCs w:val="24"/>
+        </w:rPr>
       </w:pPr>
       <w:r>
+        <w:rPr>
+          <w:rFonts w:ascii="Times New Roman" w:hAnsi="Times New Roman" w:cs="Times New Roman"/>
+          <w:color w:val="auto"/>
+          <w:sz w:val="24"/>
+          <w:szCs w:val="24"/>
+        </w:rPr>
         <w:t>2.2 Room and target definition</w:t>
       </w:r>
     </w:p>
@@ -144,8 +566,8 @@
         <w:tblLook w:val="04A0" w:firstRow="1" w:lastRow="0" w:firstColumn="1" w:lastColumn="0" w:noHBand="0" w:noVBand="1"/>
       </w:tblPr>
       <w:tblGrid>
-        <w:gridCol w:w="3024"/>
-        <w:gridCol w:w="6768"/>
+        <w:gridCol w:w="2784"/>
+        <w:gridCol w:w="3936"/>
       </w:tblGrid>
       <w:tr>
         <w:trPr>
@@ -153,7 +575,7 @@
         </w:trPr>
         <w:tc>
           <w:tcPr>
-            <w:tcW w:w="3024" w:type="dxa"/>
+            <w:tcW w:w="2784" w:type="dxa"/>
             <w:tcBorders>
               <w:top w:val="single" w:sz="6" w:space="0" w:color="000000"/>
               <w:left w:val="single" w:sz="6" w:space="0" w:color="000000"/>
@@ -165,11 +587,15 @@
           <w:p>
             <w:pPr>
               <w:spacing w:after="0" w:line="240" w:lineRule="auto"/>
+              <w:rPr>
+                <w:rFonts w:cs="Times New Roman"/>
+                <w:szCs w:val="21"/>
+              </w:rPr>
             </w:pPr>
             <w:r>
               <w:rPr>
-                <w:b/>
-                <w:sz w:val="18"/>
+                <w:rFonts w:cs="Times New Roman"/>
+                <w:szCs w:val="21"/>
               </w:rPr>
               <w:t>Item</w:t>
             </w:r>
@@ -177,7 +603,7 @@
         </w:tc>
         <w:tc>
           <w:tcPr>
-            <w:tcW w:w="6768" w:type="dxa"/>
+            <w:tcW w:w="3936" w:type="dxa"/>
             <w:tcBorders>
               <w:top w:val="single" w:sz="6" w:space="0" w:color="000000"/>
               <w:left w:val="single" w:sz="6" w:space="0" w:color="000000"/>
@@ -189,11 +615,15 @@
           <w:p>
             <w:pPr>
               <w:spacing w:after="0" w:line="240" w:lineRule="auto"/>
+              <w:rPr>
+                <w:rFonts w:cs="Times New Roman"/>
+                <w:szCs w:val="21"/>
+              </w:rPr>
             </w:pPr>
             <w:r>
               <w:rPr>
-                <w:b/>
-                <w:sz w:val="18"/>
+                <w:rFonts w:cs="Times New Roman"/>
+                <w:szCs w:val="21"/>
               </w:rPr>
               <w:t>Final project definition</w:t>
             </w:r>
@@ -206,7 +636,7 @@
         </w:trPr>
         <w:tc>
           <w:tcPr>
-            <w:tcW w:w="3024" w:type="dxa"/>
+            <w:tcW w:w="2784" w:type="dxa"/>
             <w:tcBorders>
               <w:top w:val="single" w:sz="6" w:space="0" w:color="000000"/>
               <w:left w:val="single" w:sz="6" w:space="0" w:color="000000"/>
@@ -218,10 +648,15 @@
           <w:p>
             <w:pPr>
               <w:spacing w:after="0" w:line="240" w:lineRule="auto"/>
+              <w:rPr>
+                <w:rFonts w:cs="Times New Roman"/>
+                <w:szCs w:val="21"/>
+              </w:rPr>
             </w:pPr>
             <w:r>
               <w:rPr>
-                <w:sz w:val="18"/>
+                <w:rFonts w:cs="Times New Roman"/>
+                <w:szCs w:val="21"/>
               </w:rPr>
               <w:t>Building</w:t>
             </w:r>
@@ -229,7 +664,7 @@
         </w:tc>
         <w:tc>
           <w:tcPr>
-            <w:tcW w:w="6768" w:type="dxa"/>
+            <w:tcW w:w="3936" w:type="dxa"/>
             <w:tcBorders>
               <w:top w:val="single" w:sz="6" w:space="0" w:color="000000"/>
               <w:left w:val="single" w:sz="6" w:space="0" w:color="000000"/>
@@ -241,10 +676,15 @@
           <w:p>
             <w:pPr>
               <w:spacing w:after="0" w:line="240" w:lineRule="auto"/>
+              <w:rPr>
+                <w:rFonts w:cs="Times New Roman"/>
+                <w:szCs w:val="21"/>
+              </w:rPr>
             </w:pPr>
             <w:r>
               <w:rPr>
-                <w:sz w:val="18"/>
+                <w:rFonts w:cs="Times New Roman"/>
+                <w:szCs w:val="21"/>
               </w:rPr>
               <w:t>Building 60</w:t>
             </w:r>
@@ -257,7 +697,7 @@
         </w:trPr>
         <w:tc>
           <w:tcPr>
-            <w:tcW w:w="3024" w:type="dxa"/>
+            <w:tcW w:w="2784" w:type="dxa"/>
             <w:tcBorders>
               <w:top w:val="single" w:sz="6" w:space="0" w:color="000000"/>
               <w:left w:val="single" w:sz="6" w:space="0" w:color="000000"/>
@@ -269,10 +709,15 @@
           <w:p>
             <w:pPr>
               <w:spacing w:after="0" w:line="240" w:lineRule="auto"/>
+              <w:rPr>
+                <w:rFonts w:cs="Times New Roman"/>
+                <w:szCs w:val="21"/>
+              </w:rPr>
             </w:pPr>
             <w:r>
               <w:rPr>
-                <w:sz w:val="18"/>
+                <w:rFonts w:cs="Times New Roman"/>
+                <w:szCs w:val="21"/>
               </w:rPr>
               <w:t>Room</w:t>
             </w:r>
@@ -280,7 +725,7 @@
         </w:tc>
         <w:tc>
           <w:tcPr>
-            <w:tcW w:w="6768" w:type="dxa"/>
+            <w:tcW w:w="3936" w:type="dxa"/>
             <w:tcBorders>
               <w:top w:val="single" w:sz="6" w:space="0" w:color="000000"/>
               <w:left w:val="single" w:sz="6" w:space="0" w:color="000000"/>
@@ -292,10 +737,15 @@
           <w:p>
             <w:pPr>
               <w:spacing w:after="0" w:line="240" w:lineRule="auto"/>
+              <w:rPr>
+                <w:rFonts w:cs="Times New Roman"/>
+                <w:szCs w:val="21"/>
+              </w:rPr>
             </w:pPr>
             <w:r>
               <w:rPr>
-                <w:sz w:val="18"/>
+                <w:rFonts w:cs="Times New Roman"/>
+                <w:szCs w:val="21"/>
               </w:rPr>
               <w:t>G.25</w:t>
             </w:r>
@@ -308,7 +758,7 @@
         </w:trPr>
         <w:tc>
           <w:tcPr>
-            <w:tcW w:w="3024" w:type="dxa"/>
+            <w:tcW w:w="2784" w:type="dxa"/>
             <w:tcBorders>
               <w:top w:val="single" w:sz="6" w:space="0" w:color="000000"/>
               <w:left w:val="single" w:sz="6" w:space="0" w:color="000000"/>
@@ -320,10 +770,15 @@
           <w:p>
             <w:pPr>
               <w:spacing w:after="0" w:line="240" w:lineRule="auto"/>
+              <w:rPr>
+                <w:rFonts w:cs="Times New Roman"/>
+                <w:szCs w:val="21"/>
+              </w:rPr>
             </w:pPr>
             <w:r>
               <w:rPr>
-                <w:sz w:val="18"/>
+                <w:rFonts w:cs="Times New Roman"/>
+                <w:szCs w:val="21"/>
               </w:rPr>
               <w:t>Room name</w:t>
             </w:r>
@@ -331,7 +786,7 @@
         </w:tc>
         <w:tc>
           <w:tcPr>
-            <w:tcW w:w="6768" w:type="dxa"/>
+            <w:tcW w:w="3936" w:type="dxa"/>
             <w:tcBorders>
               <w:top w:val="single" w:sz="6" w:space="0" w:color="000000"/>
               <w:left w:val="single" w:sz="6" w:space="0" w:color="000000"/>
@@ -343,10 +798,15 @@
           <w:p>
             <w:pPr>
               <w:spacing w:after="0" w:line="240" w:lineRule="auto"/>
+              <w:rPr>
+                <w:rFonts w:cs="Times New Roman"/>
+                <w:szCs w:val="21"/>
+              </w:rPr>
             </w:pPr>
             <w:r>
               <w:rPr>
-                <w:sz w:val="18"/>
+                <w:rFonts w:cs="Times New Roman"/>
+                <w:szCs w:val="21"/>
               </w:rPr>
               <w:t>Keenan Lab</w:t>
             </w:r>
@@ -359,7 +819,7 @@
         </w:trPr>
         <w:tc>
           <w:tcPr>
-            <w:tcW w:w="3024" w:type="dxa"/>
+            <w:tcW w:w="2784" w:type="dxa"/>
             <w:tcBorders>
               <w:top w:val="single" w:sz="6" w:space="0" w:color="000000"/>
               <w:left w:val="single" w:sz="6" w:space="0" w:color="000000"/>
@@ -371,10 +831,15 @@
           <w:p>
             <w:pPr>
               <w:spacing w:after="0" w:line="240" w:lineRule="auto"/>
+              <w:rPr>
+                <w:rFonts w:cs="Times New Roman"/>
+                <w:szCs w:val="21"/>
+              </w:rPr>
             </w:pPr>
             <w:r>
               <w:rPr>
-                <w:sz w:val="18"/>
+                <w:rFonts w:cs="Times New Roman"/>
+                <w:szCs w:val="21"/>
               </w:rPr>
               <w:t>Main data source</w:t>
             </w:r>
@@ -382,7 +847,7 @@
         </w:tc>
         <w:tc>
           <w:tcPr>
-            <w:tcW w:w="6768" w:type="dxa"/>
+            <w:tcW w:w="3936" w:type="dxa"/>
             <w:tcBorders>
               <w:top w:val="single" w:sz="6" w:space="0" w:color="000000"/>
               <w:left w:val="single" w:sz="6" w:space="0" w:color="000000"/>
@@ -394,10 +859,15 @@
           <w:p>
             <w:pPr>
               <w:spacing w:after="0" w:line="240" w:lineRule="auto"/>
+              <w:rPr>
+                <w:rFonts w:cs="Times New Roman"/>
+                <w:szCs w:val="21"/>
+              </w:rPr>
             </w:pPr>
             <w:r>
               <w:rPr>
-                <w:sz w:val="18"/>
+                <w:rFonts w:cs="Times New Roman"/>
+                <w:szCs w:val="21"/>
               </w:rPr>
               <w:t>Occupancy-sensor observations</w:t>
             </w:r>
@@ -410,7 +880,7 @@
         </w:trPr>
         <w:tc>
           <w:tcPr>
-            <w:tcW w:w="3024" w:type="dxa"/>
+            <w:tcW w:w="2784" w:type="dxa"/>
             <w:tcBorders>
               <w:top w:val="single" w:sz="6" w:space="0" w:color="000000"/>
               <w:left w:val="single" w:sz="6" w:space="0" w:color="000000"/>
@@ -422,10 +892,15 @@
           <w:p>
             <w:pPr>
               <w:spacing w:after="0" w:line="240" w:lineRule="auto"/>
+              <w:rPr>
+                <w:rFonts w:cs="Times New Roman"/>
+                <w:szCs w:val="21"/>
+              </w:rPr>
             </w:pPr>
             <w:r>
               <w:rPr>
-                <w:sz w:val="18"/>
+                <w:rFonts w:cs="Times New Roman"/>
+                <w:szCs w:val="21"/>
               </w:rPr>
               <w:t>Target</w:t>
             </w:r>
@@ -433,7 +908,7 @@
         </w:tc>
         <w:tc>
           <w:tcPr>
-            <w:tcW w:w="6768" w:type="dxa"/>
+            <w:tcW w:w="3936" w:type="dxa"/>
             <w:tcBorders>
               <w:top w:val="single" w:sz="6" w:space="0" w:color="000000"/>
               <w:left w:val="single" w:sz="6" w:space="0" w:color="000000"/>
@@ -445,10 +920,15 @@
           <w:p>
             <w:pPr>
               <w:spacing w:after="0" w:line="240" w:lineRule="auto"/>
+              <w:rPr>
+                <w:rFonts w:cs="Times New Roman"/>
+                <w:szCs w:val="21"/>
+              </w:rPr>
             </w:pPr>
             <w:r>
               <w:rPr>
-                <w:sz w:val="18"/>
+                <w:rFonts w:cs="Times New Roman"/>
+                <w:szCs w:val="21"/>
               </w:rPr>
               <w:t>Future sensor-derived headcount</w:t>
             </w:r>
@@ -461,7 +941,7 @@
         </w:trPr>
         <w:tc>
           <w:tcPr>
-            <w:tcW w:w="3024" w:type="dxa"/>
+            <w:tcW w:w="2784" w:type="dxa"/>
             <w:tcBorders>
               <w:top w:val="single" w:sz="6" w:space="0" w:color="000000"/>
               <w:left w:val="single" w:sz="6" w:space="0" w:color="000000"/>
@@ -473,10 +953,15 @@
           <w:p>
             <w:pPr>
               <w:spacing w:after="0" w:line="240" w:lineRule="auto"/>
+              <w:rPr>
+                <w:rFonts w:cs="Times New Roman"/>
+                <w:szCs w:val="21"/>
+              </w:rPr>
             </w:pPr>
             <w:r>
               <w:rPr>
-                <w:sz w:val="18"/>
+                <w:rFonts w:cs="Times New Roman"/>
+                <w:szCs w:val="21"/>
               </w:rPr>
               <w:t>Main horizon</w:t>
             </w:r>
@@ -484,7 +969,7 @@
         </w:tc>
         <w:tc>
           <w:tcPr>
-            <w:tcW w:w="6768" w:type="dxa"/>
+            <w:tcW w:w="3936" w:type="dxa"/>
             <w:tcBorders>
               <w:top w:val="single" w:sz="6" w:space="0" w:color="000000"/>
               <w:left w:val="single" w:sz="6" w:space="0" w:color="000000"/>
@@ -496,10 +981,15 @@
           <w:p>
             <w:pPr>
               <w:spacing w:after="0" w:line="240" w:lineRule="auto"/>
+              <w:rPr>
+                <w:rFonts w:cs="Times New Roman"/>
+                <w:szCs w:val="21"/>
+              </w:rPr>
             </w:pPr>
             <w:r>
               <w:rPr>
-                <w:sz w:val="18"/>
+                <w:rFonts w:cs="Times New Roman"/>
+                <w:szCs w:val="21"/>
               </w:rPr>
               <w:t>30 minutes</w:t>
             </w:r>
@@ -512,7 +1002,7 @@
         </w:trPr>
         <w:tc>
           <w:tcPr>
-            <w:tcW w:w="3024" w:type="dxa"/>
+            <w:tcW w:w="2784" w:type="dxa"/>
             <w:tcBorders>
               <w:top w:val="single" w:sz="6" w:space="0" w:color="000000"/>
               <w:left w:val="single" w:sz="6" w:space="0" w:color="000000"/>
@@ -524,10 +1014,15 @@
           <w:p>
             <w:pPr>
               <w:spacing w:after="0" w:line="240" w:lineRule="auto"/>
+              <w:rPr>
+                <w:rFonts w:cs="Times New Roman"/>
+                <w:szCs w:val="21"/>
+              </w:rPr>
             </w:pPr>
             <w:r>
               <w:rPr>
-                <w:sz w:val="18"/>
+                <w:rFonts w:cs="Times New Roman"/>
+                <w:szCs w:val="21"/>
               </w:rPr>
               <w:t>Availability threshold</w:t>
             </w:r>
@@ -535,7 +1030,7 @@
         </w:tc>
         <w:tc>
           <w:tcPr>
-            <w:tcW w:w="6768" w:type="dxa"/>
+            <w:tcW w:w="3936" w:type="dxa"/>
             <w:tcBorders>
               <w:top w:val="single" w:sz="6" w:space="0" w:color="000000"/>
               <w:left w:val="single" w:sz="6" w:space="0" w:color="000000"/>
@@ -547,10 +1042,15 @@
           <w:p>
             <w:pPr>
               <w:spacing w:after="0" w:line="240" w:lineRule="auto"/>
+              <w:rPr>
+                <w:rFonts w:cs="Times New Roman"/>
+                <w:szCs w:val="21"/>
+              </w:rPr>
             </w:pPr>
             <w:r>
               <w:rPr>
-                <w:sz w:val="18"/>
+                <w:rFonts w:cs="Times New Roman"/>
+                <w:szCs w:val="21"/>
               </w:rPr>
               <w:t>Forecast headcount less than or equal to 0.5</w:t>
             </w:r>
@@ -563,7 +1063,7 @@
         </w:trPr>
         <w:tc>
           <w:tcPr>
-            <w:tcW w:w="3024" w:type="dxa"/>
+            <w:tcW w:w="2784" w:type="dxa"/>
             <w:tcBorders>
               <w:top w:val="single" w:sz="6" w:space="0" w:color="000000"/>
               <w:left w:val="single" w:sz="6" w:space="0" w:color="000000"/>
@@ -575,10 +1075,15 @@
           <w:p>
             <w:pPr>
               <w:spacing w:after="0" w:line="240" w:lineRule="auto"/>
+              <w:rPr>
+                <w:rFonts w:cs="Times New Roman"/>
+                <w:szCs w:val="21"/>
+              </w:rPr>
             </w:pPr>
             <w:r>
               <w:rPr>
-                <w:sz w:val="18"/>
+                <w:rFonts w:cs="Times New Roman"/>
+                <w:szCs w:val="21"/>
               </w:rPr>
               <w:t>Intended output</w:t>
             </w:r>
@@ -586,7 +1091,7 @@
         </w:tc>
         <w:tc>
           <w:tcPr>
-            <w:tcW w:w="6768" w:type="dxa"/>
+            <w:tcW w:w="3936" w:type="dxa"/>
             <w:tcBorders>
               <w:top w:val="single" w:sz="6" w:space="0" w:color="000000"/>
               <w:left w:val="single" w:sz="6" w:space="0" w:color="000000"/>
@@ -598,10 +1103,15 @@
           <w:p>
             <w:pPr>
               <w:spacing w:after="0" w:line="240" w:lineRule="auto"/>
+              <w:rPr>
+                <w:rFonts w:cs="Times New Roman"/>
+                <w:szCs w:val="21"/>
+              </w:rPr>
             </w:pPr>
             <w:r>
               <w:rPr>
-                <w:sz w:val="18"/>
+                <w:rFonts w:cs="Times New Roman"/>
+                <w:szCs w:val="21"/>
               </w:rPr>
               <w:t>Advisory availability indication</w:t>
             </w:r>
@@ -612,37 +1122,94 @@
     <w:p>
       <w:pPr>
         <w:spacing w:after="20"/>
+        <w:rPr>
+          <w:rFonts w:cs="Times New Roman"/>
+          <w:szCs w:val="21"/>
+        </w:rPr>
       </w:pPr>
     </w:p>
     <w:p>
+      <w:pPr>
+        <w:rPr>
+          <w:rFonts w:cs="Times New Roman"/>
+          <w:szCs w:val="21"/>
+        </w:rPr>
+      </w:pPr>
       <w:r>
-        <w:lastRenderedPageBreak/>
+        <w:rPr>
+          <w:rFonts w:cs="Times New Roman"/>
+          <w:szCs w:val="21"/>
+        </w:rPr>
         <w:t>The target variable is not actual independently measured human occupancy. It is the future reading from the supplied occupancy sensor. This distinction affects interpretation throughout the project.</w:t>
       </w:r>
     </w:p>
     <w:p>
       <w:pPr>
         <w:pStyle w:val="Heading2"/>
+        <w:rPr>
+          <w:rFonts w:ascii="Times New Roman" w:hAnsi="Times New Roman" w:cs="Times New Roman"/>
+          <w:color w:val="auto"/>
+          <w:sz w:val="24"/>
+          <w:szCs w:val="24"/>
+        </w:rPr>
       </w:pPr>
       <w:r>
+        <w:rPr>
+          <w:rFonts w:ascii="Times New Roman" w:hAnsi="Times New Roman" w:cs="Times New Roman"/>
+          <w:color w:val="auto"/>
+          <w:sz w:val="24"/>
+          <w:szCs w:val="24"/>
+        </w:rPr>
         <w:t>2.3 Data preparation</w:t>
       </w:r>
     </w:p>
     <w:p>
+      <w:pPr>
+        <w:rPr>
+          <w:rFonts w:cs="Times New Roman"/>
+          <w:szCs w:val="21"/>
+        </w:rPr>
+      </w:pPr>
       <w:r>
+        <w:rPr>
+          <w:rFonts w:cs="Times New Roman"/>
+          <w:szCs w:val="21"/>
+        </w:rPr>
         <w:t>The original sensor data were not evenly spaced. To create a useful time series, observations were resampled into 15-minute intervals. A 30-minute forecast therefore corresponds to two intervals ahead; 15 minutes corresponds to one interval ahead and 60 minutes corresponds to four intervals ahead.</w:t>
       </w:r>
     </w:p>
     <w:p>
+      <w:pPr>
+        <w:rPr>
+          <w:rFonts w:cs="Times New Roman"/>
+          <w:szCs w:val="21"/>
+        </w:rPr>
+      </w:pPr>
       <w:r>
-        <w:t>The data audit found missing intervals and longer sensor outages. Short missing gaps were forward-filled only when the gap did not exceed 60 minutes. Longer gaps were not filled because it would be unreasonable to assume that headcount remained unchanged for many hours without evidence.</w:t>
+        <w:rPr>
+          <w:rFonts w:cs="Times New Roman"/>
+          <w:szCs w:val="21"/>
+        </w:rPr>
+        <w:t>The data audit found missing intervals and longer sensor outages. Short missing gaps were forward filled only when the gap did not exceed 60 minutes. Longer gaps were not filled because it would be unreasonable to assume that headcount remained unchanged for many hours without evidence.</w:t>
       </w:r>
     </w:p>
     <w:p>
       <w:pPr>
         <w:pStyle w:val="Heading2"/>
+        <w:rPr>
+          <w:rFonts w:ascii="Times New Roman" w:hAnsi="Times New Roman" w:cs="Times New Roman"/>
+          <w:color w:val="auto"/>
+          <w:sz w:val="24"/>
+          <w:szCs w:val="24"/>
+        </w:rPr>
       </w:pPr>
       <w:r>
+        <w:rPr>
+          <w:rFonts w:ascii="Times New Roman" w:hAnsi="Times New Roman" w:cs="Times New Roman"/>
+          <w:color w:val="auto"/>
+          <w:sz w:val="24"/>
+          <w:szCs w:val="24"/>
+        </w:rPr>
         <w:t>2.4 Data-audit results</w:t>
       </w:r>
     </w:p>
@@ -674,11 +1241,15 @@
           <w:p>
             <w:pPr>
               <w:spacing w:after="0" w:line="240" w:lineRule="auto"/>
+              <w:rPr>
+                <w:rFonts w:cs="Times New Roman"/>
+                <w:szCs w:val="21"/>
+              </w:rPr>
             </w:pPr>
             <w:r>
               <w:rPr>
-                <w:b/>
-                <w:sz w:val="18"/>
+                <w:rFonts w:cs="Times New Roman"/>
+                <w:szCs w:val="21"/>
               </w:rPr>
               <w:t>Data-audit measure</w:t>
             </w:r>
@@ -698,11 +1269,15 @@
           <w:p>
             <w:pPr>
               <w:spacing w:after="0" w:line="240" w:lineRule="auto"/>
+              <w:rPr>
+                <w:rFonts w:cs="Times New Roman"/>
+                <w:szCs w:val="21"/>
+              </w:rPr>
             </w:pPr>
             <w:r>
               <w:rPr>
-                <w:b/>
-                <w:sz w:val="18"/>
+                <w:rFonts w:cs="Times New Roman"/>
+                <w:szCs w:val="21"/>
               </w:rPr>
               <w:t>Result</w:t>
             </w:r>
@@ -727,10 +1302,15 @@
           <w:p>
             <w:pPr>
               <w:spacing w:after="0" w:line="240" w:lineRule="auto"/>
+              <w:rPr>
+                <w:rFonts w:cs="Times New Roman"/>
+                <w:szCs w:val="21"/>
+              </w:rPr>
             </w:pPr>
             <w:r>
               <w:rPr>
-                <w:sz w:val="18"/>
+                <w:rFonts w:cs="Times New Roman"/>
+                <w:szCs w:val="21"/>
               </w:rPr>
               <w:t>Raw occupancy observations</w:t>
             </w:r>
@@ -750,10 +1330,15 @@
           <w:p>
             <w:pPr>
               <w:spacing w:after="0" w:line="240" w:lineRule="auto"/>
+              <w:rPr>
+                <w:rFonts w:cs="Times New Roman"/>
+                <w:szCs w:val="21"/>
+              </w:rPr>
             </w:pPr>
             <w:r>
               <w:rPr>
-                <w:sz w:val="18"/>
+                <w:rFonts w:cs="Times New Roman"/>
+                <w:szCs w:val="21"/>
               </w:rPr>
               <w:t>643,290</w:t>
             </w:r>
@@ -778,10 +1363,15 @@
           <w:p>
             <w:pPr>
               <w:spacing w:after="0" w:line="240" w:lineRule="auto"/>
+              <w:rPr>
+                <w:rFonts w:cs="Times New Roman"/>
+                <w:szCs w:val="21"/>
+              </w:rPr>
             </w:pPr>
             <w:r>
               <w:rPr>
-                <w:sz w:val="18"/>
+                <w:rFonts w:cs="Times New Roman"/>
+                <w:szCs w:val="21"/>
               </w:rPr>
               <w:t>Source period</w:t>
             </w:r>
@@ -801,10 +1391,15 @@
           <w:p>
             <w:pPr>
               <w:spacing w:after="0" w:line="240" w:lineRule="auto"/>
+              <w:rPr>
+                <w:rFonts w:cs="Times New Roman"/>
+                <w:szCs w:val="21"/>
+              </w:rPr>
             </w:pPr>
             <w:r>
               <w:rPr>
-                <w:sz w:val="18"/>
+                <w:rFonts w:cs="Times New Roman"/>
+                <w:szCs w:val="21"/>
               </w:rPr>
               <w:t>May-December 2024</w:t>
             </w:r>
@@ -829,10 +1424,15 @@
           <w:p>
             <w:pPr>
               <w:spacing w:after="0" w:line="240" w:lineRule="auto"/>
+              <w:rPr>
+                <w:rFonts w:cs="Times New Roman"/>
+                <w:szCs w:val="21"/>
+              </w:rPr>
             </w:pPr>
             <w:r>
               <w:rPr>
-                <w:sz w:val="18"/>
+                <w:rFonts w:cs="Times New Roman"/>
+                <w:szCs w:val="21"/>
               </w:rPr>
               <w:t>Headcount range</w:t>
             </w:r>
@@ -852,10 +1452,15 @@
           <w:p>
             <w:pPr>
               <w:spacing w:after="0" w:line="240" w:lineRule="auto"/>
+              <w:rPr>
+                <w:rFonts w:cs="Times New Roman"/>
+                <w:szCs w:val="21"/>
+              </w:rPr>
             </w:pPr>
             <w:r>
               <w:rPr>
-                <w:sz w:val="18"/>
+                <w:rFonts w:cs="Times New Roman"/>
+                <w:szCs w:val="21"/>
               </w:rPr>
               <w:t>0 to 35 people</w:t>
             </w:r>
@@ -880,10 +1485,15 @@
           <w:p>
             <w:pPr>
               <w:spacing w:after="0" w:line="240" w:lineRule="auto"/>
+              <w:rPr>
+                <w:rFonts w:cs="Times New Roman"/>
+                <w:szCs w:val="21"/>
+              </w:rPr>
             </w:pPr>
             <w:r>
               <w:rPr>
-                <w:sz w:val="18"/>
+                <w:rFonts w:cs="Times New Roman"/>
+                <w:szCs w:val="21"/>
               </w:rPr>
               <w:t>Analysis interval</w:t>
             </w:r>
@@ -903,10 +1513,15 @@
           <w:p>
             <w:pPr>
               <w:spacing w:after="0" w:line="240" w:lineRule="auto"/>
+              <w:rPr>
+                <w:rFonts w:cs="Times New Roman"/>
+                <w:szCs w:val="21"/>
+              </w:rPr>
             </w:pPr>
             <w:r>
               <w:rPr>
-                <w:sz w:val="18"/>
+                <w:rFonts w:cs="Times New Roman"/>
+                <w:szCs w:val="21"/>
               </w:rPr>
               <w:t>15 minutes</w:t>
             </w:r>
@@ -931,10 +1546,15 @@
           <w:p>
             <w:pPr>
               <w:spacing w:after="0" w:line="240" w:lineRule="auto"/>
+              <w:rPr>
+                <w:rFonts w:cs="Times New Roman"/>
+                <w:szCs w:val="21"/>
+              </w:rPr>
             </w:pPr>
             <w:r>
               <w:rPr>
-                <w:sz w:val="18"/>
+                <w:rFonts w:cs="Times New Roman"/>
+                <w:szCs w:val="21"/>
               </w:rPr>
               <w:t>Total aggregated time bins</w:t>
             </w:r>
@@ -954,10 +1574,15 @@
           <w:p>
             <w:pPr>
               <w:spacing w:after="0" w:line="240" w:lineRule="auto"/>
+              <w:rPr>
+                <w:rFonts w:cs="Times New Roman"/>
+                <w:szCs w:val="21"/>
+              </w:rPr>
             </w:pPr>
             <w:r>
               <w:rPr>
-                <w:sz w:val="18"/>
+                <w:rFonts w:cs="Times New Roman"/>
+                <w:szCs w:val="21"/>
               </w:rPr>
               <w:t>23,516</w:t>
             </w:r>
@@ -982,10 +1607,15 @@
           <w:p>
             <w:pPr>
               <w:spacing w:after="0" w:line="240" w:lineRule="auto"/>
+              <w:rPr>
+                <w:rFonts w:cs="Times New Roman"/>
+                <w:szCs w:val="21"/>
+              </w:rPr>
             </w:pPr>
             <w:r>
               <w:rPr>
-                <w:sz w:val="18"/>
+                <w:rFonts w:cs="Times New Roman"/>
+                <w:szCs w:val="21"/>
               </w:rPr>
               <w:t>Eligible 30-minute forecast rows</w:t>
             </w:r>
@@ -1005,10 +1635,15 @@
           <w:p>
             <w:pPr>
               <w:spacing w:after="0" w:line="240" w:lineRule="auto"/>
+              <w:rPr>
+                <w:rFonts w:cs="Times New Roman"/>
+                <w:szCs w:val="21"/>
+              </w:rPr>
             </w:pPr>
             <w:r>
               <w:rPr>
-                <w:sz w:val="18"/>
+                <w:rFonts w:cs="Times New Roman"/>
+                <w:szCs w:val="21"/>
               </w:rPr>
               <w:t>19,838</w:t>
             </w:r>
@@ -1033,10 +1668,15 @@
           <w:p>
             <w:pPr>
               <w:spacing w:after="0" w:line="240" w:lineRule="auto"/>
+              <w:rPr>
+                <w:rFonts w:cs="Times New Roman"/>
+                <w:szCs w:val="21"/>
+              </w:rPr>
             </w:pPr>
             <w:r>
               <w:rPr>
-                <w:sz w:val="18"/>
+                <w:rFonts w:cs="Times New Roman"/>
+                <w:szCs w:val="21"/>
               </w:rPr>
               <w:t>Median original sampling interval</w:t>
             </w:r>
@@ -1056,10 +1696,15 @@
           <w:p>
             <w:pPr>
               <w:spacing w:after="0" w:line="240" w:lineRule="auto"/>
+              <w:rPr>
+                <w:rFonts w:cs="Times New Roman"/>
+                <w:szCs w:val="21"/>
+              </w:rPr>
             </w:pPr>
             <w:r>
               <w:rPr>
-                <w:sz w:val="18"/>
+                <w:rFonts w:cs="Times New Roman"/>
+                <w:szCs w:val="21"/>
               </w:rPr>
               <w:t>4 seconds</w:t>
             </w:r>
@@ -1084,10 +1729,15 @@
           <w:p>
             <w:pPr>
               <w:spacing w:after="0" w:line="240" w:lineRule="auto"/>
+              <w:rPr>
+                <w:rFonts w:cs="Times New Roman"/>
+                <w:szCs w:val="21"/>
+              </w:rPr>
             </w:pPr>
             <w:r>
               <w:rPr>
-                <w:sz w:val="18"/>
+                <w:rFonts w:cs="Times New Roman"/>
+                <w:szCs w:val="21"/>
               </w:rPr>
               <w:t>Missing 15-minute bins before filling</w:t>
             </w:r>
@@ -1107,10 +1757,15 @@
           <w:p>
             <w:pPr>
               <w:spacing w:after="0" w:line="240" w:lineRule="auto"/>
+              <w:rPr>
+                <w:rFonts w:cs="Times New Roman"/>
+                <w:szCs w:val="21"/>
+              </w:rPr>
             </w:pPr>
             <w:r>
               <w:rPr>
-                <w:sz w:val="18"/>
+                <w:rFonts w:cs="Times New Roman"/>
+                <w:szCs w:val="21"/>
               </w:rPr>
               <w:t>3,146</w:t>
             </w:r>
@@ -1135,10 +1790,15 @@
           <w:p>
             <w:pPr>
               <w:spacing w:after="0" w:line="240" w:lineRule="auto"/>
+              <w:rPr>
+                <w:rFonts w:cs="Times New Roman"/>
+                <w:szCs w:val="21"/>
+              </w:rPr>
             </w:pPr>
             <w:r>
               <w:rPr>
-                <w:sz w:val="18"/>
+                <w:rFonts w:cs="Times New Roman"/>
+                <w:szCs w:val="21"/>
               </w:rPr>
               <w:t>Forward-filled values</w:t>
             </w:r>
@@ -1158,10 +1818,15 @@
           <w:p>
             <w:pPr>
               <w:spacing w:after="0" w:line="240" w:lineRule="auto"/>
+              <w:rPr>
+                <w:rFonts w:cs="Times New Roman"/>
+                <w:szCs w:val="21"/>
+              </w:rPr>
             </w:pPr>
             <w:r>
               <w:rPr>
-                <w:sz w:val="18"/>
+                <w:rFonts w:cs="Times New Roman"/>
+                <w:szCs w:val="21"/>
               </w:rPr>
               <w:t>3,780</w:t>
             </w:r>
@@ -1186,10 +1851,15 @@
           <w:p>
             <w:pPr>
               <w:spacing w:after="0" w:line="240" w:lineRule="auto"/>
+              <w:rPr>
+                <w:rFonts w:cs="Times New Roman"/>
+                <w:szCs w:val="21"/>
+              </w:rPr>
             </w:pPr>
             <w:r>
               <w:rPr>
-                <w:sz w:val="18"/>
+                <w:rFonts w:cs="Times New Roman"/>
+                <w:szCs w:val="21"/>
               </w:rPr>
               <w:t>Maximum fill duration</w:t>
             </w:r>
@@ -1209,10 +1879,15 @@
           <w:p>
             <w:pPr>
               <w:spacing w:after="0" w:line="240" w:lineRule="auto"/>
+              <w:rPr>
+                <w:rFonts w:cs="Times New Roman"/>
+                <w:szCs w:val="21"/>
+              </w:rPr>
             </w:pPr>
             <w:r>
               <w:rPr>
-                <w:sz w:val="18"/>
+                <w:rFonts w:cs="Times New Roman"/>
+                <w:szCs w:val="21"/>
               </w:rPr>
               <w:t>60 minutes</w:t>
             </w:r>
@@ -1237,10 +1912,15 @@
           <w:p>
             <w:pPr>
               <w:spacing w:after="0" w:line="240" w:lineRule="auto"/>
+              <w:rPr>
+                <w:rFonts w:cs="Times New Roman"/>
+                <w:szCs w:val="21"/>
+              </w:rPr>
             </w:pPr>
             <w:r>
               <w:rPr>
-                <w:sz w:val="18"/>
+                <w:rFonts w:cs="Times New Roman"/>
+                <w:szCs w:val="21"/>
               </w:rPr>
               <w:t>Longest observed outage</w:t>
             </w:r>
@@ -1260,10 +1940,15 @@
           <w:p>
             <w:pPr>
               <w:spacing w:after="0" w:line="240" w:lineRule="auto"/>
+              <w:rPr>
+                <w:rFonts w:cs="Times New Roman"/>
+                <w:szCs w:val="21"/>
+              </w:rPr>
             </w:pPr>
             <w:r>
               <w:rPr>
-                <w:sz w:val="18"/>
+                <w:rFonts w:cs="Times New Roman"/>
+                <w:szCs w:val="21"/>
               </w:rPr>
               <w:t>77,778 seconds, or 21.6 hours</w:t>
             </w:r>
@@ -1274,84 +1959,211 @@
     <w:p>
       <w:pPr>
         <w:spacing w:after="20"/>
+        <w:rPr>
+          <w:rFonts w:cs="Times New Roman"/>
+          <w:szCs w:val="21"/>
+        </w:rPr>
       </w:pPr>
     </w:p>
     <w:p>
+      <w:pPr>
+        <w:rPr>
+          <w:rFonts w:cs="Times New Roman"/>
+          <w:szCs w:val="21"/>
+        </w:rPr>
+      </w:pPr>
       <w:r>
+        <w:rPr>
+          <w:rFonts w:cs="Times New Roman"/>
+          <w:szCs w:val="21"/>
+        </w:rPr>
         <w:t>The long outage shows why missing-data treatment is important. Filling all missing values blindly could make the room appear occupied or empty for an entire day without actual sensor evidence. The limited forward-fill rule reduces this risk.</w:t>
       </w:r>
     </w:p>
     <w:p>
       <w:pPr>
         <w:pStyle w:val="Heading2"/>
+        <w:rPr>
+          <w:rFonts w:ascii="Times New Roman" w:hAnsi="Times New Roman" w:cs="Times New Roman"/>
+          <w:color w:val="auto"/>
+          <w:sz w:val="24"/>
+          <w:szCs w:val="24"/>
+        </w:rPr>
       </w:pPr>
       <w:r>
+        <w:rPr>
+          <w:rFonts w:ascii="Times New Roman" w:hAnsi="Times New Roman" w:cs="Times New Roman"/>
+          <w:color w:val="auto"/>
+          <w:sz w:val="24"/>
+          <w:szCs w:val="24"/>
+        </w:rPr>
         <w:t>2.5 Output data</w:t>
       </w:r>
     </w:p>
     <w:p>
+      <w:pPr>
+        <w:rPr>
+          <w:rFonts w:cs="Times New Roman"/>
+          <w:szCs w:val="21"/>
+        </w:rPr>
+      </w:pPr>
       <w:r>
+        <w:rPr>
+          <w:rFonts w:cs="Times New Roman"/>
+          <w:szCs w:val="21"/>
+        </w:rPr>
         <w:t>The workflow produces future headcount forecasts, an availability indicator, validation and final-test metrics, plots, availability statistics, sensitivity-analysis results, source-code documentation, and automated-test evidence. These outputs are retained in the repository to support reproducibility.</w:t>
       </w:r>
     </w:p>
     <w:p>
       <w:pPr>
         <w:pStyle w:val="Heading1"/>
+        <w:rPr>
+          <w:rFonts w:ascii="Times New Roman" w:hAnsi="Times New Roman" w:cs="Times New Roman"/>
+          <w:color w:val="auto"/>
+        </w:rPr>
       </w:pPr>
       <w:r>
+        <w:rPr>
+          <w:rFonts w:ascii="Times New Roman" w:hAnsi="Times New Roman" w:cs="Times New Roman"/>
+          <w:color w:val="auto"/>
+        </w:rPr>
+        <w:lastRenderedPageBreak/>
         <w:t>3. Computational method</w:t>
       </w:r>
     </w:p>
     <w:p>
       <w:pPr>
         <w:pStyle w:val="Heading2"/>
+        <w:rPr>
+          <w:rFonts w:ascii="Times New Roman" w:hAnsi="Times New Roman" w:cs="Times New Roman"/>
+          <w:color w:val="auto"/>
+          <w:sz w:val="24"/>
+          <w:szCs w:val="24"/>
+        </w:rPr>
       </w:pPr>
       <w:r>
+        <w:rPr>
+          <w:rFonts w:ascii="Times New Roman" w:hAnsi="Times New Roman" w:cs="Times New Roman"/>
+          <w:color w:val="auto"/>
+          <w:sz w:val="24"/>
+          <w:szCs w:val="24"/>
+        </w:rPr>
         <w:t>3.1 Time-series forecasting approach</w:t>
       </w:r>
     </w:p>
     <w:p>
+      <w:pPr>
+        <w:rPr>
+          <w:rFonts w:cs="Times New Roman"/>
+          <w:szCs w:val="21"/>
+        </w:rPr>
+      </w:pPr>
       <w:r>
-        <w:t xml:space="preserve">The project treats occupancy forecasting as a supervised machine-learning regression problem. At each time point, the model receives information that would have been available at that time and </w:t>
-      </w:r>
-      <w:r>
-        <w:lastRenderedPageBreak/>
-        <w:t>predicts headcount at a later time. For the 30-minute case, the target is headcount measured 30 minutes after the feature time.</w:t>
+        <w:rPr>
+          <w:rFonts w:cs="Times New Roman"/>
+          <w:szCs w:val="21"/>
+        </w:rPr>
+        <w:t>The project treats occupancy forecasting as a supervised machine-learning regression problem. At each time point, the model receives information that would have been available at that time and predicts headcount at a later time. For the 30-minute case, the target is headcount measured 30 minutes after the feature time.</w:t>
       </w:r>
     </w:p>
     <w:p>
+      <w:pPr>
+        <w:rPr>
+          <w:rFonts w:cs="Times New Roman"/>
+          <w:szCs w:val="21"/>
+        </w:rPr>
+      </w:pPr>
       <w:r>
+        <w:rPr>
+          <w:rFonts w:cs="Times New Roman"/>
+          <w:szCs w:val="21"/>
+        </w:rPr>
         <w:t>The forecasting process uses historic observations rather than future information. This is essential because including future information would create data leakage and produce unrealistically good results.</w:t>
       </w:r>
     </w:p>
     <w:p>
       <w:pPr>
         <w:pStyle w:val="Heading2"/>
+        <w:rPr>
+          <w:rFonts w:ascii="Times New Roman" w:hAnsi="Times New Roman" w:cs="Times New Roman"/>
+          <w:color w:val="auto"/>
+          <w:sz w:val="24"/>
+          <w:szCs w:val="24"/>
+        </w:rPr>
       </w:pPr>
       <w:r>
+        <w:rPr>
+          <w:rFonts w:ascii="Times New Roman" w:hAnsi="Times New Roman" w:cs="Times New Roman"/>
+          <w:color w:val="auto"/>
+          <w:sz w:val="24"/>
+          <w:szCs w:val="24"/>
+        </w:rPr>
         <w:t>3.2 Feature engineering</w:t>
       </w:r>
     </w:p>
     <w:p>
+      <w:pPr>
+        <w:rPr>
+          <w:rFonts w:cs="Times New Roman"/>
+          <w:szCs w:val="21"/>
+        </w:rPr>
+      </w:pPr>
       <w:r>
+        <w:rPr>
+          <w:rFonts w:cs="Times New Roman"/>
+          <w:szCs w:val="21"/>
+        </w:rPr>
         <w:t>The final feature set included occupancy-history and calendar features. Occupancy-history features included current headcount, lagged headcount measurements, rolling mean headcount, and rolling standard deviation of headcount. Calendar features included hour of day, day of week, and a weekend indicator.</w:t>
       </w:r>
     </w:p>
     <w:p>
+      <w:pPr>
+        <w:rPr>
+          <w:rFonts w:cs="Times New Roman"/>
+          <w:szCs w:val="21"/>
+        </w:rPr>
+      </w:pPr>
       <w:r>
+        <w:rPr>
+          <w:rFonts w:cs="Times New Roman"/>
+          <w:szCs w:val="21"/>
+        </w:rPr>
         <w:t>Current and lagged values describe whether occupancy is stable, increasing, decreasing, or intermittent. Rolling statistics describe recent activity and variation. Calendar features allow the models to test whether occupancy differs between weekdays, weekends, mornings, afternoons, and evenings.</w:t>
       </w:r>
     </w:p>
     <w:p>
+      <w:pPr>
+        <w:rPr>
+          <w:rFonts w:cs="Times New Roman"/>
+          <w:szCs w:val="21"/>
+        </w:rPr>
+      </w:pPr>
       <w:r>
+        <w:rPr>
+          <w:rFonts w:cs="Times New Roman"/>
+          <w:szCs w:val="21"/>
+        </w:rPr>
         <w:t>Calendar features were calculated in the Australia/Melbourne time zone. Using UTC would shift the meaning of local working-hour and weekday patterns.</w:t>
       </w:r>
     </w:p>
     <w:p>
       <w:pPr>
         <w:pStyle w:val="Heading2"/>
+        <w:rPr>
+          <w:rFonts w:ascii="Times New Roman" w:hAnsi="Times New Roman" w:cs="Times New Roman"/>
+          <w:color w:val="auto"/>
+          <w:sz w:val="24"/>
+          <w:szCs w:val="24"/>
+        </w:rPr>
       </w:pPr>
       <w:r>
+        <w:rPr>
+          <w:rFonts w:ascii="Times New Roman" w:hAnsi="Times New Roman" w:cs="Times New Roman"/>
+          <w:color w:val="auto"/>
+          <w:sz w:val="24"/>
+          <w:szCs w:val="24"/>
+        </w:rPr>
         <w:t>3.3 Baseline and machine-learning models</w:t>
       </w:r>
     </w:p>
@@ -1383,11 +2195,15 @@
           <w:p>
             <w:pPr>
               <w:spacing w:after="0" w:line="240" w:lineRule="auto"/>
+              <w:rPr>
+                <w:rFonts w:cs="Times New Roman"/>
+                <w:szCs w:val="21"/>
+              </w:rPr>
             </w:pPr>
             <w:r>
               <w:rPr>
-                <w:b/>
-                <w:sz w:val="18"/>
+                <w:rFonts w:cs="Times New Roman"/>
+                <w:szCs w:val="21"/>
               </w:rPr>
               <w:t>Model</w:t>
             </w:r>
@@ -1407,11 +2223,15 @@
           <w:p>
             <w:pPr>
               <w:spacing w:after="0" w:line="240" w:lineRule="auto"/>
+              <w:rPr>
+                <w:rFonts w:cs="Times New Roman"/>
+                <w:szCs w:val="21"/>
+              </w:rPr>
             </w:pPr>
             <w:r>
               <w:rPr>
-                <w:b/>
-                <w:sz w:val="18"/>
+                <w:rFonts w:cs="Times New Roman"/>
+                <w:szCs w:val="21"/>
               </w:rPr>
               <w:t>Purpose</w:t>
             </w:r>
@@ -1436,10 +2256,15 @@
           <w:p>
             <w:pPr>
               <w:spacing w:after="0" w:line="240" w:lineRule="auto"/>
+              <w:rPr>
+                <w:rFonts w:cs="Times New Roman"/>
+                <w:szCs w:val="21"/>
+              </w:rPr>
             </w:pPr>
             <w:r>
               <w:rPr>
-                <w:sz w:val="18"/>
+                <w:rFonts w:cs="Times New Roman"/>
+                <w:szCs w:val="21"/>
               </w:rPr>
               <w:t>Persistence baseline</w:t>
             </w:r>
@@ -1459,10 +2284,15 @@
           <w:p>
             <w:pPr>
               <w:spacing w:after="0" w:line="240" w:lineRule="auto"/>
+              <w:rPr>
+                <w:rFonts w:cs="Times New Roman"/>
+                <w:szCs w:val="21"/>
+              </w:rPr>
             </w:pPr>
             <w:r>
               <w:rPr>
-                <w:sz w:val="18"/>
+                <w:rFonts w:cs="Times New Roman"/>
+                <w:szCs w:val="21"/>
               </w:rPr>
               <w:t>Future headcount is predicted as the current headcount.</w:t>
             </w:r>
@@ -1487,10 +2317,15 @@
           <w:p>
             <w:pPr>
               <w:spacing w:after="0" w:line="240" w:lineRule="auto"/>
+              <w:rPr>
+                <w:rFonts w:cs="Times New Roman"/>
+                <w:szCs w:val="21"/>
+              </w:rPr>
             </w:pPr>
             <w:r>
               <w:rPr>
-                <w:sz w:val="18"/>
+                <w:rFonts w:cs="Times New Roman"/>
+                <w:szCs w:val="21"/>
               </w:rPr>
               <w:t>Weekday/time baseline</w:t>
             </w:r>
@@ -1510,12 +2345,17 @@
           <w:p>
             <w:pPr>
               <w:spacing w:after="0" w:line="240" w:lineRule="auto"/>
+              <w:rPr>
+                <w:rFonts w:cs="Times New Roman"/>
+                <w:szCs w:val="21"/>
+              </w:rPr>
             </w:pPr>
             <w:r>
               <w:rPr>
-                <w:sz w:val="18"/>
-              </w:rPr>
-              <w:t>Uses typical occupancy for comparable weekday and time periods.</w:t>
+                <w:rFonts w:cs="Times New Roman"/>
+                <w:szCs w:val="21"/>
+              </w:rPr>
+              <w:t>Use typical occupancy for comparable weekday and time periods.</w:t>
             </w:r>
           </w:p>
         </w:tc>
@@ -1538,10 +2378,15 @@
           <w:p>
             <w:pPr>
               <w:spacing w:after="0" w:line="240" w:lineRule="auto"/>
+              <w:rPr>
+                <w:rFonts w:cs="Times New Roman"/>
+                <w:szCs w:val="21"/>
+              </w:rPr>
             </w:pPr>
             <w:r>
               <w:rPr>
-                <w:sz w:val="18"/>
+                <w:rFonts w:cs="Times New Roman"/>
+                <w:szCs w:val="21"/>
               </w:rPr>
               <w:t>Ridge regression</w:t>
             </w:r>
@@ -1561,12 +2406,17 @@
           <w:p>
             <w:pPr>
               <w:spacing w:after="0" w:line="240" w:lineRule="auto"/>
+              <w:rPr>
+                <w:rFonts w:cs="Times New Roman"/>
+                <w:szCs w:val="21"/>
+              </w:rPr>
             </w:pPr>
             <w:r>
               <w:rPr>
-                <w:sz w:val="18"/>
-              </w:rPr>
-              <w:t>Regularised linear regression using the engineered features.</w:t>
+                <w:rFonts w:cs="Times New Roman"/>
+                <w:szCs w:val="21"/>
+              </w:rPr>
+              <w:t>Regularised linear regression using engineered features.</w:t>
             </w:r>
           </w:p>
         </w:tc>
@@ -1589,10 +2439,15 @@
           <w:p>
             <w:pPr>
               <w:spacing w:after="0" w:line="240" w:lineRule="auto"/>
+              <w:rPr>
+                <w:rFonts w:cs="Times New Roman"/>
+                <w:szCs w:val="21"/>
+              </w:rPr>
             </w:pPr>
             <w:r>
               <w:rPr>
-                <w:sz w:val="18"/>
+                <w:rFonts w:cs="Times New Roman"/>
+                <w:szCs w:val="21"/>
               </w:rPr>
               <w:t>Decision-tree regression</w:t>
             </w:r>
@@ -1612,10 +2467,15 @@
           <w:p>
             <w:pPr>
               <w:spacing w:after="0" w:line="240" w:lineRule="auto"/>
+              <w:rPr>
+                <w:rFonts w:cs="Times New Roman"/>
+                <w:szCs w:val="21"/>
+              </w:rPr>
             </w:pPr>
             <w:r>
               <w:rPr>
-                <w:sz w:val="18"/>
+                <w:rFonts w:cs="Times New Roman"/>
+                <w:szCs w:val="21"/>
               </w:rPr>
               <w:t>Non-linear regression comparison.</w:t>
             </w:r>
@@ -1640,10 +2500,15 @@
           <w:p>
             <w:pPr>
               <w:spacing w:after="0" w:line="240" w:lineRule="auto"/>
+              <w:rPr>
+                <w:rFonts w:cs="Times New Roman"/>
+                <w:szCs w:val="21"/>
+              </w:rPr>
             </w:pPr>
             <w:r>
               <w:rPr>
-                <w:sz w:val="18"/>
+                <w:rFonts w:cs="Times New Roman"/>
+                <w:szCs w:val="21"/>
               </w:rPr>
               <w:t>Support-vector regression</w:t>
             </w:r>
@@ -1663,10 +2528,15 @@
           <w:p>
             <w:pPr>
               <w:spacing w:after="0" w:line="240" w:lineRule="auto"/>
+              <w:rPr>
+                <w:rFonts w:cs="Times New Roman"/>
+                <w:szCs w:val="21"/>
+              </w:rPr>
             </w:pPr>
             <w:r>
               <w:rPr>
-                <w:sz w:val="18"/>
+                <w:rFonts w:cs="Times New Roman"/>
+                <w:szCs w:val="21"/>
               </w:rPr>
               <w:t>Non-linear regression comparison.</w:t>
             </w:r>
@@ -1677,76 +2547,199 @@
     <w:p>
       <w:pPr>
         <w:spacing w:after="20"/>
+        <w:rPr>
+          <w:rFonts w:cs="Times New Roman"/>
+          <w:szCs w:val="21"/>
+        </w:rPr>
       </w:pPr>
     </w:p>
     <w:p>
+      <w:pPr>
+        <w:rPr>
+          <w:rFonts w:cs="Times New Roman"/>
+          <w:szCs w:val="21"/>
+        </w:rPr>
+      </w:pPr>
       <w:r>
+        <w:rPr>
+          <w:rFonts w:cs="Times New Roman"/>
+          <w:szCs w:val="21"/>
+        </w:rPr>
         <w:t>Persistence is simple but meaningful. For short horizons, occupancy may not change substantially, especially when people remain in a room for consecutive intervals. A complex model should only be considered useful if it improves on this baseline.</w:t>
       </w:r>
     </w:p>
     <w:p>
+      <w:pPr>
+        <w:rPr>
+          <w:rFonts w:cs="Times New Roman"/>
+          <w:szCs w:val="21"/>
+        </w:rPr>
+      </w:pPr>
+    </w:p>
+    <w:p>
+      <w:pPr>
+        <w:rPr>
+          <w:rFonts w:cs="Times New Roman"/>
+          <w:szCs w:val="21"/>
+        </w:rPr>
+      </w:pPr>
       <w:r>
+        <w:rPr>
+          <w:rFonts w:cs="Times New Roman"/>
+          <w:szCs w:val="21"/>
+        </w:rPr>
+        <w:lastRenderedPageBreak/>
         <w:t>Ridge regression can use multiple correlated predictors while limiting extreme coefficients. Decision-tree regression can represent non-linear threshold relationships. Support-vector regression can represent more complex feature relationships, although it is more computationally demanding than persistence or ridge regression.</w:t>
       </w:r>
     </w:p>
     <w:p>
       <w:pPr>
         <w:pStyle w:val="Heading2"/>
+        <w:rPr>
+          <w:rFonts w:ascii="Times New Roman" w:hAnsi="Times New Roman" w:cs="Times New Roman"/>
+          <w:color w:val="auto"/>
+          <w:sz w:val="24"/>
+          <w:szCs w:val="24"/>
+        </w:rPr>
       </w:pPr>
       <w:r>
+        <w:rPr>
+          <w:rFonts w:ascii="Times New Roman" w:hAnsi="Times New Roman" w:cs="Times New Roman"/>
+          <w:color w:val="auto"/>
+          <w:sz w:val="24"/>
+          <w:szCs w:val="24"/>
+        </w:rPr>
         <w:t>3.4 Model selection and performance metrics</w:t>
       </w:r>
     </w:p>
     <w:p>
+      <w:pPr>
+        <w:rPr>
+          <w:rFonts w:cs="Times New Roman"/>
+          <w:szCs w:val="21"/>
+        </w:rPr>
+      </w:pPr>
       <w:r>
-        <w:t xml:space="preserve">The data were split chronologically into training, validation, and final-test periods. Models were trained using earlier observations, compared on the validation period, and evaluated once on a final </w:t>
-      </w:r>
-      <w:r>
-        <w:lastRenderedPageBreak/>
-        <w:t>unseen test period. Random train-test splitting was avoided because it would allow future patterns to influence training.</w:t>
+        <w:rPr>
+          <w:rFonts w:cs="Times New Roman"/>
+          <w:szCs w:val="21"/>
+        </w:rPr>
+        <w:t>The data were split chronologically into training, validation, and final-test periods. Models were trained using earlier observations, compared on the validation period, and evaluated once on a final unseen test period. Random train-test splitting was avoided because it would allow future patterns to influence training.</w:t>
       </w:r>
     </w:p>
     <w:p>
+      <w:pPr>
+        <w:rPr>
+          <w:rFonts w:cs="Times New Roman"/>
+          <w:szCs w:val="21"/>
+        </w:rPr>
+      </w:pPr>
       <w:r>
+        <w:rPr>
+          <w:rFonts w:cs="Times New Roman"/>
+          <w:szCs w:val="21"/>
+        </w:rPr>
         <w:t>The main metric was mean absolute error, calculated as the average absolute difference between observed and predicted headcount. MAE was selected because it is measured in people. Root mean squared error was also considered because it places greater weight on larger errors, while bias identifies systematic over-prediction or under-prediction.</w:t>
       </w:r>
     </w:p>
     <w:p>
+      <w:pPr>
+        <w:rPr>
+          <w:rFonts w:cs="Times New Roman"/>
+          <w:szCs w:val="21"/>
+        </w:rPr>
+      </w:pPr>
       <w:r>
+        <w:rPr>
+          <w:rFonts w:cs="Times New Roman"/>
+          <w:szCs w:val="21"/>
+        </w:rPr>
         <w:t>For availability classification, accuracy, precision, recall, and F1-score were calculated. A false available result means that the model forecast the room as available while the actual future sensor-derived headcount was greater than 0.5.</w:t>
       </w:r>
     </w:p>
     <w:p>
       <w:pPr>
         <w:pStyle w:val="Heading1"/>
+        <w:rPr>
+          <w:rFonts w:ascii="Times New Roman" w:hAnsi="Times New Roman" w:cs="Times New Roman"/>
+          <w:color w:val="auto"/>
+        </w:rPr>
       </w:pPr>
       <w:r>
+        <w:rPr>
+          <w:rFonts w:ascii="Times New Roman" w:hAnsi="Times New Roman" w:cs="Times New Roman"/>
+          <w:color w:val="auto"/>
+        </w:rPr>
         <w:t>4. Validation and model selection</w:t>
       </w:r>
     </w:p>
     <w:p>
       <w:pPr>
         <w:pStyle w:val="Heading2"/>
+        <w:rPr>
+          <w:rFonts w:ascii="Times New Roman" w:hAnsi="Times New Roman" w:cs="Times New Roman"/>
+          <w:color w:val="auto"/>
+          <w:sz w:val="24"/>
+          <w:szCs w:val="24"/>
+        </w:rPr>
       </w:pPr>
       <w:r>
+        <w:rPr>
+          <w:rFonts w:ascii="Times New Roman" w:hAnsi="Times New Roman" w:cs="Times New Roman"/>
+          <w:color w:val="auto"/>
+          <w:sz w:val="24"/>
+          <w:szCs w:val="24"/>
+        </w:rPr>
         <w:t>4.1 Validation design and result</w:t>
       </w:r>
     </w:p>
     <w:p>
+      <w:pPr>
+        <w:rPr>
+          <w:rFonts w:cs="Times New Roman"/>
+          <w:szCs w:val="21"/>
+        </w:rPr>
+      </w:pPr>
       <w:r>
+        <w:rPr>
+          <w:rFonts w:cs="Times New Roman"/>
+          <w:szCs w:val="21"/>
+        </w:rPr>
         <w:t>Validation was performed using chronological splits. The validation period was used to select a model before viewing final-test performance. The final test period was held back until model selection was complete. This design provides stronger evidence than training performance because it tests whether a model can generalise to later observations.</w:t>
       </w:r>
     </w:p>
     <w:p>
+      <w:pPr>
+        <w:rPr>
+          <w:rFonts w:cs="Times New Roman"/>
+          <w:szCs w:val="21"/>
+        </w:rPr>
+      </w:pPr>
       <w:r>
+        <w:rPr>
+          <w:rFonts w:cs="Times New Roman"/>
+          <w:szCs w:val="21"/>
+        </w:rPr>
         <w:t>Ridge regression achieved the strongest validation MAE of 1.080 people. Ridge was therefore selected as the preferred machine-learning model before final testing. The validation result suggested that recent occupancy history and calendar features were useful during that period.</w:t>
       </w:r>
     </w:p>
     <w:p>
       <w:pPr>
         <w:pStyle w:val="Heading2"/>
+        <w:rPr>
+          <w:rFonts w:ascii="Times New Roman" w:hAnsi="Times New Roman" w:cs="Times New Roman"/>
+          <w:color w:val="auto"/>
+          <w:sz w:val="24"/>
+          <w:szCs w:val="24"/>
+        </w:rPr>
       </w:pPr>
       <w:r>
+        <w:rPr>
+          <w:rFonts w:ascii="Times New Roman" w:hAnsi="Times New Roman" w:cs="Times New Roman"/>
+          <w:color w:val="auto"/>
+          <w:sz w:val="24"/>
+          <w:szCs w:val="24"/>
+        </w:rPr>
         <w:t>4.2 Final-test headcount results</w:t>
       </w:r>
     </w:p>
@@ -1780,11 +2773,15 @@
           <w:p>
             <w:pPr>
               <w:spacing w:after="0" w:line="240" w:lineRule="auto"/>
+              <w:rPr>
+                <w:rFonts w:cs="Times New Roman"/>
+                <w:szCs w:val="21"/>
+              </w:rPr>
             </w:pPr>
             <w:r>
               <w:rPr>
-                <w:b/>
-                <w:sz w:val="18"/>
+                <w:rFonts w:cs="Times New Roman"/>
+                <w:szCs w:val="21"/>
               </w:rPr>
               <w:t>Model</w:t>
             </w:r>
@@ -1804,11 +2801,15 @@
           <w:p>
             <w:pPr>
               <w:spacing w:after="0" w:line="240" w:lineRule="auto"/>
+              <w:rPr>
+                <w:rFonts w:cs="Times New Roman"/>
+                <w:szCs w:val="21"/>
+              </w:rPr>
             </w:pPr>
             <w:r>
               <w:rPr>
-                <w:b/>
-                <w:sz w:val="18"/>
+                <w:rFonts w:cs="Times New Roman"/>
+                <w:szCs w:val="21"/>
               </w:rPr>
               <w:t>Final-test MAE</w:t>
             </w:r>
@@ -1828,11 +2829,15 @@
           <w:p>
             <w:pPr>
               <w:spacing w:after="0" w:line="240" w:lineRule="auto"/>
+              <w:rPr>
+                <w:rFonts w:cs="Times New Roman"/>
+                <w:szCs w:val="21"/>
+              </w:rPr>
             </w:pPr>
             <w:r>
               <w:rPr>
-                <w:b/>
-                <w:sz w:val="18"/>
+                <w:rFonts w:cs="Times New Roman"/>
+                <w:szCs w:val="21"/>
               </w:rPr>
               <w:t>Final-test RMSE</w:t>
             </w:r>
@@ -1852,11 +2857,15 @@
           <w:p>
             <w:pPr>
               <w:spacing w:after="0" w:line="240" w:lineRule="auto"/>
+              <w:rPr>
+                <w:rFonts w:cs="Times New Roman"/>
+                <w:szCs w:val="21"/>
+              </w:rPr>
             </w:pPr>
             <w:r>
               <w:rPr>
-                <w:b/>
-                <w:sz w:val="18"/>
+                <w:rFonts w:cs="Times New Roman"/>
+                <w:szCs w:val="21"/>
               </w:rPr>
               <w:t>Interpretation</w:t>
             </w:r>
@@ -1881,10 +2890,15 @@
           <w:p>
             <w:pPr>
               <w:spacing w:after="0" w:line="240" w:lineRule="auto"/>
+              <w:rPr>
+                <w:rFonts w:cs="Times New Roman"/>
+                <w:szCs w:val="21"/>
+              </w:rPr>
             </w:pPr>
             <w:r>
               <w:rPr>
-                <w:sz w:val="18"/>
+                <w:rFonts w:cs="Times New Roman"/>
+                <w:szCs w:val="21"/>
               </w:rPr>
               <w:t>Persistence baseline</w:t>
             </w:r>
@@ -1904,10 +2918,15 @@
           <w:p>
             <w:pPr>
               <w:spacing w:after="0" w:line="240" w:lineRule="auto"/>
+              <w:rPr>
+                <w:rFonts w:cs="Times New Roman"/>
+                <w:szCs w:val="21"/>
+              </w:rPr>
             </w:pPr>
             <w:r>
               <w:rPr>
-                <w:sz w:val="18"/>
+                <w:rFonts w:cs="Times New Roman"/>
+                <w:szCs w:val="21"/>
               </w:rPr>
               <w:t>0.461</w:t>
             </w:r>
@@ -1927,10 +2946,15 @@
           <w:p>
             <w:pPr>
               <w:spacing w:after="0" w:line="240" w:lineRule="auto"/>
+              <w:rPr>
+                <w:rFonts w:cs="Times New Roman"/>
+                <w:szCs w:val="21"/>
+              </w:rPr>
             </w:pPr>
             <w:r>
               <w:rPr>
-                <w:sz w:val="18"/>
+                <w:rFonts w:cs="Times New Roman"/>
+                <w:szCs w:val="21"/>
               </w:rPr>
               <w:t>0.944</w:t>
             </w:r>
@@ -1950,10 +2974,15 @@
           <w:p>
             <w:pPr>
               <w:spacing w:after="0" w:line="240" w:lineRule="auto"/>
+              <w:rPr>
+                <w:rFonts w:cs="Times New Roman"/>
+                <w:szCs w:val="21"/>
+              </w:rPr>
             </w:pPr>
             <w:r>
               <w:rPr>
-                <w:sz w:val="18"/>
+                <w:rFonts w:cs="Times New Roman"/>
+                <w:szCs w:val="21"/>
               </w:rPr>
               <w:t>Best final-test MAE</w:t>
             </w:r>
@@ -1978,10 +3007,15 @@
           <w:p>
             <w:pPr>
               <w:spacing w:after="0" w:line="240" w:lineRule="auto"/>
+              <w:rPr>
+                <w:rFonts w:cs="Times New Roman"/>
+                <w:szCs w:val="21"/>
+              </w:rPr>
             </w:pPr>
             <w:r>
               <w:rPr>
-                <w:sz w:val="18"/>
+                <w:rFonts w:cs="Times New Roman"/>
+                <w:szCs w:val="21"/>
               </w:rPr>
               <w:t>Support-vector regression</w:t>
             </w:r>
@@ -2001,10 +3035,15 @@
           <w:p>
             <w:pPr>
               <w:spacing w:after="0" w:line="240" w:lineRule="auto"/>
+              <w:rPr>
+                <w:rFonts w:cs="Times New Roman"/>
+                <w:szCs w:val="21"/>
+              </w:rPr>
             </w:pPr>
             <w:r>
               <w:rPr>
-                <w:sz w:val="18"/>
+                <w:rFonts w:cs="Times New Roman"/>
+                <w:szCs w:val="21"/>
               </w:rPr>
               <w:t>0.507</w:t>
             </w:r>
@@ -2024,10 +3063,15 @@
           <w:p>
             <w:pPr>
               <w:spacing w:after="0" w:line="240" w:lineRule="auto"/>
+              <w:rPr>
+                <w:rFonts w:cs="Times New Roman"/>
+                <w:szCs w:val="21"/>
+              </w:rPr>
             </w:pPr>
             <w:r>
               <w:rPr>
-                <w:sz w:val="18"/>
+                <w:rFonts w:cs="Times New Roman"/>
+                <w:szCs w:val="21"/>
               </w:rPr>
               <w:t>0.794</w:t>
             </w:r>
@@ -2047,10 +3091,15 @@
           <w:p>
             <w:pPr>
               <w:spacing w:after="0" w:line="240" w:lineRule="auto"/>
+              <w:rPr>
+                <w:rFonts w:cs="Times New Roman"/>
+                <w:szCs w:val="21"/>
+              </w:rPr>
             </w:pPr>
             <w:r>
               <w:rPr>
-                <w:sz w:val="18"/>
+                <w:rFonts w:cs="Times New Roman"/>
+                <w:szCs w:val="21"/>
               </w:rPr>
               <w:t>Slightly higher MAE, lower RMSE</w:t>
             </w:r>
@@ -2075,10 +3124,15 @@
           <w:p>
             <w:pPr>
               <w:spacing w:after="0" w:line="240" w:lineRule="auto"/>
+              <w:rPr>
+                <w:rFonts w:cs="Times New Roman"/>
+                <w:szCs w:val="21"/>
+              </w:rPr>
             </w:pPr>
             <w:r>
               <w:rPr>
-                <w:sz w:val="18"/>
+                <w:rFonts w:cs="Times New Roman"/>
+                <w:szCs w:val="21"/>
               </w:rPr>
               <w:t>Ridge regression</w:t>
             </w:r>
@@ -2098,10 +3152,15 @@
           <w:p>
             <w:pPr>
               <w:spacing w:after="0" w:line="240" w:lineRule="auto"/>
+              <w:rPr>
+                <w:rFonts w:cs="Times New Roman"/>
+                <w:szCs w:val="21"/>
+              </w:rPr>
             </w:pPr>
             <w:r>
               <w:rPr>
-                <w:sz w:val="18"/>
+                <w:rFonts w:cs="Times New Roman"/>
+                <w:szCs w:val="21"/>
               </w:rPr>
               <w:t>0.579</w:t>
             </w:r>
@@ -2121,10 +3180,15 @@
           <w:p>
             <w:pPr>
               <w:spacing w:after="0" w:line="240" w:lineRule="auto"/>
+              <w:rPr>
+                <w:rFonts w:cs="Times New Roman"/>
+                <w:szCs w:val="21"/>
+              </w:rPr>
             </w:pPr>
             <w:r>
               <w:rPr>
-                <w:sz w:val="18"/>
+                <w:rFonts w:cs="Times New Roman"/>
+                <w:szCs w:val="21"/>
               </w:rPr>
               <w:t>0.837</w:t>
             </w:r>
@@ -2144,10 +3208,15 @@
           <w:p>
             <w:pPr>
               <w:spacing w:after="0" w:line="240" w:lineRule="auto"/>
+              <w:rPr>
+                <w:rFonts w:cs="Times New Roman"/>
+                <w:szCs w:val="21"/>
+              </w:rPr>
             </w:pPr>
             <w:r>
               <w:rPr>
-                <w:sz w:val="18"/>
+                <w:rFonts w:cs="Times New Roman"/>
+                <w:szCs w:val="21"/>
               </w:rPr>
               <w:t>Strong validation model but weaker final MAE</w:t>
             </w:r>
@@ -2172,11 +3241,17 @@
           <w:p>
             <w:pPr>
               <w:spacing w:after="0" w:line="240" w:lineRule="auto"/>
+              <w:rPr>
+                <w:rFonts w:cs="Times New Roman"/>
+                <w:szCs w:val="21"/>
+              </w:rPr>
             </w:pPr>
             <w:r>
               <w:rPr>
-                <w:sz w:val="18"/>
-              </w:rPr>
+                <w:rFonts w:cs="Times New Roman"/>
+                <w:szCs w:val="21"/>
+              </w:rPr>
+              <w:lastRenderedPageBreak/>
               <w:t>Decision-tree regression</w:t>
             </w:r>
           </w:p>
@@ -2195,10 +3270,15 @@
           <w:p>
             <w:pPr>
               <w:spacing w:after="0" w:line="240" w:lineRule="auto"/>
+              <w:rPr>
+                <w:rFonts w:cs="Times New Roman"/>
+                <w:szCs w:val="21"/>
+              </w:rPr>
             </w:pPr>
             <w:r>
               <w:rPr>
-                <w:sz w:val="18"/>
+                <w:rFonts w:cs="Times New Roman"/>
+                <w:szCs w:val="21"/>
               </w:rPr>
               <w:t>0.591</w:t>
             </w:r>
@@ -2218,10 +3298,15 @@
           <w:p>
             <w:pPr>
               <w:spacing w:after="0" w:line="240" w:lineRule="auto"/>
+              <w:rPr>
+                <w:rFonts w:cs="Times New Roman"/>
+                <w:szCs w:val="21"/>
+              </w:rPr>
             </w:pPr>
             <w:r>
               <w:rPr>
-                <w:sz w:val="18"/>
+                <w:rFonts w:cs="Times New Roman"/>
+                <w:szCs w:val="21"/>
               </w:rPr>
               <w:t>See results file</w:t>
             </w:r>
@@ -2241,10 +3326,15 @@
           <w:p>
             <w:pPr>
               <w:spacing w:after="0" w:line="240" w:lineRule="auto"/>
+              <w:rPr>
+                <w:rFonts w:cs="Times New Roman"/>
+                <w:szCs w:val="21"/>
+              </w:rPr>
             </w:pPr>
             <w:r>
               <w:rPr>
-                <w:sz w:val="18"/>
+                <w:rFonts w:cs="Times New Roman"/>
+                <w:szCs w:val="21"/>
               </w:rPr>
               <w:t>Did not outperform persistence</w:t>
             </w:r>
@@ -2269,10 +3359,15 @@
           <w:p>
             <w:pPr>
               <w:spacing w:after="0" w:line="240" w:lineRule="auto"/>
+              <w:rPr>
+                <w:rFonts w:cs="Times New Roman"/>
+                <w:szCs w:val="21"/>
+              </w:rPr>
             </w:pPr>
             <w:r>
               <w:rPr>
-                <w:sz w:val="18"/>
+                <w:rFonts w:cs="Times New Roman"/>
+                <w:szCs w:val="21"/>
               </w:rPr>
               <w:t>Weekday/time baseline</w:t>
             </w:r>
@@ -2292,10 +3387,15 @@
           <w:p>
             <w:pPr>
               <w:spacing w:after="0" w:line="240" w:lineRule="auto"/>
+              <w:rPr>
+                <w:rFonts w:cs="Times New Roman"/>
+                <w:szCs w:val="21"/>
+              </w:rPr>
             </w:pPr>
             <w:r>
               <w:rPr>
-                <w:sz w:val="18"/>
+                <w:rFonts w:cs="Times New Roman"/>
+                <w:szCs w:val="21"/>
               </w:rPr>
               <w:t>1.168</w:t>
             </w:r>
@@ -2315,10 +3415,15 @@
           <w:p>
             <w:pPr>
               <w:spacing w:after="0" w:line="240" w:lineRule="auto"/>
+              <w:rPr>
+                <w:rFonts w:cs="Times New Roman"/>
+                <w:szCs w:val="21"/>
+              </w:rPr>
             </w:pPr>
             <w:r>
               <w:rPr>
-                <w:sz w:val="18"/>
+                <w:rFonts w:cs="Times New Roman"/>
+                <w:szCs w:val="21"/>
               </w:rPr>
               <w:t>See results file</w:t>
             </w:r>
@@ -2338,10 +3443,15 @@
           <w:p>
             <w:pPr>
               <w:spacing w:after="0" w:line="240" w:lineRule="auto"/>
+              <w:rPr>
+                <w:rFonts w:cs="Times New Roman"/>
+                <w:szCs w:val="21"/>
+              </w:rPr>
             </w:pPr>
             <w:r>
               <w:rPr>
-                <w:sz w:val="18"/>
+                <w:rFonts w:cs="Times New Roman"/>
+                <w:szCs w:val="21"/>
               </w:rPr>
               <w:t>Weak benchmark</w:t>
             </w:r>
@@ -2352,37 +3462,84 @@
     <w:p>
       <w:pPr>
         <w:spacing w:after="20"/>
+        <w:rPr>
+          <w:rFonts w:cs="Times New Roman"/>
+          <w:szCs w:val="21"/>
+        </w:rPr>
       </w:pPr>
     </w:p>
     <w:p>
+      <w:pPr>
+        <w:rPr>
+          <w:rFonts w:cs="Times New Roman"/>
+          <w:szCs w:val="21"/>
+        </w:rPr>
+      </w:pPr>
       <w:r>
+        <w:rPr>
+          <w:rFonts w:cs="Times New Roman"/>
+          <w:szCs w:val="21"/>
+        </w:rPr>
         <w:t>The persistence baseline achieved the lowest final-test MAE of 0.461 people. The latest sensor-derived headcount was therefore highly informative for the 30-minute forecast horizon during the held-out period.</w:t>
       </w:r>
     </w:p>
     <w:p>
+      <w:pPr>
+        <w:rPr>
+          <w:rFonts w:cs="Times New Roman"/>
+          <w:szCs w:val="21"/>
+        </w:rPr>
+      </w:pPr>
+    </w:p>
+    <w:p>
+      <w:pPr>
+        <w:rPr>
+          <w:rFonts w:cs="Times New Roman"/>
+          <w:szCs w:val="21"/>
+        </w:rPr>
+      </w:pPr>
       <w:r>
+        <w:rPr>
+          <w:rFonts w:cs="Times New Roman"/>
+          <w:szCs w:val="21"/>
+        </w:rPr>
         <w:t>Support-vector regression had a slightly worse MAE of 0.507 people but a lower RMSE of 0.794. Ridge regression had a final-test MAE of 0.579 people and positive bias of approximately 0.272 people, meaning that it tended to forecast slightly higher occupancy than was observed in the final period.</w:t>
       </w:r>
     </w:p>
     <w:p>
+      <w:pPr>
+        <w:rPr>
+          <w:rFonts w:cs="Times New Roman"/>
+          <w:szCs w:val="21"/>
+        </w:rPr>
+      </w:pPr>
       <w:r>
-        <w:lastRenderedPageBreak/>
+        <w:rPr>
+          <w:rFonts w:cs="Times New Roman"/>
+          <w:szCs w:val="21"/>
+        </w:rPr>
         <w:t>The weekday/time baseline performed substantially worse, confirming that recent occupancy information was more useful than relying only on typical weekly patterns.</w:t>
       </w:r>
     </w:p>
     <w:p>
       <w:pPr>
         <w:jc w:val="center"/>
+        <w:rPr>
+          <w:rFonts w:cs="Times New Roman"/>
+          <w:szCs w:val="21"/>
+        </w:rPr>
       </w:pPr>
       <w:r>
         <w:rPr>
+          <w:rFonts w:cs="Times New Roman"/>
           <w:noProof/>
+          <w:szCs w:val="21"/>
         </w:rPr>
         <w:drawing>
-          <wp:inline distT="0" distB="0" distL="0" distR="0" wp14:anchorId="7932BA14" wp14:editId="2A198E19">
-            <wp:extent cx="5394960" cy="3034665"/>
+          <wp:inline distT="0" distB="0" distL="0" distR="0" wp14:anchorId="1809662E" wp14:editId="3BA1A3DD">
+            <wp:extent cx="5486400" cy="3086100"/>
             <wp:effectExtent l="0" t="0" r="0" b="0"/>
-            <wp:docPr id="1" name="Picture 1"/>
+            <wp:docPr id="1502272937" name="Picture 1"/>
             <wp:cNvGraphicFramePr>
               <a:graphicFrameLocks xmlns:a="http://schemas.openxmlformats.org/drawingml/2006/main" noChangeAspect="1"/>
             </wp:cNvGraphicFramePr>
@@ -2390,7 +3547,7 @@
               <a:graphicData uri="http://schemas.openxmlformats.org/drawingml/2006/picture">
                 <pic:pic xmlns:pic="http://schemas.openxmlformats.org/drawingml/2006/picture">
                   <pic:nvPicPr>
-                    <pic:cNvPr id="0" name="placeholder_mae.png"/>
+                    <pic:cNvPr id="1502272937" name=""/>
                     <pic:cNvPicPr/>
                   </pic:nvPicPr>
                   <pic:blipFill>
@@ -2402,7 +3559,7 @@
                   <pic:spPr>
                     <a:xfrm>
                       <a:off x="0" y="0"/>
-                      <a:ext cx="5394960" cy="3034665"/>
+                      <a:ext cx="5486400" cy="3086100"/>
                     </a:xfrm>
                     <a:prstGeom prst="rect">
                       <a:avLst/>
@@ -2418,41 +3575,75 @@
     <w:p>
       <w:pPr>
         <w:jc w:val="center"/>
+        <w:rPr>
+          <w:rFonts w:cs="Times New Roman"/>
+          <w:szCs w:val="21"/>
+        </w:rPr>
       </w:pPr>
       <w:r>
         <w:rPr>
+          <w:rFonts w:cs="Times New Roman"/>
           <w:i/>
-          <w:sz w:val="18"/>
-        </w:rPr>
-        <w:t>Figure 1. Final-test mean absolute error for all evaluated models. Persistence achieved the lowest MAE.</w:t>
+          <w:szCs w:val="21"/>
+        </w:rPr>
+        <w:t>Figure 1. Replace this placeholder with a bar chart comparing final-test MAE for all evaluated models.</w:t>
       </w:r>
     </w:p>
     <w:p>
       <w:pPr>
         <w:pStyle w:val="Heading2"/>
+        <w:rPr>
+          <w:rFonts w:ascii="Times New Roman" w:hAnsi="Times New Roman" w:cs="Times New Roman"/>
+          <w:color w:val="auto"/>
+          <w:sz w:val="24"/>
+          <w:szCs w:val="24"/>
+        </w:rPr>
       </w:pPr>
       <w:r>
+        <w:rPr>
+          <w:rFonts w:ascii="Times New Roman" w:hAnsi="Times New Roman" w:cs="Times New Roman"/>
+          <w:color w:val="auto"/>
+          <w:sz w:val="24"/>
+          <w:szCs w:val="24"/>
+        </w:rPr>
         <w:t>4.3 Forecast visualisation and availability results</w:t>
       </w:r>
     </w:p>
     <w:p>
+      <w:pPr>
+        <w:rPr>
+          <w:rFonts w:cs="Times New Roman"/>
+          <w:szCs w:val="21"/>
+        </w:rPr>
+      </w:pPr>
       <w:r>
+        <w:rPr>
+          <w:rFonts w:cs="Times New Roman"/>
+          <w:szCs w:val="21"/>
+        </w:rPr>
         <w:t>A forecast plot provides a visual check of whether the model captures broad occupancy patterns and where it differs from observations. Rapid arrivals and departures are expected to be more difficult to forecast than stable occupied or empty periods.</w:t>
       </w:r>
     </w:p>
     <w:p>
       <w:pPr>
         <w:jc w:val="center"/>
+        <w:rPr>
+          <w:rFonts w:cs="Times New Roman"/>
+          <w:szCs w:val="21"/>
+        </w:rPr>
       </w:pPr>
       <w:r>
         <w:rPr>
+          <w:rFonts w:cs="Times New Roman"/>
           <w:noProof/>
-        </w:rPr>
+          <w:szCs w:val="21"/>
+        </w:rPr>
+        <w:lastRenderedPageBreak/>
         <w:drawing>
-          <wp:inline distT="0" distB="0" distL="0" distR="0" wp14:anchorId="316D203C" wp14:editId="427A7EC1">
-            <wp:extent cx="5394960" cy="2207029"/>
-            <wp:effectExtent l="0" t="0" r="0" b="0"/>
-            <wp:docPr id="2" name="Picture 2"/>
+          <wp:inline distT="0" distB="0" distL="0" distR="0" wp14:anchorId="4318351E" wp14:editId="12BAA5F4">
+            <wp:extent cx="5486400" cy="2244725"/>
+            <wp:effectExtent l="0" t="0" r="0" b="3175"/>
+            <wp:docPr id="1538659887" name="Picture 1"/>
             <wp:cNvGraphicFramePr>
               <a:graphicFrameLocks xmlns:a="http://schemas.openxmlformats.org/drawingml/2006/main" noChangeAspect="1"/>
             </wp:cNvGraphicFramePr>
@@ -2460,7 +3651,7 @@
               <a:graphicData uri="http://schemas.openxmlformats.org/drawingml/2006/picture">
                 <pic:pic xmlns:pic="http://schemas.openxmlformats.org/drawingml/2006/picture">
                   <pic:nvPicPr>
-                    <pic:cNvPr id="0" name="placeholder_forecast.png"/>
+                    <pic:cNvPr id="1538659887" name=""/>
                     <pic:cNvPicPr/>
                   </pic:nvPicPr>
                   <pic:blipFill>
@@ -2472,7 +3663,7 @@
                   <pic:spPr>
                     <a:xfrm>
                       <a:off x="0" y="0"/>
-                      <a:ext cx="5394960" cy="2207029"/>
+                      <a:ext cx="5486400" cy="2244725"/>
                     </a:xfrm>
                     <a:prstGeom prst="rect">
                       <a:avLst/>
@@ -2488,13 +3679,18 @@
     <w:p>
       <w:pPr>
         <w:jc w:val="center"/>
+        <w:rPr>
+          <w:rFonts w:cs="Times New Roman"/>
+          <w:szCs w:val="21"/>
+        </w:rPr>
       </w:pPr>
       <w:r>
         <w:rPr>
+          <w:rFonts w:cs="Times New Roman"/>
           <w:i/>
-          <w:sz w:val="18"/>
-        </w:rPr>
-        <w:t>Figure 2. Observed and selected 30-minute forecast headcount for the final test week.</w:t>
+          <w:szCs w:val="21"/>
+        </w:rPr>
+        <w:t>Figure 2. Replace this placeholder with the observed and 30-minute forecast headcount plot for the final test week.</w:t>
       </w:r>
     </w:p>
     <w:tbl>
@@ -2525,11 +3721,15 @@
           <w:p>
             <w:pPr>
               <w:spacing w:after="0" w:line="240" w:lineRule="auto"/>
+              <w:rPr>
+                <w:rFonts w:cs="Times New Roman"/>
+                <w:szCs w:val="21"/>
+              </w:rPr>
             </w:pPr>
             <w:r>
               <w:rPr>
-                <w:b/>
-                <w:sz w:val="18"/>
+                <w:rFonts w:cs="Times New Roman"/>
+                <w:szCs w:val="21"/>
               </w:rPr>
               <w:t>Availability metric for ridge regression</w:t>
             </w:r>
@@ -2549,11 +3749,15 @@
           <w:p>
             <w:pPr>
               <w:spacing w:after="0" w:line="240" w:lineRule="auto"/>
+              <w:rPr>
+                <w:rFonts w:cs="Times New Roman"/>
+                <w:szCs w:val="21"/>
+              </w:rPr>
             </w:pPr>
             <w:r>
               <w:rPr>
-                <w:b/>
-                <w:sz w:val="18"/>
+                <w:rFonts w:cs="Times New Roman"/>
+                <w:szCs w:val="21"/>
               </w:rPr>
               <w:t>Result</w:t>
             </w:r>
@@ -2578,10 +3782,15 @@
           <w:p>
             <w:pPr>
               <w:spacing w:after="0" w:line="240" w:lineRule="auto"/>
+              <w:rPr>
+                <w:rFonts w:cs="Times New Roman"/>
+                <w:szCs w:val="21"/>
+              </w:rPr>
             </w:pPr>
             <w:r>
               <w:rPr>
-                <w:sz w:val="18"/>
+                <w:rFonts w:cs="Times New Roman"/>
+                <w:szCs w:val="21"/>
               </w:rPr>
               <w:t>Accuracy</w:t>
             </w:r>
@@ -2601,10 +3810,15 @@
           <w:p>
             <w:pPr>
               <w:spacing w:after="0" w:line="240" w:lineRule="auto"/>
+              <w:rPr>
+                <w:rFonts w:cs="Times New Roman"/>
+                <w:szCs w:val="21"/>
+              </w:rPr>
             </w:pPr>
             <w:r>
               <w:rPr>
-                <w:sz w:val="18"/>
+                <w:rFonts w:cs="Times New Roman"/>
+                <w:szCs w:val="21"/>
               </w:rPr>
               <w:t>64.6%</w:t>
             </w:r>
@@ -2629,10 +3843,15 @@
           <w:p>
             <w:pPr>
               <w:spacing w:after="0" w:line="240" w:lineRule="auto"/>
+              <w:rPr>
+                <w:rFonts w:cs="Times New Roman"/>
+                <w:szCs w:val="21"/>
+              </w:rPr>
             </w:pPr>
             <w:r>
               <w:rPr>
-                <w:sz w:val="18"/>
+                <w:rFonts w:cs="Times New Roman"/>
+                <w:szCs w:val="21"/>
               </w:rPr>
               <w:t>Precision</w:t>
             </w:r>
@@ -2652,10 +3871,15 @@
           <w:p>
             <w:pPr>
               <w:spacing w:after="0" w:line="240" w:lineRule="auto"/>
+              <w:rPr>
+                <w:rFonts w:cs="Times New Roman"/>
+                <w:szCs w:val="21"/>
+              </w:rPr>
             </w:pPr>
             <w:r>
               <w:rPr>
-                <w:sz w:val="18"/>
+                <w:rFonts w:cs="Times New Roman"/>
+                <w:szCs w:val="21"/>
               </w:rPr>
               <w:t>88.1%</w:t>
             </w:r>
@@ -2680,10 +3904,15 @@
           <w:p>
             <w:pPr>
               <w:spacing w:after="0" w:line="240" w:lineRule="auto"/>
+              <w:rPr>
+                <w:rFonts w:cs="Times New Roman"/>
+                <w:szCs w:val="21"/>
+              </w:rPr>
             </w:pPr>
             <w:r>
               <w:rPr>
-                <w:sz w:val="18"/>
+                <w:rFonts w:cs="Times New Roman"/>
+                <w:szCs w:val="21"/>
               </w:rPr>
               <w:t>Recall</w:t>
             </w:r>
@@ -2703,10 +3932,15 @@
           <w:p>
             <w:pPr>
               <w:spacing w:after="0" w:line="240" w:lineRule="auto"/>
+              <w:rPr>
+                <w:rFonts w:cs="Times New Roman"/>
+                <w:szCs w:val="21"/>
+              </w:rPr>
             </w:pPr>
             <w:r>
               <w:rPr>
-                <w:sz w:val="18"/>
+                <w:rFonts w:cs="Times New Roman"/>
+                <w:szCs w:val="21"/>
               </w:rPr>
               <w:t>53.8%</w:t>
             </w:r>
@@ -2731,10 +3965,15 @@
           <w:p>
             <w:pPr>
               <w:spacing w:after="0" w:line="240" w:lineRule="auto"/>
+              <w:rPr>
+                <w:rFonts w:cs="Times New Roman"/>
+                <w:szCs w:val="21"/>
+              </w:rPr>
             </w:pPr>
             <w:r>
               <w:rPr>
-                <w:sz w:val="18"/>
+                <w:rFonts w:cs="Times New Roman"/>
+                <w:szCs w:val="21"/>
               </w:rPr>
               <w:t>F1-score</w:t>
             </w:r>
@@ -2754,10 +3993,15 @@
           <w:p>
             <w:pPr>
               <w:spacing w:after="0" w:line="240" w:lineRule="auto"/>
+              <w:rPr>
+                <w:rFonts w:cs="Times New Roman"/>
+                <w:szCs w:val="21"/>
+              </w:rPr>
             </w:pPr>
             <w:r>
               <w:rPr>
-                <w:sz w:val="18"/>
+                <w:rFonts w:cs="Times New Roman"/>
+                <w:szCs w:val="21"/>
               </w:rPr>
               <w:t>66.8%</w:t>
             </w:r>
@@ -2768,45 +4012,119 @@
     <w:p>
       <w:pPr>
         <w:spacing w:after="20"/>
+        <w:rPr>
+          <w:rFonts w:cs="Times New Roman"/>
+          <w:szCs w:val="21"/>
+        </w:rPr>
       </w:pPr>
     </w:p>
     <w:p>
+      <w:pPr>
+        <w:rPr>
+          <w:rFonts w:cs="Times New Roman"/>
+          <w:szCs w:val="21"/>
+        </w:rPr>
+      </w:pPr>
       <w:r>
-        <w:lastRenderedPageBreak/>
+        <w:rPr>
+          <w:rFonts w:cs="Times New Roman"/>
+          <w:szCs w:val="21"/>
+        </w:rPr>
         <w:t>The precision of 88.1% means that when ridge predicted the room was available, it was usually available according to the future sensor reading. The recall of 53.8% means that the model did not identify every period that was actually available.</w:t>
       </w:r>
     </w:p>
     <w:p>
+      <w:pPr>
+        <w:rPr>
+          <w:rFonts w:cs="Times New Roman"/>
+          <w:szCs w:val="21"/>
+        </w:rPr>
+      </w:pPr>
       <w:r>
+        <w:rPr>
+          <w:rFonts w:cs="Times New Roman"/>
+          <w:szCs w:val="21"/>
+        </w:rPr>
         <w:t>Persistence achieved an availability F1-score of 80.4%, while support-vector regression achieved 80.0%. Both were stronger than ridge regression's F1-score of 66.8%. This supports the headcount results: persistence generalised best during the final test period.</w:t>
       </w:r>
     </w:p>
     <w:p>
       <w:pPr>
         <w:pStyle w:val="Heading2"/>
+        <w:rPr>
+          <w:rFonts w:ascii="Times New Roman" w:hAnsi="Times New Roman" w:cs="Times New Roman"/>
+          <w:b w:val="0"/>
+          <w:bCs w:val="0"/>
+          <w:color w:val="auto"/>
+          <w:sz w:val="21"/>
+          <w:szCs w:val="21"/>
+        </w:rPr>
       </w:pPr>
       <w:r>
+        <w:rPr>
+          <w:rFonts w:ascii="Times New Roman" w:hAnsi="Times New Roman" w:cs="Times New Roman"/>
+          <w:b w:val="0"/>
+          <w:bCs w:val="0"/>
+          <w:color w:val="auto"/>
+          <w:sz w:val="21"/>
+          <w:szCs w:val="21"/>
+        </w:rPr>
         <w:t>4.4 Verification and automated tests</w:t>
       </w:r>
     </w:p>
     <w:p>
+      <w:pPr>
+        <w:rPr>
+          <w:rFonts w:cs="Times New Roman"/>
+          <w:szCs w:val="21"/>
+        </w:rPr>
+      </w:pPr>
       <w:r>
+        <w:rPr>
+          <w:rFonts w:cs="Times New Roman"/>
+          <w:szCs w:val="21"/>
+        </w:rPr>
         <w:t>The codebase includes six automated tests covering data preparation, feature construction, model behaviour, forecasting logic, and the availability threshold. The pytest HTML report records that all six tests pass. Automated testing does not prove forecast accuracy, but it reduces the risk that code changes break critical parts of the workflow.</w:t>
       </w:r>
     </w:p>
     <w:p>
       <w:pPr>
-        <w:pStyle w:val="Heading1"/>
+        <w:rPr>
+          <w:rFonts w:eastAsiaTheme="majorEastAsia" w:cs="Times New Roman"/>
+          <w:b/>
+          <w:bCs/>
+          <w:sz w:val="28"/>
+          <w:szCs w:val="28"/>
+        </w:rPr>
       </w:pPr>
       <w:r>
+        <w:rPr>
+          <w:rFonts w:eastAsiaTheme="majorEastAsia" w:cs="Times New Roman"/>
+          <w:b/>
+          <w:bCs/>
+          <w:sz w:val="28"/>
+          <w:szCs w:val="28"/>
+        </w:rPr>
         <w:t>5. Final results and sensitivity</w:t>
       </w:r>
     </w:p>
     <w:p>
       <w:pPr>
         <w:pStyle w:val="Heading2"/>
+        <w:rPr>
+          <w:rFonts w:ascii="Times New Roman" w:hAnsi="Times New Roman" w:cs="Times New Roman"/>
+          <w:color w:val="auto"/>
+          <w:sz w:val="24"/>
+          <w:szCs w:val="24"/>
+        </w:rPr>
       </w:pPr>
       <w:r>
+        <w:rPr>
+          <w:rFonts w:ascii="Times New Roman" w:hAnsi="Times New Roman" w:cs="Times New Roman"/>
+          <w:color w:val="auto"/>
+          <w:sz w:val="24"/>
+          <w:szCs w:val="24"/>
+        </w:rPr>
         <w:t>5.1 Forecast-horizon sensitivity</w:t>
       </w:r>
     </w:p>
@@ -2839,11 +4157,16 @@
           <w:p>
             <w:pPr>
               <w:spacing w:after="0" w:line="240" w:lineRule="auto"/>
+              <w:rPr>
+                <w:rFonts w:cs="Times New Roman"/>
+                <w:szCs w:val="21"/>
+              </w:rPr>
             </w:pPr>
             <w:r>
               <w:rPr>
+                <w:rFonts w:cs="Times New Roman"/>
                 <w:b/>
-                <w:sz w:val="18"/>
+                <w:szCs w:val="21"/>
               </w:rPr>
               <w:t>Forecast horizon</w:t>
             </w:r>
@@ -2863,11 +4186,16 @@
           <w:p>
             <w:pPr>
               <w:spacing w:after="0" w:line="240" w:lineRule="auto"/>
+              <w:rPr>
+                <w:rFonts w:cs="Times New Roman"/>
+                <w:szCs w:val="21"/>
+              </w:rPr>
             </w:pPr>
             <w:r>
               <w:rPr>
+                <w:rFonts w:cs="Times New Roman"/>
                 <w:b/>
-                <w:sz w:val="18"/>
+                <w:szCs w:val="21"/>
               </w:rPr>
               <w:t>Best final-test MAE</w:t>
             </w:r>
@@ -2887,11 +4215,16 @@
           <w:p>
             <w:pPr>
               <w:spacing w:after="0" w:line="240" w:lineRule="auto"/>
+              <w:rPr>
+                <w:rFonts w:cs="Times New Roman"/>
+                <w:szCs w:val="21"/>
+              </w:rPr>
             </w:pPr>
             <w:r>
               <w:rPr>
+                <w:rFonts w:cs="Times New Roman"/>
                 <w:b/>
-                <w:sz w:val="18"/>
+                <w:szCs w:val="21"/>
               </w:rPr>
               <w:t>Best model</w:t>
             </w:r>
@@ -2916,10 +4249,15 @@
           <w:p>
             <w:pPr>
               <w:spacing w:after="0" w:line="240" w:lineRule="auto"/>
+              <w:rPr>
+                <w:rFonts w:cs="Times New Roman"/>
+                <w:szCs w:val="21"/>
+              </w:rPr>
             </w:pPr>
             <w:r>
               <w:rPr>
-                <w:sz w:val="18"/>
+                <w:rFonts w:cs="Times New Roman"/>
+                <w:szCs w:val="21"/>
               </w:rPr>
               <w:t>15 minutes</w:t>
             </w:r>
@@ -2939,10 +4277,15 @@
           <w:p>
             <w:pPr>
               <w:spacing w:after="0" w:line="240" w:lineRule="auto"/>
+              <w:rPr>
+                <w:rFonts w:cs="Times New Roman"/>
+                <w:szCs w:val="21"/>
+              </w:rPr>
             </w:pPr>
             <w:r>
               <w:rPr>
-                <w:sz w:val="18"/>
+                <w:rFonts w:cs="Times New Roman"/>
+                <w:szCs w:val="21"/>
               </w:rPr>
               <w:t>0.407</w:t>
             </w:r>
@@ -2962,10 +4305,15 @@
           <w:p>
             <w:pPr>
               <w:spacing w:after="0" w:line="240" w:lineRule="auto"/>
+              <w:rPr>
+                <w:rFonts w:cs="Times New Roman"/>
+                <w:szCs w:val="21"/>
+              </w:rPr>
             </w:pPr>
             <w:r>
               <w:rPr>
-                <w:sz w:val="18"/>
+                <w:rFonts w:cs="Times New Roman"/>
+                <w:szCs w:val="21"/>
               </w:rPr>
               <w:t>Persistence</w:t>
             </w:r>
@@ -2990,10 +4338,15 @@
           <w:p>
             <w:pPr>
               <w:spacing w:after="0" w:line="240" w:lineRule="auto"/>
+              <w:rPr>
+                <w:rFonts w:cs="Times New Roman"/>
+                <w:szCs w:val="21"/>
+              </w:rPr>
             </w:pPr>
             <w:r>
               <w:rPr>
-                <w:sz w:val="18"/>
+                <w:rFonts w:cs="Times New Roman"/>
+                <w:szCs w:val="21"/>
               </w:rPr>
               <w:t>30 minutes</w:t>
             </w:r>
@@ -3013,10 +4366,15 @@
           <w:p>
             <w:pPr>
               <w:spacing w:after="0" w:line="240" w:lineRule="auto"/>
+              <w:rPr>
+                <w:rFonts w:cs="Times New Roman"/>
+                <w:szCs w:val="21"/>
+              </w:rPr>
             </w:pPr>
             <w:r>
               <w:rPr>
-                <w:sz w:val="18"/>
+                <w:rFonts w:cs="Times New Roman"/>
+                <w:szCs w:val="21"/>
               </w:rPr>
               <w:t>0.461</w:t>
             </w:r>
@@ -3036,10 +4394,15 @@
           <w:p>
             <w:pPr>
               <w:spacing w:after="0" w:line="240" w:lineRule="auto"/>
+              <w:rPr>
+                <w:rFonts w:cs="Times New Roman"/>
+                <w:szCs w:val="21"/>
+              </w:rPr>
             </w:pPr>
             <w:r>
               <w:rPr>
-                <w:sz w:val="18"/>
+                <w:rFonts w:cs="Times New Roman"/>
+                <w:szCs w:val="21"/>
               </w:rPr>
               <w:t>Persistence</w:t>
             </w:r>
@@ -3064,10 +4427,15 @@
           <w:p>
             <w:pPr>
               <w:spacing w:after="0" w:line="240" w:lineRule="auto"/>
+              <w:rPr>
+                <w:rFonts w:cs="Times New Roman"/>
+                <w:szCs w:val="21"/>
+              </w:rPr>
             </w:pPr>
             <w:r>
               <w:rPr>
-                <w:sz w:val="18"/>
+                <w:rFonts w:cs="Times New Roman"/>
+                <w:szCs w:val="21"/>
               </w:rPr>
               <w:t>60 minutes</w:t>
             </w:r>
@@ -3087,10 +4455,15 @@
           <w:p>
             <w:pPr>
               <w:spacing w:after="0" w:line="240" w:lineRule="auto"/>
+              <w:rPr>
+                <w:rFonts w:cs="Times New Roman"/>
+                <w:szCs w:val="21"/>
+              </w:rPr>
             </w:pPr>
             <w:r>
               <w:rPr>
-                <w:sz w:val="18"/>
+                <w:rFonts w:cs="Times New Roman"/>
+                <w:szCs w:val="21"/>
               </w:rPr>
               <w:t>0.547</w:t>
             </w:r>
@@ -3110,10 +4483,15 @@
           <w:p>
             <w:pPr>
               <w:spacing w:after="0" w:line="240" w:lineRule="auto"/>
+              <w:rPr>
+                <w:rFonts w:cs="Times New Roman"/>
+                <w:szCs w:val="21"/>
+              </w:rPr>
             </w:pPr>
             <w:r>
               <w:rPr>
-                <w:sz w:val="18"/>
+                <w:rFonts w:cs="Times New Roman"/>
+                <w:szCs w:val="21"/>
               </w:rPr>
               <w:t>Persistence</w:t>
             </w:r>
@@ -3124,18 +4502,44 @@
     <w:p>
       <w:pPr>
         <w:spacing w:after="20"/>
+        <w:rPr>
+          <w:rFonts w:cs="Times New Roman"/>
+          <w:szCs w:val="21"/>
+        </w:rPr>
       </w:pPr>
     </w:p>
     <w:p>
+      <w:pPr>
+        <w:rPr>
+          <w:rFonts w:cs="Times New Roman"/>
+          <w:szCs w:val="21"/>
+        </w:rPr>
+      </w:pPr>
       <w:r>
+        <w:rPr>
+          <w:rFonts w:cs="Times New Roman"/>
+          <w:szCs w:val="21"/>
+        </w:rPr>
         <w:t>The 15-minute horizon had the strongest accuracy because there is less uncertainty over a shorter period. However, 15 minutes may not provide enough time for a student to decide whether to travel to a laboratory. The 60-minute horizon provides more advance notice but had greater error. The 30-minute horizon was retained because it provides a practical compromise between useful notice and forecast accuracy.</w:t>
       </w:r>
     </w:p>
     <w:p>
       <w:pPr>
         <w:pStyle w:val="Heading2"/>
+        <w:rPr>
+          <w:rFonts w:ascii="Times New Roman" w:hAnsi="Times New Roman" w:cs="Times New Roman"/>
+          <w:color w:val="auto"/>
+          <w:sz w:val="24"/>
+          <w:szCs w:val="24"/>
+        </w:rPr>
       </w:pPr>
       <w:r>
+        <w:rPr>
+          <w:rFonts w:ascii="Times New Roman" w:hAnsi="Times New Roman" w:cs="Times New Roman"/>
+          <w:color w:val="auto"/>
+          <w:sz w:val="24"/>
+          <w:szCs w:val="24"/>
+        </w:rPr>
         <w:t>5.2 Availability-threshold sensitivity</w:t>
       </w:r>
     </w:p>
@@ -3170,11 +4574,16 @@
           <w:p>
             <w:pPr>
               <w:spacing w:after="0" w:line="240" w:lineRule="auto"/>
+              <w:rPr>
+                <w:rFonts w:cs="Times New Roman"/>
+                <w:szCs w:val="21"/>
+              </w:rPr>
             </w:pPr>
             <w:r>
               <w:rPr>
+                <w:rFonts w:cs="Times New Roman"/>
                 <w:b/>
-                <w:sz w:val="18"/>
+                <w:szCs w:val="21"/>
               </w:rPr>
               <w:t>Availability threshold</w:t>
             </w:r>
@@ -3194,11 +4603,16 @@
           <w:p>
             <w:pPr>
               <w:spacing w:after="0" w:line="240" w:lineRule="auto"/>
+              <w:rPr>
+                <w:rFonts w:cs="Times New Roman"/>
+                <w:szCs w:val="21"/>
+              </w:rPr>
             </w:pPr>
             <w:r>
               <w:rPr>
+                <w:rFonts w:cs="Times New Roman"/>
                 <w:b/>
-                <w:sz w:val="18"/>
+                <w:szCs w:val="21"/>
               </w:rPr>
               <w:t>Accuracy</w:t>
             </w:r>
@@ -3218,11 +4632,16 @@
           <w:p>
             <w:pPr>
               <w:spacing w:after="0" w:line="240" w:lineRule="auto"/>
+              <w:rPr>
+                <w:rFonts w:cs="Times New Roman"/>
+                <w:szCs w:val="21"/>
+              </w:rPr>
             </w:pPr>
             <w:r>
               <w:rPr>
+                <w:rFonts w:cs="Times New Roman"/>
                 <w:b/>
-                <w:sz w:val="18"/>
+                <w:szCs w:val="21"/>
               </w:rPr>
               <w:t>Precision</w:t>
             </w:r>
@@ -3242,11 +4661,16 @@
           <w:p>
             <w:pPr>
               <w:spacing w:after="0" w:line="240" w:lineRule="auto"/>
+              <w:rPr>
+                <w:rFonts w:cs="Times New Roman"/>
+                <w:szCs w:val="21"/>
+              </w:rPr>
             </w:pPr>
             <w:r>
               <w:rPr>
+                <w:rFonts w:cs="Times New Roman"/>
                 <w:b/>
-                <w:sz w:val="18"/>
+                <w:szCs w:val="21"/>
               </w:rPr>
               <w:t>Recall</w:t>
             </w:r>
@@ -3266,11 +4690,16 @@
           <w:p>
             <w:pPr>
               <w:spacing w:after="0" w:line="240" w:lineRule="auto"/>
+              <w:rPr>
+                <w:rFonts w:cs="Times New Roman"/>
+                <w:szCs w:val="21"/>
+              </w:rPr>
             </w:pPr>
             <w:r>
               <w:rPr>
+                <w:rFonts w:cs="Times New Roman"/>
                 <w:b/>
-                <w:sz w:val="18"/>
+                <w:szCs w:val="21"/>
               </w:rPr>
               <w:t>F1-score</w:t>
             </w:r>
@@ -3295,10 +4724,15 @@
           <w:p>
             <w:pPr>
               <w:spacing w:after="0" w:line="240" w:lineRule="auto"/>
+              <w:rPr>
+                <w:rFonts w:cs="Times New Roman"/>
+                <w:szCs w:val="21"/>
+              </w:rPr>
             </w:pPr>
             <w:r>
               <w:rPr>
-                <w:sz w:val="18"/>
+                <w:rFonts w:cs="Times New Roman"/>
+                <w:szCs w:val="21"/>
               </w:rPr>
               <w:t>Headcount &lt;= 0.0</w:t>
             </w:r>
@@ -3318,10 +4752,15 @@
           <w:p>
             <w:pPr>
               <w:spacing w:after="0" w:line="240" w:lineRule="auto"/>
+              <w:rPr>
+                <w:rFonts w:cs="Times New Roman"/>
+                <w:szCs w:val="21"/>
+              </w:rPr>
             </w:pPr>
             <w:r>
               <w:rPr>
-                <w:sz w:val="18"/>
+                <w:rFonts w:cs="Times New Roman"/>
+                <w:szCs w:val="21"/>
               </w:rPr>
               <w:t>41.8%</w:t>
             </w:r>
@@ -3341,10 +4780,15 @@
           <w:p>
             <w:pPr>
               <w:spacing w:after="0" w:line="240" w:lineRule="auto"/>
+              <w:rPr>
+                <w:rFonts w:cs="Times New Roman"/>
+                <w:szCs w:val="21"/>
+              </w:rPr>
             </w:pPr>
             <w:r>
               <w:rPr>
-                <w:sz w:val="18"/>
+                <w:rFonts w:cs="Times New Roman"/>
+                <w:szCs w:val="21"/>
               </w:rPr>
               <w:t>93.2%</w:t>
             </w:r>
@@ -3364,10 +4808,15 @@
           <w:p>
             <w:pPr>
               <w:spacing w:after="0" w:line="240" w:lineRule="auto"/>
+              <w:rPr>
+                <w:rFonts w:cs="Times New Roman"/>
+                <w:szCs w:val="21"/>
+              </w:rPr>
             </w:pPr>
             <w:r>
               <w:rPr>
-                <w:sz w:val="18"/>
+                <w:rFonts w:cs="Times New Roman"/>
+                <w:szCs w:val="21"/>
               </w:rPr>
               <w:t>13.0%</w:t>
             </w:r>
@@ -3387,10 +4836,15 @@
           <w:p>
             <w:pPr>
               <w:spacing w:after="0" w:line="240" w:lineRule="auto"/>
+              <w:rPr>
+                <w:rFonts w:cs="Times New Roman"/>
+                <w:szCs w:val="21"/>
+              </w:rPr>
             </w:pPr>
             <w:r>
               <w:rPr>
-                <w:sz w:val="18"/>
+                <w:rFonts w:cs="Times New Roman"/>
+                <w:szCs w:val="21"/>
               </w:rPr>
               <w:t>22.9%</w:t>
             </w:r>
@@ -3415,10 +4869,15 @@
           <w:p>
             <w:pPr>
               <w:spacing w:after="0" w:line="240" w:lineRule="auto"/>
+              <w:rPr>
+                <w:rFonts w:cs="Times New Roman"/>
+                <w:szCs w:val="21"/>
+              </w:rPr>
             </w:pPr>
             <w:r>
               <w:rPr>
-                <w:sz w:val="18"/>
+                <w:rFonts w:cs="Times New Roman"/>
+                <w:szCs w:val="21"/>
               </w:rPr>
               <w:t>Headcount &lt;= 0.5</w:t>
             </w:r>
@@ -3438,10 +4897,15 @@
           <w:p>
             <w:pPr>
               <w:spacing w:after="0" w:line="240" w:lineRule="auto"/>
+              <w:rPr>
+                <w:rFonts w:cs="Times New Roman"/>
+                <w:szCs w:val="21"/>
+              </w:rPr>
             </w:pPr>
             <w:r>
               <w:rPr>
-                <w:sz w:val="18"/>
+                <w:rFonts w:cs="Times New Roman"/>
+                <w:szCs w:val="21"/>
               </w:rPr>
               <w:t>64.6%</w:t>
             </w:r>
@@ -3461,10 +4925,15 @@
           <w:p>
             <w:pPr>
               <w:spacing w:after="0" w:line="240" w:lineRule="auto"/>
+              <w:rPr>
+                <w:rFonts w:cs="Times New Roman"/>
+                <w:szCs w:val="21"/>
+              </w:rPr>
             </w:pPr>
             <w:r>
               <w:rPr>
-                <w:sz w:val="18"/>
+                <w:rFonts w:cs="Times New Roman"/>
+                <w:szCs w:val="21"/>
               </w:rPr>
               <w:t>88.1%</w:t>
             </w:r>
@@ -3484,10 +4953,15 @@
           <w:p>
             <w:pPr>
               <w:spacing w:after="0" w:line="240" w:lineRule="auto"/>
+              <w:rPr>
+                <w:rFonts w:cs="Times New Roman"/>
+                <w:szCs w:val="21"/>
+              </w:rPr>
             </w:pPr>
             <w:r>
               <w:rPr>
-                <w:sz w:val="18"/>
+                <w:rFonts w:cs="Times New Roman"/>
+                <w:szCs w:val="21"/>
               </w:rPr>
               <w:t>53.8%</w:t>
             </w:r>
@@ -3507,10 +4981,15 @@
           <w:p>
             <w:pPr>
               <w:spacing w:after="0" w:line="240" w:lineRule="auto"/>
+              <w:rPr>
+                <w:rFonts w:cs="Times New Roman"/>
+                <w:szCs w:val="21"/>
+              </w:rPr>
             </w:pPr>
             <w:r>
               <w:rPr>
-                <w:sz w:val="18"/>
+                <w:rFonts w:cs="Times New Roman"/>
+                <w:szCs w:val="21"/>
               </w:rPr>
               <w:t>66.8%</w:t>
             </w:r>
@@ -3535,10 +5014,15 @@
           <w:p>
             <w:pPr>
               <w:spacing w:after="0" w:line="240" w:lineRule="auto"/>
+              <w:rPr>
+                <w:rFonts w:cs="Times New Roman"/>
+                <w:szCs w:val="21"/>
+              </w:rPr>
             </w:pPr>
             <w:r>
               <w:rPr>
-                <w:sz w:val="18"/>
+                <w:rFonts w:cs="Times New Roman"/>
+                <w:szCs w:val="21"/>
               </w:rPr>
               <w:t>Headcount &lt;= 1.0</w:t>
             </w:r>
@@ -3558,10 +5042,15 @@
           <w:p>
             <w:pPr>
               <w:spacing w:after="0" w:line="240" w:lineRule="auto"/>
+              <w:rPr>
+                <w:rFonts w:cs="Times New Roman"/>
+                <w:szCs w:val="21"/>
+              </w:rPr>
             </w:pPr>
             <w:r>
               <w:rPr>
-                <w:sz w:val="18"/>
+                <w:rFonts w:cs="Times New Roman"/>
+                <w:szCs w:val="21"/>
               </w:rPr>
               <w:t>76.7%</w:t>
             </w:r>
@@ -3581,10 +5070,15 @@
           <w:p>
             <w:pPr>
               <w:spacing w:after="0" w:line="240" w:lineRule="auto"/>
+              <w:rPr>
+                <w:rFonts w:cs="Times New Roman"/>
+                <w:szCs w:val="21"/>
+              </w:rPr>
             </w:pPr>
             <w:r>
               <w:rPr>
-                <w:sz w:val="18"/>
+                <w:rFonts w:cs="Times New Roman"/>
+                <w:szCs w:val="21"/>
               </w:rPr>
               <w:t>97.2%</w:t>
             </w:r>
@@ -3604,10 +5098,15 @@
           <w:p>
             <w:pPr>
               <w:spacing w:after="0" w:line="240" w:lineRule="auto"/>
+              <w:rPr>
+                <w:rFonts w:cs="Times New Roman"/>
+                <w:szCs w:val="21"/>
+              </w:rPr>
             </w:pPr>
             <w:r>
               <w:rPr>
-                <w:sz w:val="18"/>
+                <w:rFonts w:cs="Times New Roman"/>
+                <w:szCs w:val="21"/>
               </w:rPr>
               <w:t>76.8%</w:t>
             </w:r>
@@ -3627,10 +5126,15 @@
           <w:p>
             <w:pPr>
               <w:spacing w:after="0" w:line="240" w:lineRule="auto"/>
+              <w:rPr>
+                <w:rFonts w:cs="Times New Roman"/>
+                <w:szCs w:val="21"/>
+              </w:rPr>
             </w:pPr>
             <w:r>
               <w:rPr>
-                <w:sz w:val="18"/>
+                <w:rFonts w:cs="Times New Roman"/>
+                <w:szCs w:val="21"/>
               </w:rPr>
               <w:t>85.8%</w:t>
             </w:r>
@@ -3641,32 +5145,61 @@
     <w:p>
       <w:pPr>
         <w:spacing w:after="20"/>
+        <w:rPr>
+          <w:rFonts w:cs="Times New Roman"/>
+          <w:szCs w:val="21"/>
+        </w:rPr>
       </w:pPr>
     </w:p>
     <w:p>
+      <w:pPr>
+        <w:rPr>
+          <w:rFonts w:cs="Times New Roman"/>
+          <w:szCs w:val="21"/>
+        </w:rPr>
+      </w:pPr>
       <w:r>
+        <w:rPr>
+          <w:rFonts w:cs="Times New Roman"/>
+          <w:szCs w:val="21"/>
+        </w:rPr>
         <w:t>A threshold of 0.0 is very strict and produces high precision but low recall. A threshold of 1.0 produced stronger overall metrics, but it would classify a forecast of one person as available.</w:t>
       </w:r>
     </w:p>
     <w:p>
+      <w:pPr>
+        <w:rPr>
+          <w:rFonts w:cs="Times New Roman"/>
+          <w:szCs w:val="21"/>
+        </w:rPr>
+      </w:pPr>
       <w:r>
+        <w:rPr>
+          <w:rFonts w:cs="Times New Roman"/>
+          <w:szCs w:val="21"/>
+        </w:rPr>
         <w:t>The threshold of 0.5 was retained because it provides a defensible operational definition of an effectively empty laboratory. The decision was based on the meaning of availability rather than purely on the highest F1-score.</w:t>
       </w:r>
     </w:p>
     <w:p>
       <w:pPr>
         <w:jc w:val="center"/>
+        <w:rPr>
+          <w:rFonts w:cs="Times New Roman"/>
+          <w:szCs w:val="21"/>
+        </w:rPr>
       </w:pPr>
       <w:r>
         <w:rPr>
+          <w:rFonts w:cs="Times New Roman"/>
           <w:noProof/>
-        </w:rPr>
-        <w:lastRenderedPageBreak/>
+          <w:szCs w:val="21"/>
+        </w:rPr>
         <w:drawing>
-          <wp:inline distT="0" distB="0" distL="0" distR="0" wp14:anchorId="705D8D99" wp14:editId="500E1E77">
-            <wp:extent cx="5394960" cy="3034665"/>
+          <wp:inline distT="0" distB="0" distL="0" distR="0" wp14:anchorId="1D7D4441" wp14:editId="69B03772">
+            <wp:extent cx="5486400" cy="3086100"/>
             <wp:effectExtent l="0" t="0" r="0" b="0"/>
-            <wp:docPr id="3" name="Picture 3"/>
+            <wp:docPr id="1983307954" name="Picture 1"/>
             <wp:cNvGraphicFramePr>
               <a:graphicFrameLocks xmlns:a="http://schemas.openxmlformats.org/drawingml/2006/main" noChangeAspect="1"/>
             </wp:cNvGraphicFramePr>
@@ -3674,11 +5207,11 @@
               <a:graphicData uri="http://schemas.openxmlformats.org/drawingml/2006/picture">
                 <pic:pic xmlns:pic="http://schemas.openxmlformats.org/drawingml/2006/picture">
                   <pic:nvPicPr>
-                    <pic:cNvPr id="0" name="placeholder_f1.png"/>
+                    <pic:cNvPr id="1983307954" name=""/>
                     <pic:cNvPicPr/>
                   </pic:nvPicPr>
                   <pic:blipFill>
-                    <a:blip r:embed="rId10"/>
+                    <a:blip r:embed="rId8"/>
                     <a:stretch>
                       <a:fillRect/>
                     </a:stretch>
@@ -3686,7 +5219,7 @@
                   <pic:spPr>
                     <a:xfrm>
                       <a:off x="0" y="0"/>
-                      <a:ext cx="5394960" cy="3034665"/>
+                      <a:ext cx="5486400" cy="3086100"/>
                     </a:xfrm>
                     <a:prstGeom prst="rect">
                       <a:avLst/>
@@ -3702,186 +5235,489 @@
     <w:p>
       <w:pPr>
         <w:jc w:val="center"/>
+        <w:rPr>
+          <w:rFonts w:cs="Times New Roman"/>
+          <w:szCs w:val="21"/>
+        </w:rPr>
       </w:pPr>
       <w:r>
         <w:rPr>
+          <w:rFonts w:cs="Times New Roman"/>
           <w:i/>
-          <w:sz w:val="18"/>
-        </w:rPr>
-        <w:t>Figure 3. Final-test availability F1-score for Persistence, SVR, and Ridge.</w:t>
+          <w:szCs w:val="21"/>
+        </w:rPr>
+        <w:t>Figure 3. Replace this placeholder with a bar chart comparing final-test availability F1-score for Persistence, SVR, and Ridge.</w:t>
       </w:r>
     </w:p>
     <w:p>
       <w:pPr>
         <w:pStyle w:val="Heading2"/>
+        <w:rPr>
+          <w:rFonts w:ascii="Times New Roman" w:hAnsi="Times New Roman" w:cs="Times New Roman"/>
+          <w:color w:val="auto"/>
+          <w:sz w:val="24"/>
+          <w:szCs w:val="24"/>
+        </w:rPr>
       </w:pPr>
       <w:r>
+        <w:rPr>
+          <w:rFonts w:ascii="Times New Roman" w:hAnsi="Times New Roman" w:cs="Times New Roman"/>
+          <w:color w:val="auto"/>
+          <w:sz w:val="24"/>
+          <w:szCs w:val="24"/>
+        </w:rPr>
+        <w:lastRenderedPageBreak/>
         <w:t>5.3 Model-selection conclusion</w:t>
       </w:r>
     </w:p>
     <w:p>
+      <w:pPr>
+        <w:rPr>
+          <w:rFonts w:cs="Times New Roman"/>
+          <w:szCs w:val="21"/>
+        </w:rPr>
+      </w:pPr>
       <w:r>
+        <w:rPr>
+          <w:rFonts w:cs="Times New Roman"/>
+          <w:szCs w:val="21"/>
+        </w:rPr>
         <w:t>Ridge regression was the best machine-learning model during validation, but persistence was the strongest method during the final test. The comparison shows that final model selection should not rely only on validation performance or model complexity. For the available G.25 data, a simple baseline provided the most robust final result.</w:t>
       </w:r>
     </w:p>
     <w:p>
       <w:pPr>
         <w:pStyle w:val="Heading2"/>
+        <w:rPr>
+          <w:rFonts w:ascii="Times New Roman" w:hAnsi="Times New Roman" w:cs="Times New Roman"/>
+          <w:color w:val="auto"/>
+          <w:sz w:val="24"/>
+          <w:szCs w:val="24"/>
+        </w:rPr>
       </w:pPr>
       <w:r>
+        <w:rPr>
+          <w:rFonts w:ascii="Times New Roman" w:hAnsi="Times New Roman" w:cs="Times New Roman"/>
+          <w:color w:val="auto"/>
+          <w:sz w:val="24"/>
+          <w:szCs w:val="24"/>
+        </w:rPr>
         <w:t>5.4 Computational efficiency</w:t>
       </w:r>
     </w:p>
     <w:p>
+      <w:pPr>
+        <w:rPr>
+          <w:rFonts w:cs="Times New Roman"/>
+          <w:szCs w:val="21"/>
+        </w:rPr>
+      </w:pPr>
       <w:r>
+        <w:rPr>
+          <w:rFonts w:cs="Times New Roman"/>
+          <w:szCs w:val="21"/>
+        </w:rPr>
         <w:t>Computational efficiency is relevant because a practical forecasting system should produce results quickly enough for repeated use. Persistence is computationally simple because it uses the current measurement only. Ridge regression is also efficient after training, while support-vector regression is more computationally demanding during training and hyperparameter selection.</w:t>
       </w:r>
     </w:p>
     <w:p>
+      <w:pPr>
+        <w:rPr>
+          <w:rFonts w:cs="Times New Roman"/>
+          <w:szCs w:val="21"/>
+        </w:rPr>
+      </w:pPr>
       <w:r>
+        <w:rPr>
+          <w:rFonts w:cs="Times New Roman"/>
+          <w:szCs w:val="21"/>
+        </w:rPr>
         <w:t>For the current scope, persistence has an advantage because it was both accurate and simple. A future deployment could calculate a persistence forecast immediately after each incoming sensor update. More complex models may still be justified if additional validated variables become available or the system is expanded to multiple rooms.</w:t>
       </w:r>
-    </w:p>
-    <w:p>
-      <w:pPr>
-        <w:pStyle w:val="Heading2"/>
-      </w:pPr>
       <w:r>
+        <w:rPr>
+          <w:rFonts w:cs="Times New Roman"/>
+          <w:szCs w:val="24"/>
+        </w:rPr>
         <w:t>5.5 Operational comparison</w:t>
       </w:r>
     </w:p>
     <w:p>
+      <w:pPr>
+        <w:pStyle w:val="Heading2"/>
+        <w:rPr>
+          <w:rFonts w:ascii="Times New Roman" w:eastAsiaTheme="minorEastAsia" w:hAnsi="Times New Roman" w:cs="Times New Roman"/>
+          <w:b w:val="0"/>
+          <w:bCs w:val="0"/>
+          <w:color w:val="auto"/>
+          <w:sz w:val="21"/>
+          <w:szCs w:val="21"/>
+        </w:rPr>
+      </w:pPr>
       <w:r>
+        <w:rPr>
+          <w:rFonts w:ascii="Times New Roman" w:eastAsiaTheme="minorEastAsia" w:hAnsi="Times New Roman" w:cs="Times New Roman"/>
+          <w:b w:val="0"/>
+          <w:bCs w:val="0"/>
+          <w:color w:val="auto"/>
+          <w:sz w:val="21"/>
+          <w:szCs w:val="21"/>
+        </w:rPr>
         <w:t>The comparison produced two conclusions. Ridge regression was the strongest machine-learning model during validation, demonstrating that recent history and calendar features can be used to forecast future sensor-derived headcount. Persistence was stronger on the final test, showing that a simple baseline can be more robust when room behaviour changes over time.</w:t>
       </w:r>
     </w:p>
+    <w:p/>
+    <w:p/>
+    <w:p/>
     <w:p>
       <w:pPr>
         <w:pStyle w:val="Heading1"/>
+        <w:rPr>
+          <w:rFonts w:ascii="Times New Roman" w:hAnsi="Times New Roman" w:cs="Times New Roman"/>
+          <w:color w:val="auto"/>
+        </w:rPr>
       </w:pPr>
       <w:r>
-        <w:lastRenderedPageBreak/>
+        <w:rPr>
+          <w:rFonts w:ascii="Times New Roman" w:hAnsi="Times New Roman" w:cs="Times New Roman"/>
+          <w:color w:val="auto"/>
+        </w:rPr>
         <w:t>6. Engineering interpretation and limitations</w:t>
       </w:r>
     </w:p>
     <w:p>
+      <w:pPr>
+        <w:rPr>
+          <w:rFonts w:cs="Times New Roman"/>
+          <w:szCs w:val="21"/>
+        </w:rPr>
+      </w:pPr>
       <w:r>
+        <w:rPr>
+          <w:rFonts w:cs="Times New Roman"/>
+          <w:szCs w:val="21"/>
+        </w:rPr>
         <w:t>From an engineering perspective, the results demonstrate that very short-term occupancy forecasting is dominated by temporal persistence. Laboratory occupancy often changes gradually over 15-minute periods, meaning that the current occupancy state is already a strong predictor of near-future conditions.</w:t>
       </w:r>
     </w:p>
     <w:p>
+      <w:pPr>
+        <w:rPr>
+          <w:rFonts w:cs="Times New Roman"/>
+          <w:szCs w:val="21"/>
+        </w:rPr>
+      </w:pPr>
       <w:r>
+        <w:rPr>
+          <w:rFonts w:cs="Times New Roman"/>
+          <w:szCs w:val="21"/>
+        </w:rPr>
         <w:t>The ridge availability classifier achieved high precision, making it potentially useful as a cautious advisory system. Its lower recall means that some opportunities to use an empty laboratory will be missed. The result should therefore be interpreted as conservative decision support rather than a guarantee of room availability.</w:t>
       </w:r>
     </w:p>
     <w:p>
+      <w:pPr>
+        <w:rPr>
+          <w:rFonts w:cs="Times New Roman"/>
+          <w:szCs w:val="21"/>
+        </w:rPr>
+      </w:pPr>
       <w:r>
+        <w:rPr>
+          <w:rFonts w:cs="Times New Roman"/>
+          <w:szCs w:val="21"/>
+        </w:rPr>
+        <w:lastRenderedPageBreak/>
         <w:t>Several limitations should be acknowledged. Only one laboratory was analysed, there was no independently verified ground-truth occupancy, the data contained a 21.6-hour sensor outage, booking data were unavailable, environmental-sensor co-location was not verified, and occupancy history cannot anticipate scheduled teaching events or spontaneous group arrivals.</w:t>
       </w:r>
     </w:p>
     <w:p>
+      <w:pPr>
+        <w:rPr>
+          <w:rFonts w:cs="Times New Roman"/>
+          <w:szCs w:val="21"/>
+          <w:lang w:val="en-AU"/>
+        </w:rPr>
+      </w:pPr>
       <w:r>
+        <w:rPr>
+          <w:rFonts w:cs="Times New Roman"/>
+          <w:szCs w:val="21"/>
+        </w:rPr>
         <w:t>Future work could incorporate validated booking schedules, manual occupancy checks, multiple rooms, verified co-located environmental sensors, and transition-aware forecasting methods. These improvements should be evaluated using the same chronological validation approach before operational claims are expanded.</w:t>
       </w:r>
     </w:p>
     <w:p>
       <w:pPr>
         <w:pStyle w:val="Heading1"/>
+        <w:rPr>
+          <w:rFonts w:ascii="Times New Roman" w:hAnsi="Times New Roman" w:cs="Times New Roman"/>
+          <w:color w:val="auto"/>
+        </w:rPr>
       </w:pPr>
       <w:r>
+        <w:rPr>
+          <w:rFonts w:ascii="Times New Roman" w:hAnsi="Times New Roman" w:cs="Times New Roman"/>
+          <w:color w:val="auto"/>
+        </w:rPr>
         <w:t>7. Reproducibility, ethics and AI use</w:t>
       </w:r>
     </w:p>
     <w:p>
+      <w:pPr>
+        <w:rPr>
+          <w:rFonts w:cs="Times New Roman"/>
+          <w:szCs w:val="21"/>
+        </w:rPr>
+      </w:pPr>
       <w:r>
+        <w:rPr>
+          <w:rFonts w:cs="Times New Roman"/>
+          <w:szCs w:val="21"/>
+        </w:rPr>
         <w:t>Reproducibility was a primary design objective. The repository includes the source code, requirements, runbook, data dictionary, automated tests, HTML documentation, result files, and licence required to reproduce the workflow for authorised users with access to the supplied raw data. Raw sensor data were excluded from version control because they may be subject to licensing or privacy restrictions.</w:t>
       </w:r>
     </w:p>
     <w:p>
+      <w:pPr>
+        <w:rPr>
+          <w:rFonts w:cs="Times New Roman"/>
+          <w:szCs w:val="21"/>
+        </w:rPr>
+      </w:pPr>
       <w:r>
+        <w:rPr>
+          <w:rFonts w:cs="Times New Roman"/>
+          <w:szCs w:val="21"/>
+        </w:rPr>
         <w:t>Ethical considerations relate to privacy and responsible data use. Although the supplied occupancy information contains no direct personal identifiers, aggregate occupancy patterns could still reveal building-use behaviour. The analysis was therefore limited to room-level forecasting and should not be used to monitor individuals.</w:t>
       </w:r>
     </w:p>
     <w:p>
+      <w:pPr>
+        <w:rPr>
+          <w:rFonts w:cs="Times New Roman"/>
+          <w:szCs w:val="21"/>
+        </w:rPr>
+      </w:pPr>
       <w:r>
+        <w:rPr>
+          <w:rFonts w:cs="Times New Roman"/>
+          <w:szCs w:val="21"/>
+        </w:rPr>
         <w:t>OpenAI Codex assisted with planning, code drafting, debugging, repository organisation, and documentation support. I independently checked the G.25 mapping, data audit, chronological validation design, generated figures, model metrics, sensitivity results, and the six automated tests. I selected the final scope, forecast horizons, availability threshold, and engineering claims.</w:t>
       </w:r>
     </w:p>
     <w:p>
+      <w:pPr>
+        <w:rPr>
+          <w:rFonts w:cs="Times New Roman"/>
+          <w:szCs w:val="21"/>
+        </w:rPr>
+      </w:pPr>
       <w:r>
-        <w:lastRenderedPageBreak/>
+        <w:rPr>
+          <w:rFonts w:cs="Times New Roman"/>
+          <w:szCs w:val="21"/>
+        </w:rPr>
         <w:t>AI suggestions were checked before inclusion. For example, local Melbourne time was used for calendar features because UTC would shift weekday and time-of-day patterns. The sensitivity analysis was rerun after this correction. Environmental predictors were rejected because the supplied metadata did not prove co-location with G.25. The detailed AI-use record is provided in docs/AI_USAGE.md.</w:t>
       </w:r>
     </w:p>
     <w:p>
+      <w:pPr>
+        <w:rPr>
+          <w:rFonts w:cs="Times New Roman"/>
+          <w:szCs w:val="21"/>
+        </w:rPr>
+      </w:pPr>
       <w:r>
+        <w:rPr>
+          <w:rFonts w:cs="Times New Roman"/>
+          <w:szCs w:val="21"/>
+        </w:rPr>
         <w:br w:type="page"/>
       </w:r>
     </w:p>
     <w:p>
       <w:pPr>
         <w:pStyle w:val="Heading1"/>
+        <w:rPr>
+          <w:rFonts w:ascii="Times New Roman" w:hAnsi="Times New Roman" w:cs="Times New Roman"/>
+          <w:color w:val="auto"/>
+        </w:rPr>
       </w:pPr>
       <w:r>
+        <w:rPr>
+          <w:rFonts w:ascii="Times New Roman" w:hAnsi="Times New Roman" w:cs="Times New Roman"/>
+          <w:color w:val="auto"/>
+        </w:rPr>
         <w:lastRenderedPageBreak/>
         <w:t>References</w:t>
       </w:r>
     </w:p>
     <w:p>
+      <w:pPr>
+        <w:rPr>
+          <w:rFonts w:cs="Times New Roman"/>
+          <w:szCs w:val="21"/>
+        </w:rPr>
+      </w:pPr>
       <w:r>
+        <w:rPr>
+          <w:rFonts w:cs="Times New Roman"/>
+          <w:szCs w:val="21"/>
+        </w:rPr>
         <w:t>Candanedo, L. M., &amp; Feldheim, V. (2016). Accurate occupancy detection of an office room from light, temperature, humidity and CO2 measurements using statistical learning models. Energy and Buildings, 112, 28-39. https://doi.org/10.1016/j.enbuild.2015.11.071</w:t>
       </w:r>
     </w:p>
     <w:p>
+      <w:pPr>
+        <w:rPr>
+          <w:rFonts w:cs="Times New Roman"/>
+          <w:szCs w:val="21"/>
+        </w:rPr>
+      </w:pPr>
       <w:r>
+        <w:rPr>
+          <w:rFonts w:cs="Times New Roman"/>
+          <w:szCs w:val="21"/>
+        </w:rPr>
         <w:t>Hastie, T., Tibshirani, R., &amp; Friedman, J. (2009). The elements of statistical learning: Data mining, inference, and prediction (2nd ed.). Springer. https://doi.org/10.1007/978-0-387-84858-7</w:t>
       </w:r>
     </w:p>
     <w:p>
+      <w:pPr>
+        <w:rPr>
+          <w:rFonts w:cs="Times New Roman"/>
+          <w:szCs w:val="21"/>
+        </w:rPr>
+      </w:pPr>
       <w:r>
+        <w:rPr>
+          <w:rFonts w:cs="Times New Roman"/>
+          <w:szCs w:val="21"/>
+        </w:rPr>
         <w:t>Hyndman, R. J., &amp; Athanasopoulos, G. (2021). Forecasting: Principles and practice (3rd ed.). OTexts. https://otexts.com/fpp3/</w:t>
       </w:r>
     </w:p>
     <w:p>
+      <w:pPr>
+        <w:rPr>
+          <w:rFonts w:cs="Times New Roman"/>
+          <w:szCs w:val="21"/>
+        </w:rPr>
+      </w:pPr>
       <w:r>
+        <w:rPr>
+          <w:rFonts w:cs="Times New Roman"/>
+          <w:szCs w:val="21"/>
+        </w:rPr>
         <w:t>James, G., Witten, D., Hastie, T., &amp; Tibshirani, R. (2021). An introduction to statistical learning: With applications in R (2nd ed.). Springer. https://doi.org/10.1007/978-1-0716-1418-1</w:t>
       </w:r>
     </w:p>
     <w:p>
+      <w:pPr>
+        <w:rPr>
+          <w:rFonts w:cs="Times New Roman"/>
+          <w:szCs w:val="21"/>
+        </w:rPr>
+      </w:pPr>
       <w:r>
+        <w:rPr>
+          <w:rFonts w:cs="Times New Roman"/>
+          <w:szCs w:val="21"/>
+        </w:rPr>
         <w:t>Monash University. (2026a). MMA3001 numerical methods and machine learning: Project brief. Department of Mechanical and Aerospace Engineering.</w:t>
       </w:r>
     </w:p>
     <w:p>
+      <w:pPr>
+        <w:rPr>
+          <w:rFonts w:cs="Times New Roman"/>
+          <w:szCs w:val="21"/>
+        </w:rPr>
+      </w:pPr>
       <w:r>
+        <w:rPr>
+          <w:rFonts w:cs="Times New Roman"/>
+          <w:szCs w:val="21"/>
+        </w:rPr>
         <w:t>Monash University. (2026b). Occupancy and environmental sensor dataset, May-December 2024 [Data set]. Department of Mechanical and Aerospace Engineering.</w:t>
       </w:r>
     </w:p>
     <w:p>
+      <w:pPr>
+        <w:rPr>
+          <w:rFonts w:cs="Times New Roman"/>
+          <w:szCs w:val="21"/>
+        </w:rPr>
+      </w:pPr>
       <w:r>
+        <w:rPr>
+          <w:rFonts w:cs="Times New Roman"/>
+          <w:szCs w:val="21"/>
+        </w:rPr>
         <w:t>Monash University. (2026c). Sensor ID and locations [Data set documentation]. Department of Mechanical and Aerospace Engineering.</w:t>
       </w:r>
     </w:p>
     <w:p>
+      <w:pPr>
+        <w:rPr>
+          <w:rFonts w:cs="Times New Roman"/>
+          <w:szCs w:val="21"/>
+        </w:rPr>
+      </w:pPr>
       <w:r>
+        <w:rPr>
+          <w:rFonts w:cs="Times New Roman"/>
+          <w:szCs w:val="21"/>
+        </w:rPr>
         <w:t>Pedregosa, F., Varoquaux, G., Gramfort, A., Michel, V., Thirion, B., Grisel, O., Blondel, M., Prettenhofer, P., Weiss, R., Dubourg, V., VanderPlas, J., Passos, A., Cournapeau, D., Brucher, M., Perrot, M., &amp; Duchesnay, E. (2011). Scikit-learn: Machine learning in Python. Journal of Machine Learning Research, 12, 2825-2830.</w:t>
       </w:r>
     </w:p>
     <w:p>
+      <w:pPr>
+        <w:rPr>
+          <w:rFonts w:cs="Times New Roman"/>
+          <w:szCs w:val="21"/>
+        </w:rPr>
+      </w:pPr>
       <w:r>
+        <w:rPr>
+          <w:rFonts w:cs="Times New Roman"/>
+          <w:szCs w:val="21"/>
+        </w:rPr>
         <w:t>Scikit-learn Developers. (n.d.). Scikit-learn user guide. https://scikit-learn.org/stable/</w:t>
       </w:r>
     </w:p>
     <w:p>
+      <w:pPr>
+        <w:rPr>
+          <w:rFonts w:cs="Times New Roman"/>
+          <w:szCs w:val="21"/>
+        </w:rPr>
+      </w:pPr>
       <w:r>
+        <w:rPr>
+          <w:rFonts w:cs="Times New Roman"/>
+          <w:szCs w:val="21"/>
+        </w:rPr>
         <w:br w:type="page"/>
       </w:r>
     </w:p>
     <w:p>
       <w:pPr>
         <w:pStyle w:val="Heading1"/>
+        <w:rPr>
+          <w:rFonts w:ascii="Times New Roman" w:hAnsi="Times New Roman" w:cs="Times New Roman"/>
+          <w:color w:val="auto"/>
+        </w:rPr>
       </w:pPr>
       <w:r>
+        <w:rPr>
+          <w:rFonts w:ascii="Times New Roman" w:hAnsi="Times New Roman" w:cs="Times New Roman"/>
+          <w:color w:val="auto"/>
+        </w:rPr>
         <w:lastRenderedPageBreak/>
         <w:t>Appendix A: Repository evidence</w:t>
       </w:r>
@@ -3914,11 +5750,16 @@
           <w:p>
             <w:pPr>
               <w:spacing w:after="0" w:line="240" w:lineRule="auto"/>
+              <w:rPr>
+                <w:rFonts w:cs="Times New Roman"/>
+                <w:szCs w:val="21"/>
+              </w:rPr>
             </w:pPr>
             <w:r>
               <w:rPr>
+                <w:rFonts w:cs="Times New Roman"/>
                 <w:b/>
-                <w:sz w:val="18"/>
+                <w:szCs w:val="21"/>
               </w:rPr>
               <w:t>File or location</w:t>
             </w:r>
@@ -3938,11 +5779,16 @@
           <w:p>
             <w:pPr>
               <w:spacing w:after="0" w:line="240" w:lineRule="auto"/>
+              <w:rPr>
+                <w:rFonts w:cs="Times New Roman"/>
+                <w:szCs w:val="21"/>
+              </w:rPr>
             </w:pPr>
             <w:r>
               <w:rPr>
+                <w:rFonts w:cs="Times New Roman"/>
                 <w:b/>
-                <w:sz w:val="18"/>
+                <w:szCs w:val="21"/>
               </w:rPr>
               <w:t>Purpose</w:t>
             </w:r>
@@ -3967,10 +5813,15 @@
           <w:p>
             <w:pPr>
               <w:spacing w:after="0" w:line="240" w:lineRule="auto"/>
+              <w:rPr>
+                <w:rFonts w:cs="Times New Roman"/>
+                <w:szCs w:val="21"/>
+              </w:rPr>
             </w:pPr>
             <w:r>
               <w:rPr>
-                <w:sz w:val="18"/>
+                <w:rFonts w:cs="Times New Roman"/>
+                <w:szCs w:val="21"/>
               </w:rPr>
               <w:t>src/occupancy/pipeline.py</w:t>
             </w:r>
@@ -3990,10 +5841,15 @@
           <w:p>
             <w:pPr>
               <w:spacing w:after="0" w:line="240" w:lineRule="auto"/>
+              <w:rPr>
+                <w:rFonts w:cs="Times New Roman"/>
+                <w:szCs w:val="21"/>
+              </w:rPr>
             </w:pPr>
             <w:r>
               <w:rPr>
-                <w:sz w:val="18"/>
+                <w:rFonts w:cs="Times New Roman"/>
+                <w:szCs w:val="21"/>
               </w:rPr>
               <w:t>Complete forecasting pipeline</w:t>
             </w:r>
@@ -4018,10 +5874,15 @@
           <w:p>
             <w:pPr>
               <w:spacing w:after="0" w:line="240" w:lineRule="auto"/>
+              <w:rPr>
+                <w:rFonts w:cs="Times New Roman"/>
+                <w:szCs w:val="21"/>
+              </w:rPr>
             </w:pPr>
             <w:r>
               <w:rPr>
-                <w:sz w:val="18"/>
+                <w:rFonts w:cs="Times New Roman"/>
+                <w:szCs w:val="21"/>
               </w:rPr>
               <w:t>src/occupancy/features.py</w:t>
             </w:r>
@@ -4041,10 +5902,15 @@
           <w:p>
             <w:pPr>
               <w:spacing w:after="0" w:line="240" w:lineRule="auto"/>
+              <w:rPr>
+                <w:rFonts w:cs="Times New Roman"/>
+                <w:szCs w:val="21"/>
+              </w:rPr>
             </w:pPr>
             <w:r>
               <w:rPr>
-                <w:sz w:val="18"/>
+                <w:rFonts w:cs="Times New Roman"/>
+                <w:szCs w:val="21"/>
               </w:rPr>
               <w:t>Feature engineering</w:t>
             </w:r>
@@ -4069,10 +5935,15 @@
           <w:p>
             <w:pPr>
               <w:spacing w:after="0" w:line="240" w:lineRule="auto"/>
+              <w:rPr>
+                <w:rFonts w:cs="Times New Roman"/>
+                <w:szCs w:val="21"/>
+              </w:rPr>
             </w:pPr>
             <w:r>
               <w:rPr>
-                <w:sz w:val="18"/>
+                <w:rFonts w:cs="Times New Roman"/>
+                <w:szCs w:val="21"/>
               </w:rPr>
               <w:t>src/occupancy/models.py</w:t>
             </w:r>
@@ -4092,10 +5963,15 @@
           <w:p>
             <w:pPr>
               <w:spacing w:after="0" w:line="240" w:lineRule="auto"/>
+              <w:rPr>
+                <w:rFonts w:cs="Times New Roman"/>
+                <w:szCs w:val="21"/>
+              </w:rPr>
             </w:pPr>
             <w:r>
               <w:rPr>
-                <w:sz w:val="18"/>
+                <w:rFonts w:cs="Times New Roman"/>
+                <w:szCs w:val="21"/>
               </w:rPr>
               <w:t>Model training and evaluation</w:t>
             </w:r>
@@ -4120,10 +5996,15 @@
           <w:p>
             <w:pPr>
               <w:spacing w:after="0" w:line="240" w:lineRule="auto"/>
+              <w:rPr>
+                <w:rFonts w:cs="Times New Roman"/>
+                <w:szCs w:val="21"/>
+              </w:rPr>
             </w:pPr>
             <w:r>
               <w:rPr>
-                <w:sz w:val="18"/>
+                <w:rFonts w:cs="Times New Roman"/>
+                <w:szCs w:val="21"/>
               </w:rPr>
               <w:t>src/occupancy/data.py</w:t>
             </w:r>
@@ -4143,10 +6024,15 @@
           <w:p>
             <w:pPr>
               <w:spacing w:after="0" w:line="240" w:lineRule="auto"/>
+              <w:rPr>
+                <w:rFonts w:cs="Times New Roman"/>
+                <w:szCs w:val="21"/>
+              </w:rPr>
             </w:pPr>
             <w:r>
               <w:rPr>
-                <w:sz w:val="18"/>
+                <w:rFonts w:cs="Times New Roman"/>
+                <w:szCs w:val="21"/>
               </w:rPr>
               <w:t>Dataset auditing and preparation</w:t>
             </w:r>
@@ -4171,10 +6057,15 @@
           <w:p>
             <w:pPr>
               <w:spacing w:after="0" w:line="240" w:lineRule="auto"/>
+              <w:rPr>
+                <w:rFonts w:cs="Times New Roman"/>
+                <w:szCs w:val="21"/>
+              </w:rPr>
             </w:pPr>
             <w:r>
               <w:rPr>
-                <w:sz w:val="18"/>
+                <w:rFonts w:cs="Times New Roman"/>
+                <w:szCs w:val="21"/>
               </w:rPr>
               <w:t>src/occupancy/sensitivity.py</w:t>
             </w:r>
@@ -4194,10 +6085,15 @@
           <w:p>
             <w:pPr>
               <w:spacing w:after="0" w:line="240" w:lineRule="auto"/>
+              <w:rPr>
+                <w:rFonts w:cs="Times New Roman"/>
+                <w:szCs w:val="21"/>
+              </w:rPr>
             </w:pPr>
             <w:r>
               <w:rPr>
-                <w:sz w:val="18"/>
+                <w:rFonts w:cs="Times New Roman"/>
+                <w:szCs w:val="21"/>
               </w:rPr>
               <w:t>Forecast-horizon and threshold sensitivity analysis</w:t>
             </w:r>
@@ -4222,10 +6118,15 @@
           <w:p>
             <w:pPr>
               <w:spacing w:after="0" w:line="240" w:lineRule="auto"/>
+              <w:rPr>
+                <w:rFonts w:cs="Times New Roman"/>
+                <w:szCs w:val="21"/>
+              </w:rPr>
             </w:pPr>
             <w:r>
               <w:rPr>
-                <w:sz w:val="18"/>
+                <w:rFonts w:cs="Times New Roman"/>
+                <w:szCs w:val="21"/>
               </w:rPr>
               <w:t>README.md</w:t>
             </w:r>
@@ -4245,10 +6146,15 @@
           <w:p>
             <w:pPr>
               <w:spacing w:after="0" w:line="240" w:lineRule="auto"/>
+              <w:rPr>
+                <w:rFonts w:cs="Times New Roman"/>
+                <w:szCs w:val="21"/>
+              </w:rPr>
             </w:pPr>
             <w:r>
               <w:rPr>
-                <w:sz w:val="18"/>
+                <w:rFonts w:cs="Times New Roman"/>
+                <w:szCs w:val="21"/>
               </w:rPr>
               <w:t>Project overview and setup</w:t>
             </w:r>
@@ -4273,10 +6179,15 @@
           <w:p>
             <w:pPr>
               <w:spacing w:after="0" w:line="240" w:lineRule="auto"/>
+              <w:rPr>
+                <w:rFonts w:cs="Times New Roman"/>
+                <w:szCs w:val="21"/>
+              </w:rPr>
             </w:pPr>
             <w:r>
               <w:rPr>
-                <w:sz w:val="18"/>
+                <w:rFonts w:cs="Times New Roman"/>
+                <w:szCs w:val="21"/>
               </w:rPr>
               <w:t>docs/RUNBOOK.md</w:t>
             </w:r>
@@ -4296,10 +6207,15 @@
           <w:p>
             <w:pPr>
               <w:spacing w:after="0" w:line="240" w:lineRule="auto"/>
+              <w:rPr>
+                <w:rFonts w:cs="Times New Roman"/>
+                <w:szCs w:val="21"/>
+              </w:rPr>
             </w:pPr>
             <w:r>
               <w:rPr>
-                <w:sz w:val="18"/>
+                <w:rFonts w:cs="Times New Roman"/>
+                <w:szCs w:val="21"/>
               </w:rPr>
               <w:t>Execution instructions</w:t>
             </w:r>
@@ -4324,10 +6240,15 @@
           <w:p>
             <w:pPr>
               <w:spacing w:after="0" w:line="240" w:lineRule="auto"/>
+              <w:rPr>
+                <w:rFonts w:cs="Times New Roman"/>
+                <w:szCs w:val="21"/>
+              </w:rPr>
             </w:pPr>
             <w:r>
               <w:rPr>
-                <w:sz w:val="18"/>
+                <w:rFonts w:cs="Times New Roman"/>
+                <w:szCs w:val="21"/>
               </w:rPr>
               <w:t>docs/DATA_AUDIT.md</w:t>
             </w:r>
@@ -4347,10 +6268,15 @@
           <w:p>
             <w:pPr>
               <w:spacing w:after="0" w:line="240" w:lineRule="auto"/>
+              <w:rPr>
+                <w:rFonts w:cs="Times New Roman"/>
+                <w:szCs w:val="21"/>
+              </w:rPr>
             </w:pPr>
             <w:r>
               <w:rPr>
-                <w:sz w:val="18"/>
+                <w:rFonts w:cs="Times New Roman"/>
+                <w:szCs w:val="21"/>
               </w:rPr>
               <w:t>Data quality assessment</w:t>
             </w:r>
@@ -4375,10 +6301,15 @@
           <w:p>
             <w:pPr>
               <w:spacing w:after="0" w:line="240" w:lineRule="auto"/>
+              <w:rPr>
+                <w:rFonts w:cs="Times New Roman"/>
+                <w:szCs w:val="21"/>
+              </w:rPr>
             </w:pPr>
             <w:r>
               <w:rPr>
-                <w:sz w:val="18"/>
+                <w:rFonts w:cs="Times New Roman"/>
+                <w:szCs w:val="21"/>
               </w:rPr>
               <w:t>docs/AI_USAGE.md</w:t>
             </w:r>
@@ -4398,10 +6329,15 @@
           <w:p>
             <w:pPr>
               <w:spacing w:after="0" w:line="240" w:lineRule="auto"/>
+              <w:rPr>
+                <w:rFonts w:cs="Times New Roman"/>
+                <w:szCs w:val="21"/>
+              </w:rPr>
             </w:pPr>
             <w:r>
               <w:rPr>
-                <w:sz w:val="18"/>
+                <w:rFonts w:cs="Times New Roman"/>
+                <w:szCs w:val="21"/>
               </w:rPr>
               <w:t>AI disclosure</w:t>
             </w:r>
@@ -4426,10 +6362,15 @@
           <w:p>
             <w:pPr>
               <w:spacing w:after="0" w:line="240" w:lineRule="auto"/>
+              <w:rPr>
+                <w:rFonts w:cs="Times New Roman"/>
+                <w:szCs w:val="21"/>
+              </w:rPr>
             </w:pPr>
             <w:r>
               <w:rPr>
-                <w:sz w:val="18"/>
+                <w:rFonts w:cs="Times New Roman"/>
+                <w:szCs w:val="21"/>
               </w:rPr>
               <w:t>docs/html/</w:t>
             </w:r>
@@ -4449,10 +6390,15 @@
           <w:p>
             <w:pPr>
               <w:spacing w:after="0" w:line="240" w:lineRule="auto"/>
+              <w:rPr>
+                <w:rFonts w:cs="Times New Roman"/>
+                <w:szCs w:val="21"/>
+              </w:rPr>
             </w:pPr>
             <w:r>
               <w:rPr>
-                <w:sz w:val="18"/>
+                <w:rFonts w:cs="Times New Roman"/>
+                <w:szCs w:val="21"/>
               </w:rPr>
               <w:t>HTML API documentation</w:t>
             </w:r>
@@ -4477,10 +6423,15 @@
           <w:p>
             <w:pPr>
               <w:spacing w:after="0" w:line="240" w:lineRule="auto"/>
+              <w:rPr>
+                <w:rFonts w:cs="Times New Roman"/>
+                <w:szCs w:val="21"/>
+              </w:rPr>
             </w:pPr>
             <w:r>
               <w:rPr>
-                <w:sz w:val="18"/>
+                <w:rFonts w:cs="Times New Roman"/>
+                <w:szCs w:val="21"/>
               </w:rPr>
               <w:t>results/</w:t>
             </w:r>
@@ -4500,10 +6451,15 @@
           <w:p>
             <w:pPr>
               <w:spacing w:after="0" w:line="240" w:lineRule="auto"/>
+              <w:rPr>
+                <w:rFonts w:cs="Times New Roman"/>
+                <w:szCs w:val="21"/>
+              </w:rPr>
             </w:pPr>
             <w:r>
               <w:rPr>
-                <w:sz w:val="18"/>
+                <w:rFonts w:cs="Times New Roman"/>
+                <w:szCs w:val="21"/>
               </w:rPr>
               <w:t>Metrics, figures, and test report</w:t>
             </w:r>
@@ -4514,15 +6470,38 @@
     <w:p>
       <w:pPr>
         <w:spacing w:after="20"/>
+        <w:rPr>
+          <w:rFonts w:cs="Times New Roman"/>
+          <w:szCs w:val="21"/>
+        </w:rPr>
       </w:pPr>
     </w:p>
     <w:p>
+      <w:pPr>
+        <w:rPr>
+          <w:rFonts w:cs="Times New Roman"/>
+          <w:szCs w:val="21"/>
+        </w:rPr>
+      </w:pPr>
       <w:r>
+        <w:rPr>
+          <w:rFonts w:cs="Times New Roman"/>
+          <w:szCs w:val="21"/>
+        </w:rPr>
         <w:t>The repository contains six automated tests covering resampling correctness, future-target alignment, chronological splitting, regression metric calculations, availability-threshold calculations, and a synthetic end-to-end workflow. All tests pass.</w:t>
       </w:r>
     </w:p>
+    <w:p>
+      <w:pPr>
+        <w:rPr>
+          <w:rFonts w:cs="Times New Roman"/>
+          <w:szCs w:val="21"/>
+        </w:rPr>
+      </w:pPr>
+    </w:p>
+    <w:p/>
     <w:sectPr>
-      <w:footerReference w:type="default" r:id="rId11"/>
+      <w:footerReference w:type="default" r:id="rId10"/>
       <w:pgSz w:w="12240" w:h="15840"/>
       <w:pgMar w:top="1037" w:right="1181" w:bottom="1037" w:left="1181" w:header="720" w:footer="720" w:gutter="0"/>
       <w:cols w:space="720"/>

</xml_diff>

<commit_message>
Update final report revision
</commit_message>
<xml_diff>
--- a/report/MMA3001_Laboratory_Availability_Report.docx
+++ b/report/MMA3001_Laboratory_Availability_Report.docx
@@ -16,10 +16,7 @@
           <w:lang w:val="en-AU"/>
         </w:rPr>
       </w:pPr>
-    </w:p>
-    <w:p>
-      <w:pPr>
-        <w:jc w:val="center"/>
+      <w:r>
         <w:rPr>
           <w:rFonts w:eastAsiaTheme="majorEastAsia" w:cs="Times New Roman"/>
           <w:b/>
@@ -30,33 +27,6 @@
           <w:szCs w:val="36"/>
           <w:lang w:val="en-AU"/>
         </w:rPr>
-      </w:pPr>
-    </w:p>
-    <w:p>
-      <w:pPr>
-        <w:jc w:val="center"/>
-        <w:rPr>
-          <w:rFonts w:eastAsiaTheme="majorEastAsia" w:cs="Times New Roman"/>
-          <w:b/>
-          <w:bCs/>
-          <w:spacing w:val="5"/>
-          <w:kern w:val="28"/>
-          <w:sz w:val="36"/>
-          <w:szCs w:val="36"/>
-          <w:lang w:val="en-AU"/>
-        </w:rPr>
-      </w:pPr>
-      <w:r>
-        <w:rPr>
-          <w:rFonts w:eastAsiaTheme="majorEastAsia" w:cs="Times New Roman"/>
-          <w:b/>
-          <w:bCs/>
-          <w:spacing w:val="5"/>
-          <w:kern w:val="28"/>
-          <w:sz w:val="36"/>
-          <w:szCs w:val="36"/>
-          <w:lang w:val="en-AU"/>
-        </w:rPr>
         <w:t>Smart Laboratory Availability Forecasting Project</w:t>
       </w:r>
     </w:p>
@@ -89,6 +59,39 @@
         <w:br/>
         <w:t>Elvis Abraham Mathew (34978674)</w:t>
       </w:r>
+      <w:r>
+        <w:rPr>
+          <w:rFonts w:cs="Times New Roman"/>
+          <w:b/>
+          <w:bCs/>
+          <w:szCs w:val="24"/>
+        </w:rPr>
+        <w:br/>
+      </w:r>
+      <w:hyperlink r:id="rId8" w:history="1">
+        <w:r>
+          <w:rPr>
+            <w:rStyle w:val="Hyperlink"/>
+            <w:rFonts w:cs="Times New Roman"/>
+            <w:b/>
+            <w:bCs/>
+            <w:sz w:val="20"/>
+            <w:szCs w:val="20"/>
+          </w:rPr>
+          <w:t>https://github.com/elvisabrahammathew/MONASH_SMART_INFRA.git</w:t>
+        </w:r>
+      </w:hyperlink>
+    </w:p>
+    <w:p>
+      <w:pPr>
+        <w:jc w:val="center"/>
+        <w:rPr>
+          <w:rFonts w:cs="Times New Roman"/>
+          <w:b/>
+          <w:bCs/>
+          <w:szCs w:val="24"/>
+        </w:rPr>
+      </w:pPr>
     </w:p>
     <w:p>
       <w:pPr>
@@ -340,7 +343,23 @@
           <w:rFonts w:cs="Times New Roman"/>
           <w:szCs w:val="21"/>
         </w:rPr>
-        <w:t>Ridge regression achieved the strongest validation mean absolute error (MAE) of 1.080 people and was selected before the final test. However, the persistence baseline achieved the best final-test MAE of 0.461 people, indicating that recent occupancy was more reliable than the trained models during the held-out period. The selected ridge model achieved 64.6% availability accuracy, 88.1% precision, 53.8% recall, and 66.8% F1-score. The system should therefore be treated as a cautious advisory tool rather than a booking system or confirmation that a laboratory is empty.</w:t>
+        <w:t xml:space="preserve">Ridge regression achieved the strongest validation </w:t>
+      </w:r>
+      <w:proofErr w:type="gramStart"/>
+      <w:r>
+        <w:rPr>
+          <w:rFonts w:cs="Times New Roman"/>
+          <w:szCs w:val="21"/>
+        </w:rPr>
+        <w:t>mean</w:t>
+      </w:r>
+      <w:proofErr w:type="gramEnd"/>
+      <w:r>
+        <w:rPr>
+          <w:rFonts w:cs="Times New Roman"/>
+          <w:szCs w:val="21"/>
+        </w:rPr>
+        <w:t xml:space="preserve"> absolute error (MAE) of 1.080 people and was selected before the final test. However, the persistence baseline achieved the best final-test MAE of 0.461 people, indicating that recent occupancy was more reliable than the trained models during the held-out period. The selected ridge model achieved 64.6% availability accuracy, 88.1% precision, 53.8% recall, and 66.8% F1-score. The system should therefore be treated as a cautious advisory tool rather than a booking system or confirmation that a laboratory is empty.</w:t>
       </w:r>
     </w:p>
     <w:p>
@@ -521,7 +540,23 @@
           <w:rFonts w:cs="Times New Roman"/>
           <w:szCs w:val="21"/>
         </w:rPr>
-        <w:t>The main input used in the final analysis was the occupancy-sensor dataset. Each observation represented a sensor-derived estimate of occupancy at a particular time. The accompanying metadata were used to identify the sensor associated with G.25, Keenan Lab.</w:t>
+        <w:t xml:space="preserve">The main input used in the final analysis was the occupancy-sensor dataset. Each observation represented a sensor-derived estimate of occupancy at a particular time. The accompanying metadata </w:t>
+      </w:r>
+      <w:proofErr w:type="gramStart"/>
+      <w:r>
+        <w:rPr>
+          <w:rFonts w:cs="Times New Roman"/>
+          <w:szCs w:val="21"/>
+        </w:rPr>
+        <w:t>were</w:t>
+      </w:r>
+      <w:proofErr w:type="gramEnd"/>
+      <w:r>
+        <w:rPr>
+          <w:rFonts w:cs="Times New Roman"/>
+          <w:szCs w:val="21"/>
+        </w:rPr>
+        <w:t xml:space="preserve"> used to identify the sensor associated with G.25, Keenan Lab.</w:t>
       </w:r>
     </w:p>
     <w:p>
@@ -1190,7 +1225,23 @@
           <w:rFonts w:cs="Times New Roman"/>
           <w:szCs w:val="21"/>
         </w:rPr>
-        <w:t>The data audit found missing intervals and longer sensor outages. Short missing gaps were forward filled only when the gap did not exceed 60 minutes. Longer gaps were not filled because it would be unreasonable to assume that headcount remained unchanged for many hours without evidence.</w:t>
+        <w:t xml:space="preserve">The data audit found missing intervals and longer sensor outages. Short missing gaps </w:t>
+      </w:r>
+      <w:proofErr w:type="gramStart"/>
+      <w:r>
+        <w:rPr>
+          <w:rFonts w:cs="Times New Roman"/>
+          <w:szCs w:val="21"/>
+        </w:rPr>
+        <w:t>were forward</w:t>
+      </w:r>
+      <w:proofErr w:type="gramEnd"/>
+      <w:r>
+        <w:rPr>
+          <w:rFonts w:cs="Times New Roman"/>
+          <w:szCs w:val="21"/>
+        </w:rPr>
+        <w:t xml:space="preserve"> filled only when the gap did not exceed 60 minutes. Longer gaps were not filled because it would be unreasonable to assume that headcount remained unchanged for many hours without evidence.</w:t>
       </w:r>
     </w:p>
     <w:p>
@@ -2064,7 +2115,23 @@
           <w:rFonts w:cs="Times New Roman"/>
           <w:szCs w:val="21"/>
         </w:rPr>
-        <w:t>The project treats occupancy forecasting as a supervised machine-learning regression problem. At each time point, the model receives information that would have been available at that time and predicts headcount at a later time. For the 30-minute case, the target is headcount measured 30 minutes after the feature time.</w:t>
+        <w:t xml:space="preserve">The project treats occupancy forecasting as a supervised machine-learning regression problem. At each time point, the model receives information that would have been available at that time and predicts headcount </w:t>
+      </w:r>
+      <w:proofErr w:type="gramStart"/>
+      <w:r>
+        <w:rPr>
+          <w:rFonts w:cs="Times New Roman"/>
+          <w:szCs w:val="21"/>
+        </w:rPr>
+        <w:t>at a later time</w:t>
+      </w:r>
+      <w:proofErr w:type="gramEnd"/>
+      <w:r>
+        <w:rPr>
+          <w:rFonts w:cs="Times New Roman"/>
+          <w:szCs w:val="21"/>
+        </w:rPr>
+        <w:t>. For the 30-minute case, the target is headcount measured 30 minutes after the feature time.</w:t>
       </w:r>
     </w:p>
     <w:p>
@@ -2411,12 +2478,21 @@
                 <w:szCs w:val="21"/>
               </w:rPr>
             </w:pPr>
+            <w:proofErr w:type="spellStart"/>
             <w:r>
               <w:rPr>
                 <w:rFonts w:cs="Times New Roman"/>
                 <w:szCs w:val="21"/>
               </w:rPr>
-              <w:t>Regularised linear regression using engineered features.</w:t>
+              <w:t>Regularised</w:t>
+            </w:r>
+            <w:proofErr w:type="spellEnd"/>
+            <w:r>
+              <w:rPr>
+                <w:rFonts w:cs="Times New Roman"/>
+                <w:szCs w:val="21"/>
+              </w:rPr>
+              <w:t xml:space="preserve"> linear regression using engineered features.</w:t>
             </w:r>
           </w:p>
         </w:tc>
@@ -2639,7 +2715,23 @@
           <w:rFonts w:cs="Times New Roman"/>
           <w:szCs w:val="21"/>
         </w:rPr>
-        <w:t>The main metric was mean absolute error, calculated as the average absolute difference between observed and predicted headcount. MAE was selected because it is measured in people. Root mean squared error was also considered because it places greater weight on larger errors, while bias identifies systematic over-prediction or under-prediction.</w:t>
+        <w:t xml:space="preserve">The main </w:t>
+      </w:r>
+      <w:proofErr w:type="gramStart"/>
+      <w:r>
+        <w:rPr>
+          <w:rFonts w:cs="Times New Roman"/>
+          <w:szCs w:val="21"/>
+        </w:rPr>
+        <w:t>metric was mean</w:t>
+      </w:r>
+      <w:proofErr w:type="gramEnd"/>
+      <w:r>
+        <w:rPr>
+          <w:rFonts w:cs="Times New Roman"/>
+          <w:szCs w:val="21"/>
+        </w:rPr>
+        <w:t xml:space="preserve"> absolute error, calculated as the average absolute difference between observed and predicted headcount. MAE was selected because it is measured in people. Root mean squared error was also considered because it places greater weight on larger errors, while bias identifies systematic over-prediction or under-prediction.</w:t>
       </w:r>
     </w:p>
     <w:p>
@@ -2705,7 +2797,23 @@
           <w:rFonts w:cs="Times New Roman"/>
           <w:szCs w:val="21"/>
         </w:rPr>
-        <w:t>Validation was performed using chronological splits. The validation period was used to select a model before viewing final-test performance. The final test period was held back until model selection was complete. This design provides stronger evidence than training performance because it tests whether a model can generalise to later observations.</w:t>
+        <w:t xml:space="preserve">Validation was performed using chronological splits. The validation period was used to select a model before viewing final-test performance. The final test period was held back until model selection was complete. This design provides stronger evidence than training performance because it tests whether a model can </w:t>
+      </w:r>
+      <w:proofErr w:type="spellStart"/>
+      <w:r>
+        <w:rPr>
+          <w:rFonts w:cs="Times New Roman"/>
+          <w:szCs w:val="21"/>
+        </w:rPr>
+        <w:t>generalise</w:t>
+      </w:r>
+      <w:proofErr w:type="spellEnd"/>
+      <w:r>
+        <w:rPr>
+          <w:rFonts w:cs="Times New Roman"/>
+          <w:szCs w:val="21"/>
+        </w:rPr>
+        <w:t xml:space="preserve"> to later observations.</w:t>
       </w:r>
     </w:p>
     <w:p>
@@ -2720,7 +2828,23 @@
           <w:rFonts w:cs="Times New Roman"/>
           <w:szCs w:val="21"/>
         </w:rPr>
-        <w:t>Ridge regression achieved the strongest validation MAE of 1.080 people. Ridge was therefore selected as the preferred machine-learning model before final testing. The validation result suggested that recent occupancy history and calendar features were useful during that period.</w:t>
+        <w:t xml:space="preserve">Ridge regression achieved the strongest validation MAE of 1.080 people. Ridge was therefore selected as the preferred machine-learning model before final testing. The validation </w:t>
+      </w:r>
+      <w:proofErr w:type="gramStart"/>
+      <w:r>
+        <w:rPr>
+          <w:rFonts w:cs="Times New Roman"/>
+          <w:szCs w:val="21"/>
+        </w:rPr>
+        <w:t>result</w:t>
+      </w:r>
+      <w:proofErr w:type="gramEnd"/>
+      <w:r>
+        <w:rPr>
+          <w:rFonts w:cs="Times New Roman"/>
+          <w:szCs w:val="21"/>
+        </w:rPr>
+        <w:t xml:space="preserve"> suggested that recent occupancy history and calendar features were useful during that period.</w:t>
       </w:r>
     </w:p>
     <w:p>
@@ -3480,7 +3604,23 @@
           <w:rFonts w:cs="Times New Roman"/>
           <w:szCs w:val="21"/>
         </w:rPr>
-        <w:t>The persistence baseline achieved the lowest final-test MAE of 0.461 people. The latest sensor-derived headcount was therefore highly informative for the 30-minute forecast horizon during the held-out period.</w:t>
+        <w:t xml:space="preserve">The persistence baseline achieved the lowest final-test MAE of 0.461 people. The latest sensor-derived headcount was therefore highly informative for the 30-minute forecast horizon during the </w:t>
+      </w:r>
+      <w:proofErr w:type="gramStart"/>
+      <w:r>
+        <w:rPr>
+          <w:rFonts w:cs="Times New Roman"/>
+          <w:szCs w:val="21"/>
+        </w:rPr>
+        <w:t>held-out period</w:t>
+      </w:r>
+      <w:proofErr w:type="gramEnd"/>
+      <w:r>
+        <w:rPr>
+          <w:rFonts w:cs="Times New Roman"/>
+          <w:szCs w:val="21"/>
+        </w:rPr>
+        <w:t>.</w:t>
       </w:r>
     </w:p>
     <w:p>
@@ -3551,7 +3691,7 @@
                     <pic:cNvPicPr/>
                   </pic:nvPicPr>
                   <pic:blipFill>
-                    <a:blip r:embed="rId8"/>
+                    <a:blip r:embed="rId9"/>
                     <a:stretch>
                       <a:fillRect/>
                     </a:stretch>
@@ -3606,7 +3746,27 @@
           <w:sz w:val="24"/>
           <w:szCs w:val="24"/>
         </w:rPr>
-        <w:t>4.3 Forecast visualisation and availability results</w:t>
+        <w:t xml:space="preserve">4.3 Forecast </w:t>
+      </w:r>
+      <w:proofErr w:type="spellStart"/>
+      <w:r>
+        <w:rPr>
+          <w:rFonts w:ascii="Times New Roman" w:hAnsi="Times New Roman" w:cs="Times New Roman"/>
+          <w:color w:val="auto"/>
+          <w:sz w:val="24"/>
+          <w:szCs w:val="24"/>
+        </w:rPr>
+        <w:t>visualisation</w:t>
+      </w:r>
+      <w:proofErr w:type="spellEnd"/>
+      <w:r>
+        <w:rPr>
+          <w:rFonts w:ascii="Times New Roman" w:hAnsi="Times New Roman" w:cs="Times New Roman"/>
+          <w:color w:val="auto"/>
+          <w:sz w:val="24"/>
+          <w:szCs w:val="24"/>
+        </w:rPr>
+        <w:t xml:space="preserve"> and availability results</w:t>
       </w:r>
     </w:p>
     <w:p>
@@ -3655,7 +3815,7 @@
                     <pic:cNvPicPr/>
                   </pic:nvPicPr>
                   <pic:blipFill>
-                    <a:blip r:embed="rId9"/>
+                    <a:blip r:embed="rId10"/>
                     <a:stretch>
                       <a:fillRect/>
                     </a:stretch>
@@ -4030,7 +4190,23 @@
           <w:rFonts w:cs="Times New Roman"/>
           <w:szCs w:val="21"/>
         </w:rPr>
-        <w:t>The precision of 88.1% means that when ridge predicted the room was available, it was usually available according to the future sensor reading. The recall of 53.8% means that the model did not identify every period that was actually available.</w:t>
+        <w:t xml:space="preserve">The precision of 88.1% means that when ridge predicted the room was available, it was usually available according to the future sensor reading. The recall of 53.8% means that the model did not identify every period that was </w:t>
+      </w:r>
+      <w:proofErr w:type="gramStart"/>
+      <w:r>
+        <w:rPr>
+          <w:rFonts w:cs="Times New Roman"/>
+          <w:szCs w:val="21"/>
+        </w:rPr>
+        <w:t>actually available</w:t>
+      </w:r>
+      <w:proofErr w:type="gramEnd"/>
+      <w:r>
+        <w:rPr>
+          <w:rFonts w:cs="Times New Roman"/>
+          <w:szCs w:val="21"/>
+        </w:rPr>
+        <w:t>.</w:t>
       </w:r>
     </w:p>
     <w:p>
@@ -4045,7 +4221,23 @@
           <w:rFonts w:cs="Times New Roman"/>
           <w:szCs w:val="21"/>
         </w:rPr>
-        <w:t>Persistence achieved an availability F1-score of 80.4%, while support-vector regression achieved 80.0%. Both were stronger than ridge regression's F1-score of 66.8%. This supports the headcount results: persistence generalised best during the final test period.</w:t>
+        <w:t xml:space="preserve">Persistence achieved an availability F1-score of 80.4%, while support-vector regression achieved 80.0%. Both were stronger than ridge regression's F1-score of 66.8%. This supports the headcount results: persistence </w:t>
+      </w:r>
+      <w:proofErr w:type="spellStart"/>
+      <w:r>
+        <w:rPr>
+          <w:rFonts w:cs="Times New Roman"/>
+          <w:szCs w:val="21"/>
+        </w:rPr>
+        <w:t>generalised</w:t>
+      </w:r>
+      <w:proofErr w:type="spellEnd"/>
+      <w:r>
+        <w:rPr>
+          <w:rFonts w:cs="Times New Roman"/>
+          <w:szCs w:val="21"/>
+        </w:rPr>
+        <w:t xml:space="preserve"> best during the final test period.</w:t>
       </w:r>
     </w:p>
     <w:p>
@@ -4084,7 +4276,39 @@
           <w:rFonts w:cs="Times New Roman"/>
           <w:szCs w:val="21"/>
         </w:rPr>
-        <w:t>The codebase includes six automated tests covering data preparation, feature construction, model behaviour, forecasting logic, and the availability threshold. The pytest HTML report records that all six tests pass. Automated testing does not prove forecast accuracy, but it reduces the risk that code changes break critical parts of the workflow.</w:t>
+        <w:t xml:space="preserve">The codebase includes six automated tests covering data preparation, feature construction, model </w:t>
+      </w:r>
+      <w:proofErr w:type="spellStart"/>
+      <w:r>
+        <w:rPr>
+          <w:rFonts w:cs="Times New Roman"/>
+          <w:szCs w:val="21"/>
+        </w:rPr>
+        <w:t>behaviour</w:t>
+      </w:r>
+      <w:proofErr w:type="spellEnd"/>
+      <w:r>
+        <w:rPr>
+          <w:rFonts w:cs="Times New Roman"/>
+          <w:szCs w:val="21"/>
+        </w:rPr>
+        <w:t xml:space="preserve">, forecasting logic, and the availability threshold. The </w:t>
+      </w:r>
+      <w:proofErr w:type="spellStart"/>
+      <w:r>
+        <w:rPr>
+          <w:rFonts w:cs="Times New Roman"/>
+          <w:szCs w:val="21"/>
+        </w:rPr>
+        <w:t>pytest</w:t>
+      </w:r>
+      <w:proofErr w:type="spellEnd"/>
+      <w:r>
+        <w:rPr>
+          <w:rFonts w:cs="Times New Roman"/>
+          <w:szCs w:val="21"/>
+        </w:rPr>
+        <w:t xml:space="preserve"> HTML report records that all six tests pass. Automated testing does not prove forecast accuracy, but it reduces the risk that code changes break critical parts of the workflow.</w:t>
       </w:r>
     </w:p>
     <w:p>
@@ -4105,7 +4329,29 @@
           <w:sz w:val="28"/>
           <w:szCs w:val="28"/>
         </w:rPr>
-        <w:t>5. Final results and sensitivity</w:t>
+        <w:t xml:space="preserve">5. </w:t>
+      </w:r>
+      <w:proofErr w:type="gramStart"/>
+      <w:r>
+        <w:rPr>
+          <w:rFonts w:eastAsiaTheme="majorEastAsia" w:cs="Times New Roman"/>
+          <w:b/>
+          <w:bCs/>
+          <w:sz w:val="28"/>
+          <w:szCs w:val="28"/>
+        </w:rPr>
+        <w:t>Final results</w:t>
+      </w:r>
+      <w:proofErr w:type="gramEnd"/>
+      <w:r>
+        <w:rPr>
+          <w:rFonts w:eastAsiaTheme="majorEastAsia" w:cs="Times New Roman"/>
+          <w:b/>
+          <w:bCs/>
+          <w:sz w:val="28"/>
+          <w:szCs w:val="28"/>
+        </w:rPr>
+        <w:t xml:space="preserve"> and sensitivity</w:t>
       </w:r>
     </w:p>
     <w:p>
@@ -4520,7 +4766,23 @@
           <w:rFonts w:cs="Times New Roman"/>
           <w:szCs w:val="21"/>
         </w:rPr>
-        <w:t>The 15-minute horizon had the strongest accuracy because there is less uncertainty over a shorter period. However, 15 minutes may not provide enough time for a student to decide whether to travel to a laboratory. The 60-minute horizon provides more advance notice but had greater error. The 30-minute horizon was retained because it provides a practical compromise between useful notice and forecast accuracy.</w:t>
+        <w:t xml:space="preserve">The 15-minute horizon had the strongest accuracy because there is less uncertainty over a shorter period. However, 15 minutes may not provide enough time for a student to decide whether to travel to a laboratory. The 60-minute horizon provides more advance notice but had greater </w:t>
+      </w:r>
+      <w:proofErr w:type="gramStart"/>
+      <w:r>
+        <w:rPr>
+          <w:rFonts w:cs="Times New Roman"/>
+          <w:szCs w:val="21"/>
+        </w:rPr>
+        <w:t>error</w:t>
+      </w:r>
+      <w:proofErr w:type="gramEnd"/>
+      <w:r>
+        <w:rPr>
+          <w:rFonts w:cs="Times New Roman"/>
+          <w:szCs w:val="21"/>
+        </w:rPr>
+        <w:t>. The 30-minute horizon was retained because it provides a practical compromise between useful notice and forecast accuracy.</w:t>
       </w:r>
     </w:p>
     <w:p>
@@ -5178,7 +5440,23 @@
           <w:rFonts w:cs="Times New Roman"/>
           <w:szCs w:val="21"/>
         </w:rPr>
-        <w:t>The threshold of 0.5 was retained because it provides a defensible operational definition of an effectively empty laboratory. The decision was based on the meaning of availability rather than purely on the highest F1-score.</w:t>
+        <w:t xml:space="preserve">The threshold of 0.5 was retained because it provides a defensible operational definition of an effectively empty laboratory. The decision was based on the meaning of availability rather than purely on the highest </w:t>
+      </w:r>
+      <w:proofErr w:type="gramStart"/>
+      <w:r>
+        <w:rPr>
+          <w:rFonts w:cs="Times New Roman"/>
+          <w:szCs w:val="21"/>
+        </w:rPr>
+        <w:t>F1-score</w:t>
+      </w:r>
+      <w:proofErr w:type="gramEnd"/>
+      <w:r>
+        <w:rPr>
+          <w:rFonts w:cs="Times New Roman"/>
+          <w:szCs w:val="21"/>
+        </w:rPr>
+        <w:t>.</w:t>
       </w:r>
     </w:p>
     <w:p>
@@ -5211,7 +5489,7 @@
                     <pic:cNvPicPr/>
                   </pic:nvPicPr>
                   <pic:blipFill>
-                    <a:blip r:embed="rId8"/>
+                    <a:blip r:embed="rId9"/>
                     <a:stretch>
                       <a:fillRect/>
                     </a:stretch>
@@ -5282,7 +5560,23 @@
           <w:rFonts w:cs="Times New Roman"/>
           <w:szCs w:val="21"/>
         </w:rPr>
-        <w:t>Ridge regression was the best machine-learning model during validation, but persistence was the strongest method during the final test. The comparison shows that final model selection should not rely only on validation performance or model complexity. For the available G.25 data, a simple baseline provided the most robust final result.</w:t>
+        <w:t xml:space="preserve">Ridge regression was the best machine-learning model during validation, but persistence was the strongest method during the final test. The comparison shows that final model selection should not rely only on validation performance or model complexity. For the available G.25 data, a simple baseline provided the most robust </w:t>
+      </w:r>
+      <w:proofErr w:type="gramStart"/>
+      <w:r>
+        <w:rPr>
+          <w:rFonts w:cs="Times New Roman"/>
+          <w:szCs w:val="21"/>
+        </w:rPr>
+        <w:t>final result</w:t>
+      </w:r>
+      <w:proofErr w:type="gramEnd"/>
+      <w:r>
+        <w:rPr>
+          <w:rFonts w:cs="Times New Roman"/>
+          <w:szCs w:val="21"/>
+        </w:rPr>
+        <w:t>.</w:t>
       </w:r>
     </w:p>
     <w:p>
@@ -5363,7 +5657,31 @@
           <w:sz w:val="21"/>
           <w:szCs w:val="21"/>
         </w:rPr>
-        <w:t>The comparison produced two conclusions. Ridge regression was the strongest machine-learning model during validation, demonstrating that recent history and calendar features can be used to forecast future sensor-derived headcount. Persistence was stronger on the final test, showing that a simple baseline can be more robust when room behaviour changes over time.</w:t>
+        <w:t xml:space="preserve">The comparison produced two conclusions. Ridge regression was the strongest machine-learning model during validation, demonstrating that recent history and calendar features can be used to forecast future sensor-derived headcount. Persistence was stronger on the final test, showing that a simple baseline can be more robust when room </w:t>
+      </w:r>
+      <w:proofErr w:type="spellStart"/>
+      <w:r>
+        <w:rPr>
+          <w:rFonts w:ascii="Times New Roman" w:eastAsiaTheme="minorEastAsia" w:hAnsi="Times New Roman" w:cs="Times New Roman"/>
+          <w:b w:val="0"/>
+          <w:bCs w:val="0"/>
+          <w:color w:val="auto"/>
+          <w:sz w:val="21"/>
+          <w:szCs w:val="21"/>
+        </w:rPr>
+        <w:t>behaviour</w:t>
+      </w:r>
+      <w:proofErr w:type="spellEnd"/>
+      <w:r>
+        <w:rPr>
+          <w:rFonts w:ascii="Times New Roman" w:eastAsiaTheme="minorEastAsia" w:hAnsi="Times New Roman" w:cs="Times New Roman"/>
+          <w:b w:val="0"/>
+          <w:bCs w:val="0"/>
+          <w:color w:val="auto"/>
+          <w:sz w:val="21"/>
+          <w:szCs w:val="21"/>
+        </w:rPr>
+        <w:t xml:space="preserve"> changes over time.</w:t>
       </w:r>
     </w:p>
     <w:p/>
@@ -5428,7 +5746,23 @@
           <w:szCs w:val="21"/>
         </w:rPr>
         <w:lastRenderedPageBreak/>
-        <w:t>Several limitations should be acknowledged. Only one laboratory was analysed, there was no independently verified ground-truth occupancy, the data contained a 21.6-hour sensor outage, booking data were unavailable, environmental-sensor co-location was not verified, and occupancy history cannot anticipate scheduled teaching events or spontaneous group arrivals.</w:t>
+        <w:t xml:space="preserve">Several limitations should be acknowledged. Only one laboratory was </w:t>
+      </w:r>
+      <w:proofErr w:type="spellStart"/>
+      <w:r>
+        <w:rPr>
+          <w:rFonts w:cs="Times New Roman"/>
+          <w:szCs w:val="21"/>
+        </w:rPr>
+        <w:t>analysed</w:t>
+      </w:r>
+      <w:proofErr w:type="spellEnd"/>
+      <w:r>
+        <w:rPr>
+          <w:rFonts w:cs="Times New Roman"/>
+          <w:szCs w:val="21"/>
+        </w:rPr>
+        <w:t>, there was no independently verified ground-truth occupancy, the data contained a 21.6-hour sensor outage, booking data were unavailable, environmental-sensor co-location was not verified, and occupancy history cannot anticipate scheduled teaching events or spontaneous group arrivals.</w:t>
       </w:r>
     </w:p>
     <w:p>
@@ -5475,7 +5809,39 @@
           <w:rFonts w:cs="Times New Roman"/>
           <w:szCs w:val="21"/>
         </w:rPr>
-        <w:t>Reproducibility was a primary design objective. The repository includes the source code, requirements, runbook, data dictionary, automated tests, HTML documentation, result files, and licence required to reproduce the workflow for authorised users with access to the supplied raw data. Raw sensor data were excluded from version control because they may be subject to licensing or privacy restrictions.</w:t>
+        <w:t xml:space="preserve">Reproducibility was a primary design objective. The repository includes the source code, requirements, runbook, data dictionary, automated tests, HTML documentation, result files, and </w:t>
+      </w:r>
+      <w:proofErr w:type="spellStart"/>
+      <w:r>
+        <w:rPr>
+          <w:rFonts w:cs="Times New Roman"/>
+          <w:szCs w:val="21"/>
+        </w:rPr>
+        <w:t>licence</w:t>
+      </w:r>
+      <w:proofErr w:type="spellEnd"/>
+      <w:r>
+        <w:rPr>
+          <w:rFonts w:cs="Times New Roman"/>
+          <w:szCs w:val="21"/>
+        </w:rPr>
+        <w:t xml:space="preserve"> required to reproduce the workflow for </w:t>
+      </w:r>
+      <w:proofErr w:type="spellStart"/>
+      <w:r>
+        <w:rPr>
+          <w:rFonts w:cs="Times New Roman"/>
+          <w:szCs w:val="21"/>
+        </w:rPr>
+        <w:t>authorised</w:t>
+      </w:r>
+      <w:proofErr w:type="spellEnd"/>
+      <w:r>
+        <w:rPr>
+          <w:rFonts w:cs="Times New Roman"/>
+          <w:szCs w:val="21"/>
+        </w:rPr>
+        <w:t xml:space="preserve"> users with access to the supplied raw data. Raw sensor data were excluded from version control because they may be subject to licensing or privacy restrictions.</w:t>
       </w:r>
     </w:p>
     <w:p>
@@ -5490,7 +5856,23 @@
           <w:rFonts w:cs="Times New Roman"/>
           <w:szCs w:val="21"/>
         </w:rPr>
-        <w:t>Ethical considerations relate to privacy and responsible data use. Although the supplied occupancy information contains no direct personal identifiers, aggregate occupancy patterns could still reveal building-use behaviour. The analysis was therefore limited to room-level forecasting and should not be used to monitor individuals.</w:t>
+        <w:t xml:space="preserve">Ethical considerations relate to privacy and responsible data use. Although the supplied occupancy information contains no direct personal identifiers, aggregate occupancy patterns could still reveal building-use </w:t>
+      </w:r>
+      <w:proofErr w:type="spellStart"/>
+      <w:r>
+        <w:rPr>
+          <w:rFonts w:cs="Times New Roman"/>
+          <w:szCs w:val="21"/>
+        </w:rPr>
+        <w:t>behaviour</w:t>
+      </w:r>
+      <w:proofErr w:type="spellEnd"/>
+      <w:r>
+        <w:rPr>
+          <w:rFonts w:cs="Times New Roman"/>
+          <w:szCs w:val="21"/>
+        </w:rPr>
+        <w:t>. The analysis was therefore limited to room-level forecasting and should not be used to monitor individuals.</w:t>
       </w:r>
     </w:p>
     <w:p>
@@ -5505,7 +5887,23 @@
           <w:rFonts w:cs="Times New Roman"/>
           <w:szCs w:val="21"/>
         </w:rPr>
-        <w:t>OpenAI Codex assisted with planning, code drafting, debugging, repository organisation, and documentation support. I independently checked the G.25 mapping, data audit, chronological validation design, generated figures, model metrics, sensitivity results, and the six automated tests. I selected the final scope, forecast horizons, availability threshold, and engineering claims.</w:t>
+        <w:t xml:space="preserve">OpenAI Codex assisted with planning, code drafting, debugging, repository </w:t>
+      </w:r>
+      <w:proofErr w:type="spellStart"/>
+      <w:r>
+        <w:rPr>
+          <w:rFonts w:cs="Times New Roman"/>
+          <w:szCs w:val="21"/>
+        </w:rPr>
+        <w:t>organisation</w:t>
+      </w:r>
+      <w:proofErr w:type="spellEnd"/>
+      <w:r>
+        <w:rPr>
+          <w:rFonts w:cs="Times New Roman"/>
+          <w:szCs w:val="21"/>
+        </w:rPr>
+        <w:t>, and documentation support. I independently checked the G.25 mapping, data audit, chronological validation design, generated figures, model metrics, sensitivity results, and the six automated tests. I selected the final scope, forecast horizons, availability threshold, and engineering claims.</w:t>
       </w:r>
     </w:p>
     <w:p>
@@ -5582,7 +5980,23 @@
           <w:rFonts w:cs="Times New Roman"/>
           <w:szCs w:val="21"/>
         </w:rPr>
-        <w:t>Hastie, T., Tibshirani, R., &amp; Friedman, J. (2009). The elements of statistical learning: Data mining, inference, and prediction (2nd ed.). Springer. https://doi.org/10.1007/978-0-387-84858-7</w:t>
+        <w:t xml:space="preserve">Hastie, T., </w:t>
+      </w:r>
+      <w:proofErr w:type="spellStart"/>
+      <w:r>
+        <w:rPr>
+          <w:rFonts w:cs="Times New Roman"/>
+          <w:szCs w:val="21"/>
+        </w:rPr>
+        <w:t>Tibshirani</w:t>
+      </w:r>
+      <w:proofErr w:type="spellEnd"/>
+      <w:r>
+        <w:rPr>
+          <w:rFonts w:cs="Times New Roman"/>
+          <w:szCs w:val="21"/>
+        </w:rPr>
+        <w:t>, R., &amp; Friedman, J. (2009). The elements of statistical learning: Data mining, inference, and prediction (2nd ed.). Springer. https://doi.org/10.1007/978-0-387-84858-7</w:t>
       </w:r>
     </w:p>
     <w:p>
@@ -5597,7 +6011,23 @@
           <w:rFonts w:cs="Times New Roman"/>
           <w:szCs w:val="21"/>
         </w:rPr>
-        <w:t>Hyndman, R. J., &amp; Athanasopoulos, G. (2021). Forecasting: Principles and practice (3rd ed.). OTexts. https://otexts.com/fpp3/</w:t>
+        <w:t xml:space="preserve">Hyndman, R. J., &amp; Athanasopoulos, G. (2021). Forecasting: Principles and practice (3rd ed.). </w:t>
+      </w:r>
+      <w:proofErr w:type="spellStart"/>
+      <w:r>
+        <w:rPr>
+          <w:rFonts w:cs="Times New Roman"/>
+          <w:szCs w:val="21"/>
+        </w:rPr>
+        <w:t>OTexts</w:t>
+      </w:r>
+      <w:proofErr w:type="spellEnd"/>
+      <w:r>
+        <w:rPr>
+          <w:rFonts w:cs="Times New Roman"/>
+          <w:szCs w:val="21"/>
+        </w:rPr>
+        <w:t>. https://otexts.com/fpp3/</w:t>
       </w:r>
     </w:p>
     <w:p>
@@ -5612,7 +6042,23 @@
           <w:rFonts w:cs="Times New Roman"/>
           <w:szCs w:val="21"/>
         </w:rPr>
-        <w:t>James, G., Witten, D., Hastie, T., &amp; Tibshirani, R. (2021). An introduction to statistical learning: With applications in R (2nd ed.). Springer. https://doi.org/10.1007/978-1-0716-1418-1</w:t>
+        <w:t xml:space="preserve">James, G., Witten, D., Hastie, T., &amp; </w:t>
+      </w:r>
+      <w:proofErr w:type="spellStart"/>
+      <w:r>
+        <w:rPr>
+          <w:rFonts w:cs="Times New Roman"/>
+          <w:szCs w:val="21"/>
+        </w:rPr>
+        <w:t>Tibshirani</w:t>
+      </w:r>
+      <w:proofErr w:type="spellEnd"/>
+      <w:r>
+        <w:rPr>
+          <w:rFonts w:cs="Times New Roman"/>
+          <w:szCs w:val="21"/>
+        </w:rPr>
+        <w:t>, R. (2021). An introduction to statistical learning: With applications in R (2nd ed.). Springer. https://doi.org/10.1007/978-1-0716-1418-1</w:t>
       </w:r>
     </w:p>
     <w:p>
@@ -5672,7 +6118,71 @@
           <w:rFonts w:cs="Times New Roman"/>
           <w:szCs w:val="21"/>
         </w:rPr>
-        <w:t>Pedregosa, F., Varoquaux, G., Gramfort, A., Michel, V., Thirion, B., Grisel, O., Blondel, M., Prettenhofer, P., Weiss, R., Dubourg, V., VanderPlas, J., Passos, A., Cournapeau, D., Brucher, M., Perrot, M., &amp; Duchesnay, E. (2011). Scikit-learn: Machine learning in Python. Journal of Machine Learning Research, 12, 2825-2830.</w:t>
+        <w:t xml:space="preserve">Pedregosa, F., </w:t>
+      </w:r>
+      <w:proofErr w:type="spellStart"/>
+      <w:r>
+        <w:rPr>
+          <w:rFonts w:cs="Times New Roman"/>
+          <w:szCs w:val="21"/>
+        </w:rPr>
+        <w:t>Varoquaux</w:t>
+      </w:r>
+      <w:proofErr w:type="spellEnd"/>
+      <w:r>
+        <w:rPr>
+          <w:rFonts w:cs="Times New Roman"/>
+          <w:szCs w:val="21"/>
+        </w:rPr>
+        <w:t xml:space="preserve">, G., </w:t>
+      </w:r>
+      <w:proofErr w:type="spellStart"/>
+      <w:r>
+        <w:rPr>
+          <w:rFonts w:cs="Times New Roman"/>
+          <w:szCs w:val="21"/>
+        </w:rPr>
+        <w:t>Gramfort</w:t>
+      </w:r>
+      <w:proofErr w:type="spellEnd"/>
+      <w:r>
+        <w:rPr>
+          <w:rFonts w:cs="Times New Roman"/>
+          <w:szCs w:val="21"/>
+        </w:rPr>
+        <w:t xml:space="preserve">, A., Michel, V., Thirion, B., Grisel, O., Blondel, M., </w:t>
+      </w:r>
+      <w:proofErr w:type="spellStart"/>
+      <w:r>
+        <w:rPr>
+          <w:rFonts w:cs="Times New Roman"/>
+          <w:szCs w:val="21"/>
+        </w:rPr>
+        <w:t>Prettenhofer</w:t>
+      </w:r>
+      <w:proofErr w:type="spellEnd"/>
+      <w:r>
+        <w:rPr>
+          <w:rFonts w:cs="Times New Roman"/>
+          <w:szCs w:val="21"/>
+        </w:rPr>
+        <w:t xml:space="preserve">, P., Weiss, R., Dubourg, V., VanderPlas, J., Passos, A., </w:t>
+      </w:r>
+      <w:proofErr w:type="spellStart"/>
+      <w:r>
+        <w:rPr>
+          <w:rFonts w:cs="Times New Roman"/>
+          <w:szCs w:val="21"/>
+        </w:rPr>
+        <w:t>Cournapeau</w:t>
+      </w:r>
+      <w:proofErr w:type="spellEnd"/>
+      <w:r>
+        <w:rPr>
+          <w:rFonts w:cs="Times New Roman"/>
+          <w:szCs w:val="21"/>
+        </w:rPr>
+        <w:t>, D., Brucher, M., Perrot, M., &amp; Duchesnay, E. (2011). Scikit-learn: Machine learning in Python. Journal of Machine Learning Research, 12, 2825-2830.</w:t>
       </w:r>
     </w:p>
     <w:p>
@@ -5687,7 +6197,39 @@
           <w:rFonts w:cs="Times New Roman"/>
           <w:szCs w:val="21"/>
         </w:rPr>
-        <w:t>Scikit-learn Developers. (n.d.). Scikit-learn user guide. https://scikit-learn.org/stable/</w:t>
+        <w:t>Scikit-</w:t>
+      </w:r>
+      <w:proofErr w:type="gramStart"/>
+      <w:r>
+        <w:rPr>
+          <w:rFonts w:cs="Times New Roman"/>
+          <w:szCs w:val="21"/>
+        </w:rPr>
+        <w:t>learn</w:t>
+      </w:r>
+      <w:proofErr w:type="gramEnd"/>
+      <w:r>
+        <w:rPr>
+          <w:rFonts w:cs="Times New Roman"/>
+          <w:szCs w:val="21"/>
+        </w:rPr>
+        <w:t xml:space="preserve"> Developers. (n.d.). Scikit-</w:t>
+      </w:r>
+      <w:proofErr w:type="gramStart"/>
+      <w:r>
+        <w:rPr>
+          <w:rFonts w:cs="Times New Roman"/>
+          <w:szCs w:val="21"/>
+        </w:rPr>
+        <w:t>learn</w:t>
+      </w:r>
+      <w:proofErr w:type="gramEnd"/>
+      <w:r>
+        <w:rPr>
+          <w:rFonts w:cs="Times New Roman"/>
+          <w:szCs w:val="21"/>
+        </w:rPr>
+        <w:t xml:space="preserve"> user guide. https://scikit-learn.org/stable/</w:t>
       </w:r>
     </w:p>
     <w:p>
@@ -6488,7 +7030,23 @@
           <w:rFonts w:cs="Times New Roman"/>
           <w:szCs w:val="21"/>
         </w:rPr>
-        <w:t>The repository contains six automated tests covering resampling correctness, future-target alignment, chronological splitting, regression metric calculations, availability-threshold calculations, and a synthetic end-to-end workflow. All tests pass.</w:t>
+        <w:t xml:space="preserve">The repository contains six automated tests covering resampling correctness, future-target alignment, chronological splitting, regression metric calculations, availability-threshold calculations, and a synthetic end-to-end workflow. All tests </w:t>
+      </w:r>
+      <w:proofErr w:type="gramStart"/>
+      <w:r>
+        <w:rPr>
+          <w:rFonts w:cs="Times New Roman"/>
+          <w:szCs w:val="21"/>
+        </w:rPr>
+        <w:t>pass</w:t>
+      </w:r>
+      <w:proofErr w:type="gramEnd"/>
+      <w:r>
+        <w:rPr>
+          <w:rFonts w:cs="Times New Roman"/>
+          <w:szCs w:val="21"/>
+        </w:rPr>
+        <w:t>.</w:t>
       </w:r>
     </w:p>
     <w:p>
@@ -6501,7 +7059,7 @@
     </w:p>
     <w:p/>
     <w:sectPr>
-      <w:footerReference w:type="default" r:id="rId10"/>
+      <w:footerReference w:type="default" r:id="rId11"/>
       <w:pgSz w:w="12240" w:h="15840"/>
       <w:pgMar w:top="1037" w:right="1181" w:bottom="1037" w:left="1181" w:header="720" w:footer="720" w:gutter="0"/>
       <w:cols w:space="720"/>
@@ -18181,6 +18739,29 @@
       </w:tcPr>
     </w:tblStylePr>
   </w:style>
+  <w:style w:type="character" w:styleId="Hyperlink">
+    <w:name w:val="Hyperlink"/>
+    <w:basedOn w:val="DefaultParagraphFont"/>
+    <w:uiPriority w:val="99"/>
+    <w:unhideWhenUsed/>
+    <w:rsid w:val="00682E3E"/>
+    <w:rPr>
+      <w:color w:val="0000FF" w:themeColor="hyperlink"/>
+      <w:u w:val="single"/>
+    </w:rPr>
+  </w:style>
+  <w:style w:type="character" w:styleId="UnresolvedMention">
+    <w:name w:val="Unresolved Mention"/>
+    <w:basedOn w:val="DefaultParagraphFont"/>
+    <w:uiPriority w:val="99"/>
+    <w:semiHidden/>
+    <w:unhideWhenUsed/>
+    <w:rsid w:val="00682E3E"/>
+    <w:rPr>
+      <w:color w:val="605E5C"/>
+      <w:shd w:val="clear" w:color="auto" w:fill="E1DFDD"/>
+    </w:rPr>
+  </w:style>
 </w:styles>
 </file>
 

</xml_diff>